<commit_message>
docs(informe): agrega el informe tecnico de las Fases 1 y 2
- 44 paginas con portada, indice automatico, secciones II a XI y anexos
- Todas las cifras, tablas y figuras provienen de los notebooks ejecutados
- Incluye las evidencias de ejecucion: salida del pipeline, pytest y git log
- Se acompana el DOCX editable para completar los datos de portada del equipo

Co-Authored-By: Claude Opus 5 <noreply@anthropic.com>
</commit_message>
<xml_diff>
--- a/informe/f1_s01_evaluacion_entregable_grupox.docx
+++ b/informe/f1_s01_evaluacion_entregable_grupox.docx
@@ -1907,8 +1907,8 @@
             <w:r>
               <w:rPr>
                 <w:rFonts w:ascii="Consolas" w:cs="Consolas" w:eastAsia="Consolas" w:hAnsi="Consolas"/>
-                <w:sz w:val="17"/>
-                <w:szCs w:val="17"/>
+                <w:sz w:val="16"/>
+                <w:szCs w:val="16"/>
               </w:rPr>
               <w:t xml:space="preserve">duracion_real_i     = (anio_titulo_i - anio_ingreso_i) * 2</w:t>
             </w:r>
@@ -1934,8 +1934,8 @@
             <w:r>
               <w:rPr>
                 <w:rFonts w:ascii="Consolas" w:cs="Consolas" w:eastAsia="Consolas" w:hAnsi="Consolas"/>
-                <w:sz w:val="17"/>
-                <w:szCs w:val="17"/>
+                <w:sz w:val="16"/>
+                <w:szCs w:val="16"/>
               </w:rPr>
               <w:t xml:space="preserve">                      + (semestre_titulo_i - semestre_ingreso_i) + 1</w:t>
             </w:r>
@@ -1961,8 +1961,8 @@
             <w:r>
               <w:rPr>
                 <w:rFonts w:ascii="Consolas" w:cs="Consolas" w:eastAsia="Consolas" w:hAnsi="Consolas"/>
-                <w:sz w:val="17"/>
-                <w:szCs w:val="17"/>
+                <w:sz w:val="16"/>
+                <w:szCs w:val="16"/>
               </w:rPr>
               <w:t xml:space="preserve"> </w:t>
             </w:r>
@@ -1988,8 +1988,8 @@
             <w:r>
               <w:rPr>
                 <w:rFonts w:ascii="Consolas" w:cs="Consolas" w:eastAsia="Consolas" w:hAnsi="Consolas"/>
-                <w:sz w:val="17"/>
-                <w:szCs w:val="17"/>
+                <w:sz w:val="16"/>
+                <w:szCs w:val="16"/>
               </w:rPr>
               <w:t xml:space="preserve">sobreduracion_i     = duracion_real_i - duracion_teorica_i</w:t>
             </w:r>
@@ -2015,8 +2015,8 @@
             <w:r>
               <w:rPr>
                 <w:rFonts w:ascii="Consolas" w:cs="Consolas" w:eastAsia="Consolas" w:hAnsi="Consolas"/>
-                <w:sz w:val="17"/>
-                <w:szCs w:val="17"/>
+                <w:sz w:val="16"/>
+                <w:szCs w:val="16"/>
               </w:rPr>
               <w:t xml:space="preserve"> </w:t>
             </w:r>
@@ -2042,8 +2042,8 @@
             <w:r>
               <w:rPr>
                 <w:rFonts w:ascii="Consolas" w:cs="Consolas" w:eastAsia="Consolas" w:hAnsi="Consolas"/>
-                <w:sz w:val="17"/>
-                <w:szCs w:val="17"/>
+                <w:sz w:val="16"/>
+                <w:szCs w:val="16"/>
               </w:rPr>
               <w:t xml:space="preserve">indice_duracion_i   = duracion_real_i / duracion_teorica_i</w:t>
             </w:r>
@@ -2069,8 +2069,8 @@
             <w:r>
               <w:rPr>
                 <w:rFonts w:ascii="Consolas" w:cs="Consolas" w:eastAsia="Consolas" w:hAnsi="Consolas"/>
-                <w:sz w:val="17"/>
-                <w:szCs w:val="17"/>
+                <w:sz w:val="16"/>
+                <w:szCs w:val="16"/>
               </w:rPr>
               <w:t xml:space="preserve"> </w:t>
             </w:r>
@@ -2096,8 +2096,8 @@
             <w:r>
               <w:rPr>
                 <w:rFonts w:ascii="Consolas" w:cs="Consolas" w:eastAsia="Consolas" w:hAnsi="Consolas"/>
-                <w:sz w:val="17"/>
-                <w:szCs w:val="17"/>
+                <w:sz w:val="16"/>
+                <w:szCs w:val="16"/>
               </w:rPr>
               <w:t xml:space="preserve">titulacion_oportuna = (sobreduracion_i &lt;= 0)</w:t>
             </w:r>
@@ -5215,8 +5215,8 @@
             <w:r>
               <w:rPr>
                 <w:rFonts w:ascii="Consolas" w:cs="Consolas" w:eastAsia="Consolas" w:hAnsi="Consolas"/>
-                <w:sz w:val="17"/>
-                <w:szCs w:val="17"/>
+                <w:sz w:val="16"/>
+                <w:szCs w:val="16"/>
               </w:rPr>
               <w:t xml:space="preserve">CSV originales del SIES (6 archivos, 955 MB, 1.710.167 filas)</w:t>
             </w:r>
@@ -5242,8 +5242,8 @@
             <w:r>
               <w:rPr>
                 <w:rFonts w:ascii="Consolas" w:cs="Consolas" w:eastAsia="Consolas" w:hAnsi="Consolas"/>
-                <w:sz w:val="17"/>
-                <w:szCs w:val="17"/>
+                <w:sz w:val="16"/>
+                <w:szCs w:val="16"/>
               </w:rPr>
               <w:t xml:space="preserve">        |</w:t>
             </w:r>
@@ -5269,8 +5269,8 @@
             <w:r>
               <w:rPr>
                 <w:rFonts w:ascii="Consolas" w:cs="Consolas" w:eastAsia="Consolas" w:hAnsi="Consolas"/>
-                <w:sz w:val="17"/>
-                <w:szCs w:val="17"/>
+                <w:sz w:val="16"/>
+                <w:szCs w:val="16"/>
               </w:rPr>
               <w:t xml:space="preserve">        |  src/ingesta.py      pandas.read_csv(chunksize=200.000) + coercion controlada</w:t>
             </w:r>
@@ -5296,8 +5296,8 @@
             <w:r>
               <w:rPr>
                 <w:rFonts w:ascii="Consolas" w:cs="Consolas" w:eastAsia="Consolas" w:hAnsi="Consolas"/>
-                <w:sz w:val="17"/>
-                <w:szCs w:val="17"/>
+                <w:sz w:val="16"/>
+                <w:szCs w:val="16"/>
               </w:rPr>
               <w:t xml:space="preserve">        v</w:t>
             </w:r>
@@ -5323,8 +5323,8 @@
             <w:r>
               <w:rPr>
                 <w:rFonts w:ascii="Consolas" w:cs="Consolas" w:eastAsia="Consolas" w:hAnsi="Consolas"/>
-                <w:sz w:val="17"/>
-                <w:szCs w:val="17"/>
+                <w:sz w:val="16"/>
+                <w:szCs w:val="16"/>
               </w:rPr>
               <w:t xml:space="preserve">data/interim/titulados_2020_2025_consolidado.parquet   (37,5 MB, 30 columnas)</w:t>
             </w:r>
@@ -5350,8 +5350,8 @@
             <w:r>
               <w:rPr>
                 <w:rFonts w:ascii="Consolas" w:cs="Consolas" w:eastAsia="Consolas" w:hAnsi="Consolas"/>
-                <w:sz w:val="17"/>
-                <w:szCs w:val="17"/>
+                <w:sz w:val="16"/>
+                <w:szCs w:val="16"/>
               </w:rPr>
               <w:t xml:space="preserve">        |</w:t>
             </w:r>
@@ -5377,8 +5377,8 @@
             <w:r>
               <w:rPr>
                 <w:rFonts w:ascii="Consolas" w:cs="Consolas" w:eastAsia="Consolas" w:hAnsi="Consolas"/>
-                <w:sz w:val="17"/>
-                <w:szCs w:val="17"/>
+                <w:sz w:val="16"/>
+                <w:szCs w:val="16"/>
               </w:rPr>
               <w:t xml:space="preserve">        |  src/limpieza.py     sentinelas -&gt; NA, normalizacion, duplicados, filtros</w:t>
             </w:r>
@@ -5404,8 +5404,8 @@
             <w:r>
               <w:rPr>
                 <w:rFonts w:ascii="Consolas" w:cs="Consolas" w:eastAsia="Consolas" w:hAnsi="Consolas"/>
-                <w:sz w:val="17"/>
-                <w:szCs w:val="17"/>
+                <w:sz w:val="16"/>
+                <w:szCs w:val="16"/>
               </w:rPr>
               <w:t xml:space="preserve">        |  src/transformacion.py   duracion real, sobreduracion, edad, categorias</w:t>
             </w:r>
@@ -5431,8 +5431,8 @@
             <w:r>
               <w:rPr>
                 <w:rFonts w:ascii="Consolas" w:cs="Consolas" w:eastAsia="Consolas" w:hAnsi="Consolas"/>
-                <w:sz w:val="17"/>
-                <w:szCs w:val="17"/>
+                <w:sz w:val="16"/>
+                <w:szCs w:val="16"/>
               </w:rPr>
               <w:t xml:space="preserve">        v</w:t>
             </w:r>
@@ -5458,8 +5458,8 @@
             <w:r>
               <w:rPr>
                 <w:rFonts w:ascii="Consolas" w:cs="Consolas" w:eastAsia="Consolas" w:hAnsi="Consolas"/>
-                <w:sz w:val="17"/>
-                <w:szCs w:val="17"/>
+                <w:sz w:val="16"/>
+                <w:szCs w:val="16"/>
               </w:rPr>
               <w:t xml:space="preserve">data/processed/titulados_pregrado_analitico.parquet    (1.246.760 filas, 47 columnas)</w:t>
             </w:r>
@@ -5485,8 +5485,8 @@
             <w:r>
               <w:rPr>
                 <w:rFonts w:ascii="Consolas" w:cs="Consolas" w:eastAsia="Consolas" w:hAnsi="Consolas"/>
-                <w:sz w:val="17"/>
-                <w:szCs w:val="17"/>
+                <w:sz w:val="16"/>
+                <w:szCs w:val="16"/>
               </w:rPr>
               <w:t xml:space="preserve">        |</w:t>
             </w:r>
@@ -5512,8 +5512,8 @@
             <w:r>
               <w:rPr>
                 <w:rFonts w:ascii="Consolas" w:cs="Consolas" w:eastAsia="Consolas" w:hAnsi="Consolas"/>
-                <w:sz w:val="17"/>
-                <w:szCs w:val="17"/>
+                <w:sz w:val="16"/>
+                <w:szCs w:val="16"/>
               </w:rPr>
               <w:t xml:space="preserve">        |  src/validacion.py   11 reglas   +   tests/ (22 pruebas pytest)</w:t>
             </w:r>
@@ -5539,8 +5539,8 @@
             <w:r>
               <w:rPr>
                 <w:rFonts w:ascii="Consolas" w:cs="Consolas" w:eastAsia="Consolas" w:hAnsi="Consolas"/>
-                <w:sz w:val="17"/>
-                <w:szCs w:val="17"/>
+                <w:sz w:val="16"/>
+                <w:szCs w:val="16"/>
               </w:rPr>
               <w:t xml:space="preserve">        v</w:t>
             </w:r>
@@ -5566,8 +5566,8 @@
             <w:r>
               <w:rPr>
                 <w:rFonts w:ascii="Consolas" w:cs="Consolas" w:eastAsia="Consolas" w:hAnsi="Consolas"/>
-                <w:sz w:val="17"/>
-                <w:szCs w:val="17"/>
+                <w:sz w:val="16"/>
+                <w:szCs w:val="16"/>
               </w:rPr>
               <w:t xml:space="preserve">reports/figures/*.png  y  reports/tables/*.csv         (17 figuras, 13 tablas)</w:t>
             </w:r>
@@ -6387,7 +6387,7 @@
           <w:sz w:val="17"/>
           <w:szCs w:val="17"/>
         </w:rPr>
-        <w:t xml:space="preserve">El paquete suma 7 módulos, 30 funciones públicas y 5 clases. Todas las funciones incluyen anotaciones de tipo y docstring.</w:t>
+        <w:t xml:space="preserve">El paquete suma 7 módulos, 36 funciones públicas y 5 clases. Todas las funciones incluyen anotaciones de tipo y docstring.</w:t>
       </w:r>
     </w:p>
     <w:p>
@@ -6493,8 +6493,8 @@
             <w:r>
               <w:rPr>
                 <w:rFonts w:ascii="Consolas" w:cs="Consolas" w:eastAsia="Consolas" w:hAnsi="Consolas"/>
-                <w:sz w:val="17"/>
-                <w:szCs w:val="17"/>
+                <w:sz w:val="16"/>
+                <w:szCs w:val="16"/>
               </w:rPr>
               <w:t xml:space="preserve">python -m venv .venv</w:t>
             </w:r>
@@ -6520,8 +6520,8 @@
             <w:r>
               <w:rPr>
                 <w:rFonts w:ascii="Consolas" w:cs="Consolas" w:eastAsia="Consolas" w:hAnsi="Consolas"/>
-                <w:sz w:val="17"/>
-                <w:szCs w:val="17"/>
+                <w:sz w:val="16"/>
+                <w:szCs w:val="16"/>
               </w:rPr>
               <w:t xml:space="preserve">.\.venv\Scripts\Activate.ps1        # Windows PowerShell</w:t>
             </w:r>
@@ -6547,8 +6547,8 @@
             <w:r>
               <w:rPr>
                 <w:rFonts w:ascii="Consolas" w:cs="Consolas" w:eastAsia="Consolas" w:hAnsi="Consolas"/>
-                <w:sz w:val="17"/>
-                <w:szCs w:val="17"/>
+                <w:sz w:val="16"/>
+                <w:szCs w:val="16"/>
               </w:rPr>
               <w:t xml:space="preserve">source .venv/bin/activate            # Linux / macOS</w:t>
             </w:r>
@@ -6574,8 +6574,8 @@
             <w:r>
               <w:rPr>
                 <w:rFonts w:ascii="Consolas" w:cs="Consolas" w:eastAsia="Consolas" w:hAnsi="Consolas"/>
-                <w:sz w:val="17"/>
-                <w:szCs w:val="17"/>
+                <w:sz w:val="16"/>
+                <w:szCs w:val="16"/>
               </w:rPr>
               <w:t xml:space="preserve">pip install -r requirements.txt</w:t>
             </w:r>
@@ -6688,8 +6688,8 @@
             <w:r>
               <w:rPr>
                 <w:rFonts w:ascii="Consolas" w:cs="Consolas" w:eastAsia="Consolas" w:hAnsi="Consolas"/>
-                <w:sz w:val="17"/>
-                <w:szCs w:val="17"/>
+                <w:sz w:val="16"/>
+                <w:szCs w:val="16"/>
               </w:rPr>
               <w:t xml:space="preserve">Raiz del proyecto: D:\IA Development\proyecto-titulados</w:t>
             </w:r>
@@ -6715,8 +6715,8 @@
             <w:r>
               <w:rPr>
                 <w:rFonts w:ascii="Consolas" w:cs="Consolas" w:eastAsia="Consolas" w:hAnsi="Consolas"/>
-                <w:sz w:val="17"/>
-                <w:szCs w:val="17"/>
+                <w:sz w:val="16"/>
+                <w:szCs w:val="16"/>
               </w:rPr>
               <w:t xml:space="preserve">  python       3.14.7</w:t>
             </w:r>
@@ -6742,8 +6742,8 @@
             <w:r>
               <w:rPr>
                 <w:rFonts w:ascii="Consolas" w:cs="Consolas" w:eastAsia="Consolas" w:hAnsi="Consolas"/>
-                <w:sz w:val="17"/>
-                <w:szCs w:val="17"/>
+                <w:sz w:val="16"/>
+                <w:szCs w:val="16"/>
               </w:rPr>
               <w:t xml:space="preserve">  plataforma   Windows-11-10.0.26200-SP0</w:t>
             </w:r>
@@ -6769,8 +6769,8 @@
             <w:r>
               <w:rPr>
                 <w:rFonts w:ascii="Consolas" w:cs="Consolas" w:eastAsia="Consolas" w:hAnsi="Consolas"/>
-                <w:sz w:val="17"/>
-                <w:szCs w:val="17"/>
+                <w:sz w:val="16"/>
+                <w:szCs w:val="16"/>
               </w:rPr>
               <w:t xml:space="preserve">  ejecutable   D:\IA Development\proyecto-titulados\.venv\Scripts\python.exe</w:t>
             </w:r>
@@ -6796,8 +6796,8 @@
             <w:r>
               <w:rPr>
                 <w:rFonts w:ascii="Consolas" w:cs="Consolas" w:eastAsia="Consolas" w:hAnsi="Consolas"/>
-                <w:sz w:val="17"/>
-                <w:szCs w:val="17"/>
+                <w:sz w:val="16"/>
+                <w:szCs w:val="16"/>
               </w:rPr>
               <w:t xml:space="preserve">  numpy        2.5.3</w:t>
             </w:r>
@@ -6823,8 +6823,8 @@
             <w:r>
               <w:rPr>
                 <w:rFonts w:ascii="Consolas" w:cs="Consolas" w:eastAsia="Consolas" w:hAnsi="Consolas"/>
-                <w:sz w:val="17"/>
-                <w:szCs w:val="17"/>
+                <w:sz w:val="16"/>
+                <w:szCs w:val="16"/>
               </w:rPr>
               <w:t xml:space="preserve">  pandas       3.0.5</w:t>
             </w:r>
@@ -6850,8 +6850,8 @@
             <w:r>
               <w:rPr>
                 <w:rFonts w:ascii="Consolas" w:cs="Consolas" w:eastAsia="Consolas" w:hAnsi="Consolas"/>
-                <w:sz w:val="17"/>
-                <w:szCs w:val="17"/>
+                <w:sz w:val="16"/>
+                <w:szCs w:val="16"/>
               </w:rPr>
               <w:t xml:space="preserve">  matplotlib   3.11.1</w:t>
             </w:r>
@@ -6877,8 +6877,8 @@
             <w:r>
               <w:rPr>
                 <w:rFonts w:ascii="Consolas" w:cs="Consolas" w:eastAsia="Consolas" w:hAnsi="Consolas"/>
-                <w:sz w:val="17"/>
-                <w:szCs w:val="17"/>
+                <w:sz w:val="16"/>
+                <w:szCs w:val="16"/>
               </w:rPr>
               <w:t xml:space="preserve">  seaborn      0.13.2</w:t>
             </w:r>
@@ -6904,8 +6904,8 @@
             <w:r>
               <w:rPr>
                 <w:rFonts w:ascii="Consolas" w:cs="Consolas" w:eastAsia="Consolas" w:hAnsi="Consolas"/>
-                <w:sz w:val="17"/>
-                <w:szCs w:val="17"/>
+                <w:sz w:val="16"/>
+                <w:szCs w:val="16"/>
               </w:rPr>
               <w:t xml:space="preserve">  pyarrow      25.0.1</w:t>
             </w:r>
@@ -6962,7 +6962,7 @@
           <w:sz w:val="19"/>
           <w:szCs w:val="19"/>
         </w:rPr>
-        <w:t xml:space="preserve">Salida de python -m src.pipeline</w:t>
+        <w:t xml:space="preserve">Salida de python -m src.pipeline (reporte de validación)</w:t>
       </w:r>
     </w:p>
     <w:tbl>
@@ -6999,8 +6999,8 @@
             <w:r>
               <w:rPr>
                 <w:rFonts w:ascii="Consolas" w:cs="Consolas" w:eastAsia="Consolas" w:hAnsi="Consolas"/>
-                <w:sz w:val="17"/>
-                <w:szCs w:val="17"/>
+                <w:sz w:val="16"/>
+                <w:szCs w:val="16"/>
               </w:rPr>
               <w:t xml:space="preserve">[pipeline] Consolidado cargado: 1,710,167 filas</w:t>
             </w:r>
@@ -7026,10 +7026,10 @@
             <w:r>
               <w:rPr>
                 <w:rFonts w:ascii="Consolas" w:cs="Consolas" w:eastAsia="Consolas" w:hAnsi="Consolas"/>
-                <w:sz w:val="17"/>
-                <w:szCs w:val="17"/>
-              </w:rPr>
-              <w:t xml:space="preserve">                       paso                                                                                ...</w:t>
+                <w:sz w:val="16"/>
+                <w:szCs w:val="16"/>
+              </w:rPr>
+              <w:t xml:space="preserve">dataset_no_vacio  PASA  1,246,760 filas en el dataset analitico.</w:t>
             </w:r>
           </w:p>
         </w:tc>
@@ -7053,10 +7053,10 @@
             <w:r>
               <w:rPr>
                 <w:rFonts w:ascii="Consolas" w:cs="Consolas" w:eastAsia="Consolas" w:hAnsi="Consolas"/>
-                <w:sz w:val="17"/>
-                <w:szCs w:val="17"/>
-              </w:rPr>
-              <w:t xml:space="preserve">        consolidado_inicial                                                                                ...</w:t>
+                <w:sz w:val="16"/>
+                <w:szCs w:val="16"/>
+              </w:rPr>
+              <w:t xml:space="preserve">columnas_derivadas  PASA  Todas las variables derivadas presentes.</w:t>
             </w:r>
           </w:p>
         </w:tc>
@@ -7080,10 +7080,10 @@
             <w:r>
               <w:rPr>
                 <w:rFonts w:ascii="Consolas" w:cs="Consolas" w:eastAsia="Consolas" w:hAnsi="Consolas"/>
-                <w:sz w:val="17"/>
-                <w:szCs w:val="17"/>
-              </w:rPr>
-              <w:t xml:space="preserve">          marcar_sentinelas Codigos SIES y vacios convertidos a NA (anio_ing_carr_ori=62,492, sem_ing_carr_...</w:t>
+                <w:sz w:val="16"/>
+                <w:szCs w:val="16"/>
+              </w:rPr>
+              <w:t xml:space="preserve">sin_nulos_criticos  PASA  Sin nulos en las columnas criticas.</w:t>
             </w:r>
           </w:p>
         </w:tc>
@@ -7107,10 +7107,10 @@
             <w:r>
               <w:rPr>
                 <w:rFonts w:ascii="Consolas" w:cs="Consolas" w:eastAsia="Consolas" w:hAnsi="Consolas"/>
-                <w:sz w:val="17"/>
-                <w:szCs w:val="17"/>
-              </w:rPr>
-              <w:t xml:space="preserve">      normalizar_categorias                                                                                ...</w:t>
+                <w:sz w:val="16"/>
+                <w:szCs w:val="16"/>
+              </w:rPr>
+              <w:t xml:space="preserve">rango_duracion_real  PASA  Duracion real dentro de [1, 40] semestres; 0 fuera de rango.</w:t>
             </w:r>
           </w:p>
         </w:tc>
@@ -7134,10 +7134,10 @@
             <w:r>
               <w:rPr>
                 <w:rFonts w:ascii="Consolas" w:cs="Consolas" w:eastAsia="Consolas" w:hAnsi="Consolas"/>
-                <w:sz w:val="17"/>
-                <w:szCs w:val="17"/>
-              </w:rPr>
-              <w:t xml:space="preserve">              filtrar_nivel                                                                                ...</w:t>
+                <w:sz w:val="16"/>
+                <w:szCs w:val="16"/>
+              </w:rPr>
+              <w:t xml:space="preserve">rango_edad  PASA  Edad de titulacion dentro de [15, 90]; 0 fuera de rango.</w:t>
             </w:r>
           </w:p>
         </w:tc>
@@ -7161,10 +7161,10 @@
             <w:r>
               <w:rPr>
                 <w:rFonts w:ascii="Consolas" w:cs="Consolas" w:eastAsia="Consolas" w:hAnsi="Consolas"/>
-                <w:sz w:val="17"/>
-                <w:szCs w:val="17"/>
-              </w:rPr>
-              <w:t xml:space="preserve">        eliminar_duplicados                                                  Clave: cat_periodo + mrun + co...</w:t>
+                <w:sz w:val="16"/>
+                <w:szCs w:val="16"/>
+              </w:rPr>
+              <w:t xml:space="preserve">dominio_genero  PASA  Valores observados: ['Hombre', 'Mujer']</w:t>
             </w:r>
           </w:p>
         </w:tc>
@@ -7188,10 +7188,10 @@
             <w:r>
               <w:rPr>
                 <w:rFonts w:ascii="Consolas" w:cs="Consolas" w:eastAsia="Consolas" w:hAnsi="Consolas"/>
-                <w:sz w:val="17"/>
-                <w:szCs w:val="17"/>
-              </w:rPr>
-              <w:t xml:space="preserve">      descartar_sin_insumos                                                      Filas sin anio_ing_carr_or...</w:t>
+                <w:sz w:val="16"/>
+                <w:szCs w:val="16"/>
+              </w:rPr>
+              <w:t xml:space="preserve">coherencia_aritmetica  PASA  sobreduracion + duracion teorica = duracion real en 1,246,760 de...</w:t>
             </w:r>
           </w:p>
         </w:tc>
@@ -7215,10 +7215,10 @@
             <w:r>
               <w:rPr>
                 <w:rFonts w:ascii="Consolas" w:cs="Consolas" w:eastAsia="Consolas" w:hAnsi="Consolas"/>
-                <w:sz w:val="17"/>
-                <w:szCs w:val="17"/>
-              </w:rPr>
-              <w:t xml:space="preserve">construir_dataset_analitico                                                                               D...</w:t>
+                <w:sz w:val="16"/>
+                <w:szCs w:val="16"/>
+              </w:rPr>
+              <w:t xml:space="preserve">cobertura_anios  PASA  Anios presentes: [2020, 2021, 2022, 2023, 2024, 2025]</w:t>
             </w:r>
           </w:p>
         </w:tc>
@@ -7242,10 +7242,10 @@
             <w:r>
               <w:rPr>
                 <w:rFonts w:ascii="Consolas" w:cs="Consolas" w:eastAsia="Consolas" w:hAnsi="Consolas"/>
-                <w:sz w:val="17"/>
-                <w:szCs w:val="17"/>
-              </w:rPr>
-              <w:t xml:space="preserve">           filtrar_atipicos                                                                                ...</w:t>
+                <w:sz w:val="16"/>
+                <w:szCs w:val="16"/>
+              </w:rPr>
+              <w:t xml:space="preserve">titulo_posterior_ingreso  PASA  0 titulos con fecha anterior al ingreso.</w:t>
             </w:r>
           </w:p>
         </w:tc>
@@ -7269,10 +7269,10 @@
             <w:r>
               <w:rPr>
                 <w:rFonts w:ascii="Consolas" w:cs="Consolas" w:eastAsia="Consolas" w:hAnsi="Consolas"/>
-                <w:sz w:val="17"/>
-                <w:szCs w:val="17"/>
-              </w:rPr>
-              <w:t xml:space="preserve">                    regla   estado                                                                         ...</w:t>
+                <w:sz w:val="16"/>
+                <w:szCs w:val="16"/>
+              </w:rPr>
+              <w:t xml:space="preserve">sin_duplicados  PASA  0 duplicados sobre cat_periodo + mrun + cod_carrera + fecha_obtencion_t...</w:t>
             </w:r>
           </w:p>
         </w:tc>
@@ -7296,10 +7296,10 @@
             <w:r>
               <w:rPr>
                 <w:rFonts w:ascii="Consolas" w:cs="Consolas" w:eastAsia="Consolas" w:hAnsi="Consolas"/>
-                <w:sz w:val="17"/>
-                <w:szCs w:val="17"/>
-              </w:rPr>
-              <w:t xml:space="preserve">         dataset_no_vacio     PASA                                                         1,246,760 filas ...</w:t>
+                <w:sz w:val="16"/>
+                <w:szCs w:val="16"/>
+              </w:rPr>
+              <w:t xml:space="preserve">periodo_igual_anio_titulo ADVIERTE 230,563 filas (18.49%) donde el anio del proceso no coinci...</w:t>
             </w:r>
           </w:p>
         </w:tc>
@@ -7323,10 +7323,10 @@
             <w:r>
               <w:rPr>
                 <w:rFonts w:ascii="Consolas" w:cs="Consolas" w:eastAsia="Consolas" w:hAnsi="Consolas"/>
-                <w:sz w:val="17"/>
-                <w:szCs w:val="17"/>
-              </w:rPr>
-              <w:t xml:space="preserve">       columnas_derivadas     PASA                                                         Todas las variab...</w:t>
+                <w:sz w:val="16"/>
+                <w:szCs w:val="16"/>
+              </w:rPr>
+              <w:t xml:space="preserve">10 reglas aprobadas, 1 advertencias, 0 fallas criticas.</w:t>
             </w:r>
           </w:p>
         </w:tc>
@@ -7350,307 +7350,10 @@
             <w:r>
               <w:rPr>
                 <w:rFonts w:ascii="Consolas" w:cs="Consolas" w:eastAsia="Consolas" w:hAnsi="Consolas"/>
-                <w:sz w:val="17"/>
-                <w:szCs w:val="17"/>
-              </w:rPr>
-              <w:t xml:space="preserve">       sin_nulos_criticos     PASA                                                              Sin nulos e...</w:t>
-            </w:r>
-          </w:p>
-        </w:tc>
-      </w:tr>
-      <w:tr>
-        <w:tc>
-          <w:tcPr>
-            <w:tcW w:type="dxa" w:w="9360"/>
-            <w:shd w:fill="F4F6F8" w:val="clear"/>
-            <w:tcMar>
-              <w:top w:type="dxa" w:w="20"/>
-              <w:left w:type="dxa" w:w="120"/>
-              <w:bottom w:type="dxa" w:w="20"/>
-              <w:right w:type="dxa" w:w="120"/>
-            </w:tcMar>
-          </w:tcPr>
-          <w:p>
-            <w:pPr>
-              <w:spacing w:after="0" w:line="240"/>
-            </w:pPr>
-            <w:r>
-              <w:rPr>
-                <w:rFonts w:ascii="Consolas" w:cs="Consolas" w:eastAsia="Consolas" w:hAnsi="Consolas"/>
-                <w:sz w:val="17"/>
-                <w:szCs w:val="17"/>
-              </w:rPr>
-              <w:t xml:space="preserve">      rango_duracion_real     PASA                                     Duracion real dentro de [1, 40] seme...</w:t>
-            </w:r>
-          </w:p>
-        </w:tc>
-      </w:tr>
-      <w:tr>
-        <w:tc>
-          <w:tcPr>
-            <w:tcW w:type="dxa" w:w="9360"/>
-            <w:shd w:fill="F4F6F8" w:val="clear"/>
-            <w:tcMar>
-              <w:top w:type="dxa" w:w="20"/>
-              <w:left w:type="dxa" w:w="120"/>
-              <w:bottom w:type="dxa" w:w="20"/>
-              <w:right w:type="dxa" w:w="120"/>
-            </w:tcMar>
-          </w:tcPr>
-          <w:p>
-            <w:pPr>
-              <w:spacing w:after="0" w:line="240"/>
-            </w:pPr>
-            <w:r>
-              <w:rPr>
-                <w:rFonts w:ascii="Consolas" w:cs="Consolas" w:eastAsia="Consolas" w:hAnsi="Consolas"/>
-                <w:sz w:val="17"/>
-                <w:szCs w:val="17"/>
-              </w:rPr>
-              <w:t xml:space="preserve">               rango_edad     PASA                                         Edad de titulacion dentro de [15...</w:t>
-            </w:r>
-          </w:p>
-        </w:tc>
-      </w:tr>
-      <w:tr>
-        <w:tc>
-          <w:tcPr>
-            <w:tcW w:type="dxa" w:w="9360"/>
-            <w:shd w:fill="F4F6F8" w:val="clear"/>
-            <w:tcMar>
-              <w:top w:type="dxa" w:w="20"/>
-              <w:left w:type="dxa" w:w="120"/>
-              <w:bottom w:type="dxa" w:w="20"/>
-              <w:right w:type="dxa" w:w="120"/>
-            </w:tcMar>
-          </w:tcPr>
-          <w:p>
-            <w:pPr>
-              <w:spacing w:after="0" w:line="240"/>
-            </w:pPr>
-            <w:r>
-              <w:rPr>
-                <w:rFonts w:ascii="Consolas" w:cs="Consolas" w:eastAsia="Consolas" w:hAnsi="Consolas"/>
-                <w:sz w:val="17"/>
-                <w:szCs w:val="17"/>
-              </w:rPr>
-              <w:t xml:space="preserve">           dominio_genero     PASA                                                          Valores observa...</w:t>
-            </w:r>
-          </w:p>
-        </w:tc>
-      </w:tr>
-      <w:tr>
-        <w:tc>
-          <w:tcPr>
-            <w:tcW w:type="dxa" w:w="9360"/>
-            <w:shd w:fill="F4F6F8" w:val="clear"/>
-            <w:tcMar>
-              <w:top w:type="dxa" w:w="20"/>
-              <w:left w:type="dxa" w:w="120"/>
-              <w:bottom w:type="dxa" w:w="20"/>
-              <w:right w:type="dxa" w:w="120"/>
-            </w:tcMar>
-          </w:tcPr>
-          <w:p>
-            <w:pPr>
-              <w:spacing w:after="0" w:line="240"/>
-            </w:pPr>
-            <w:r>
-              <w:rPr>
-                <w:rFonts w:ascii="Consolas" w:cs="Consolas" w:eastAsia="Consolas" w:hAnsi="Consolas"/>
-                <w:sz w:val="17"/>
-                <w:szCs w:val="17"/>
-              </w:rPr>
-              <w:t xml:space="preserve">    coherencia_aritmetica     PASA                sobreduracion + duracion teorica = duracion real en 1,246...</w:t>
-            </w:r>
-          </w:p>
-        </w:tc>
-      </w:tr>
-      <w:tr>
-        <w:tc>
-          <w:tcPr>
-            <w:tcW w:type="dxa" w:w="9360"/>
-            <w:shd w:fill="F4F6F8" w:val="clear"/>
-            <w:tcMar>
-              <w:top w:type="dxa" w:w="20"/>
-              <w:left w:type="dxa" w:w="120"/>
-              <w:bottom w:type="dxa" w:w="20"/>
-              <w:right w:type="dxa" w:w="120"/>
-            </w:tcMar>
-          </w:tcPr>
-          <w:p>
-            <w:pPr>
-              <w:spacing w:after="0" w:line="240"/>
-            </w:pPr>
-            <w:r>
-              <w:rPr>
-                <w:rFonts w:ascii="Consolas" w:cs="Consolas" w:eastAsia="Consolas" w:hAnsi="Consolas"/>
-                <w:sz w:val="17"/>
-                <w:szCs w:val="17"/>
-              </w:rPr>
-              <w:t xml:space="preserve">          cobertura_anios     PASA                                            Anios presentes: [2020, 2021,...</w:t>
-            </w:r>
-          </w:p>
-        </w:tc>
-      </w:tr>
-      <w:tr>
-        <w:tc>
-          <w:tcPr>
-            <w:tcW w:type="dxa" w:w="9360"/>
-            <w:shd w:fill="F4F6F8" w:val="clear"/>
-            <w:tcMar>
-              <w:top w:type="dxa" w:w="20"/>
-              <w:left w:type="dxa" w:w="120"/>
-              <w:bottom w:type="dxa" w:w="20"/>
-              <w:right w:type="dxa" w:w="120"/>
-            </w:tcMar>
-          </w:tcPr>
-          <w:p>
-            <w:pPr>
-              <w:spacing w:after="0" w:line="240"/>
-            </w:pPr>
-            <w:r>
-              <w:rPr>
-                <w:rFonts w:ascii="Consolas" w:cs="Consolas" w:eastAsia="Consolas" w:hAnsi="Consolas"/>
-                <w:sz w:val="17"/>
-                <w:szCs w:val="17"/>
-              </w:rPr>
-              <w:t xml:space="preserve"> titulo_posterior_ingreso     PASA                                                         0 titulos con fe...</w:t>
-            </w:r>
-          </w:p>
-        </w:tc>
-      </w:tr>
-      <w:tr>
-        <w:tc>
-          <w:tcPr>
-            <w:tcW w:type="dxa" w:w="9360"/>
-            <w:shd w:fill="F4F6F8" w:val="clear"/>
-            <w:tcMar>
-              <w:top w:type="dxa" w:w="20"/>
-              <w:left w:type="dxa" w:w="120"/>
-              <w:bottom w:type="dxa" w:w="20"/>
-              <w:right w:type="dxa" w:w="120"/>
-            </w:tcMar>
-          </w:tcPr>
-          <w:p>
-            <w:pPr>
-              <w:spacing w:after="0" w:line="240"/>
-            </w:pPr>
-            <w:r>
-              <w:rPr>
-                <w:rFonts w:ascii="Consolas" w:cs="Consolas" w:eastAsia="Consolas" w:hAnsi="Consolas"/>
-                <w:sz w:val="17"/>
-                <w:szCs w:val="17"/>
-              </w:rPr>
-              <w:t xml:space="preserve">           sin_duplicados     PASA                    0 duplicados sobre cat_periodo + mrun + cod_carrera +...</w:t>
-            </w:r>
-          </w:p>
-        </w:tc>
-      </w:tr>
-      <w:tr>
-        <w:tc>
-          <w:tcPr>
-            <w:tcW w:type="dxa" w:w="9360"/>
-            <w:shd w:fill="F4F6F8" w:val="clear"/>
-            <w:tcMar>
-              <w:top w:type="dxa" w:w="20"/>
-              <w:left w:type="dxa" w:w="120"/>
-              <w:bottom w:type="dxa" w:w="20"/>
-              <w:right w:type="dxa" w:w="120"/>
-            </w:tcMar>
-          </w:tcPr>
-          <w:p>
-            <w:pPr>
-              <w:spacing w:after="0" w:line="240"/>
-            </w:pPr>
-            <w:r>
-              <w:rPr>
-                <w:rFonts w:ascii="Consolas" w:cs="Consolas" w:eastAsia="Consolas" w:hAnsi="Consolas"/>
-                <w:sz w:val="17"/>
-                <w:szCs w:val="17"/>
-              </w:rPr>
-              <w:t xml:space="preserve">periodo_igual_anio_titulo ADVIERTE 230,563 filas (18.49%) donde el anio del proceso no coincide con el anio...</w:t>
-            </w:r>
-          </w:p>
-        </w:tc>
-      </w:tr>
-      <w:tr>
-        <w:tc>
-          <w:tcPr>
-            <w:tcW w:type="dxa" w:w="9360"/>
-            <w:shd w:fill="F4F6F8" w:val="clear"/>
-            <w:tcMar>
-              <w:top w:type="dxa" w:w="20"/>
-              <w:left w:type="dxa" w:w="120"/>
-              <w:bottom w:type="dxa" w:w="20"/>
-              <w:right w:type="dxa" w:w="120"/>
-            </w:tcMar>
-          </w:tcPr>
-          <w:p>
-            <w:pPr>
-              <w:spacing w:after="0" w:line="240"/>
-            </w:pPr>
-            <w:r>
-              <w:rPr>
-                <w:rFonts w:ascii="Consolas" w:cs="Consolas" w:eastAsia="Consolas" w:hAnsi="Consolas"/>
-                <w:sz w:val="17"/>
-                <w:szCs w:val="17"/>
-              </w:rPr>
-              <w:t xml:space="preserve">10 reglas aprobadas, 1 advertencias, 0 fallas criticas.</w:t>
-            </w:r>
-          </w:p>
-        </w:tc>
-      </w:tr>
-      <w:tr>
-        <w:tc>
-          <w:tcPr>
-            <w:tcW w:type="dxa" w:w="9360"/>
-            <w:shd w:fill="F4F6F8" w:val="clear"/>
-            <w:tcMar>
-              <w:top w:type="dxa" w:w="20"/>
-              <w:left w:type="dxa" w:w="120"/>
-              <w:bottom w:type="dxa" w:w="20"/>
-              <w:right w:type="dxa" w:w="120"/>
-            </w:tcMar>
-          </w:tcPr>
-          <w:p>
-            <w:pPr>
-              <w:spacing w:after="0" w:line="240"/>
-            </w:pPr>
-            <w:r>
-              <w:rPr>
-                <w:rFonts w:ascii="Consolas" w:cs="Consolas" w:eastAsia="Consolas" w:hAnsi="Consolas"/>
-                <w:sz w:val="17"/>
-                <w:szCs w:val="17"/>
-              </w:rPr>
-              <w:t xml:space="preserve">[pipeline] Dataset analitico: D:\IA Development\proyecto-titulados\data\processed\titulados_pregrado_analit...</w:t>
-            </w:r>
-          </w:p>
-        </w:tc>
-      </w:tr>
-      <w:tr>
-        <w:tc>
-          <w:tcPr>
-            <w:tcW w:type="dxa" w:w="9360"/>
-            <w:shd w:fill="F4F6F8" w:val="clear"/>
-            <w:tcMar>
-              <w:top w:type="dxa" w:w="20"/>
-              <w:left w:type="dxa" w:w="120"/>
-              <w:bottom w:type="dxa" w:w="20"/>
-              <w:right w:type="dxa" w:w="120"/>
-            </w:tcMar>
-          </w:tcPr>
-          <w:p>
-            <w:pPr>
-              <w:spacing w:after="0" w:line="240"/>
-            </w:pPr>
-            <w:r>
-              <w:rPr>
-                <w:rFonts w:ascii="Consolas" w:cs="Consolas" w:eastAsia="Consolas" w:hAnsi="Consolas"/>
-                <w:sz w:val="17"/>
-                <w:szCs w:val="17"/>
-              </w:rPr>
-              <w:t xml:space="preserve"> </w:t>
+                <w:sz w:val="16"/>
+                <w:szCs w:val="16"/>
+              </w:rPr>
+              <w:t xml:space="preserve">[pipeline] Dataset analitico: D:\IA Development\proyecto-titulados\data\processed\titulados_p...</w:t>
             </w:r>
           </w:p>
         </w:tc>
@@ -7709,8 +7412,8 @@
             <w:r>
               <w:rPr>
                 <w:rFonts w:ascii="Consolas" w:cs="Consolas" w:eastAsia="Consolas" w:hAnsi="Consolas"/>
-                <w:sz w:val="17"/>
-                <w:szCs w:val="17"/>
+                <w:sz w:val="16"/>
+                <w:szCs w:val="16"/>
               </w:rPr>
               <w:t xml:space="preserve">python -m jupyter nbconvert --to notebook --execute --inplace "F1/F1_Definición.ipynb"</w:t>
             </w:r>
@@ -7736,8 +7439,8 @@
             <w:r>
               <w:rPr>
                 <w:rFonts w:ascii="Consolas" w:cs="Consolas" w:eastAsia="Consolas" w:hAnsi="Consolas"/>
-                <w:sz w:val="17"/>
-                <w:szCs w:val="17"/>
+                <w:sz w:val="16"/>
+                <w:szCs w:val="16"/>
               </w:rPr>
               <w:t xml:space="preserve">python -m jupyter nbconvert --to notebook --execute --inplace F2/F2_1_Obtencion_Exploracion.ipynb</w:t>
             </w:r>
@@ -7763,8 +7466,8 @@
             <w:r>
               <w:rPr>
                 <w:rFonts w:ascii="Consolas" w:cs="Consolas" w:eastAsia="Consolas" w:hAnsi="Consolas"/>
-                <w:sz w:val="17"/>
-                <w:szCs w:val="17"/>
+                <w:sz w:val="16"/>
+                <w:szCs w:val="16"/>
               </w:rPr>
               <w:t xml:space="preserve">python -m jupyter nbconvert --to notebook --execute --inplace F2/F2_2_Limpieza_Transformacion.ipynb</w:t>
             </w:r>
@@ -7790,8 +7493,8 @@
             <w:r>
               <w:rPr>
                 <w:rFonts w:ascii="Consolas" w:cs="Consolas" w:eastAsia="Consolas" w:hAnsi="Consolas"/>
-                <w:sz w:val="17"/>
-                <w:szCs w:val="17"/>
+                <w:sz w:val="16"/>
+                <w:szCs w:val="16"/>
               </w:rPr>
               <w:t xml:space="preserve">python -m jupyter nbconvert --to notebook --execute --inplace F2/F2_3_Validacion_Analisis.ipynb</w:t>
             </w:r>
@@ -7992,7 +7695,7 @@
                 <w:sz w:val="19"/>
                 <w:szCs w:val="19"/>
               </w:rPr>
-              <w:t xml:space="preserve">4954ad7</w:t>
+              <w:t xml:space="preserve">be52b95</w:t>
             </w:r>
           </w:p>
         </w:tc>
@@ -8048,7 +7751,7 @@
                 <w:sz w:val="19"/>
                 <w:szCs w:val="19"/>
               </w:rPr>
-              <w:t xml:space="preserve">style(viz): rotula las figuras con formato numerico chileno</w:t>
+              <w:t xml:space="preserve">style(viz): corrige la acentuacion de las etiquetas de los graficos</w:t>
             </w:r>
           </w:p>
         </w:tc>
@@ -8079,7 +7782,7 @@
                 <w:sz w:val="19"/>
                 <w:szCs w:val="19"/>
               </w:rPr>
-              <w:t xml:space="preserve">43035f5</w:t>
+              <w:t xml:space="preserve">4954ad7</w:t>
             </w:r>
           </w:p>
         </w:tc>
@@ -8137,93 +7840,93 @@
                 <w:sz w:val="19"/>
                 <w:szCs w:val="19"/>
               </w:rPr>
+              <w:t xml:space="preserve">style(viz): rotula las figuras con formato numerico chileno</w:t>
+            </w:r>
+          </w:p>
+        </w:tc>
+      </w:tr>
+      <w:tr>
+        <w:tc>
+          <w:tcPr>
+            <w:tcW w:type="dxa" w:w="1123"/>
+            <w:tcMar>
+              <w:top w:type="dxa" w:w="60"/>
+              <w:left w:type="dxa" w:w="100"/>
+              <w:bottom w:type="dxa" w:w="60"/>
+              <w:right w:type="dxa" w:w="100"/>
+            </w:tcMar>
+          </w:tcPr>
+          <w:p>
+            <w:pPr>
+              <w:spacing w:after="0" w:line="260"/>
+              <w:jc w:val="left"/>
+            </w:pPr>
+            <w:r>
+              <w:rPr>
+                <w:rFonts w:ascii="Calibri" w:cs="Calibri" w:eastAsia="Calibri" w:hAnsi="Calibri"/>
+                <w:b w:val="false"/>
+                <w:bCs w:val="false"/>
+                <w:color w:val="000000"/>
+                <w:sz w:val="19"/>
+                <w:szCs w:val="19"/>
+              </w:rPr>
+              <w:t xml:space="preserve">43035f5</w:t>
+            </w:r>
+          </w:p>
+        </w:tc>
+        <w:tc>
+          <w:tcPr>
+            <w:tcW w:type="dxa" w:w="1404"/>
+            <w:tcMar>
+              <w:top w:type="dxa" w:w="60"/>
+              <w:left w:type="dxa" w:w="100"/>
+              <w:bottom w:type="dxa" w:w="60"/>
+              <w:right w:type="dxa" w:w="100"/>
+            </w:tcMar>
+          </w:tcPr>
+          <w:p>
+            <w:pPr>
+              <w:spacing w:after="0" w:line="260"/>
+              <w:jc w:val="left"/>
+            </w:pPr>
+            <w:r>
+              <w:rPr>
+                <w:rFonts w:ascii="Calibri" w:cs="Calibri" w:eastAsia="Calibri" w:hAnsi="Calibri"/>
+                <w:b w:val="false"/>
+                <w:bCs w:val="false"/>
+                <w:color w:val="000000"/>
+                <w:sz w:val="19"/>
+                <w:szCs w:val="19"/>
+              </w:rPr>
+              <w:t xml:space="preserve">2026-09-08</w:t>
+            </w:r>
+          </w:p>
+        </w:tc>
+        <w:tc>
+          <w:tcPr>
+            <w:tcW w:type="dxa" w:w="6833"/>
+            <w:tcMar>
+              <w:top w:type="dxa" w:w="60"/>
+              <w:left w:type="dxa" w:w="100"/>
+              <w:bottom w:type="dxa" w:w="60"/>
+              <w:right w:type="dxa" w:w="100"/>
+            </w:tcMar>
+          </w:tcPr>
+          <w:p>
+            <w:pPr>
+              <w:spacing w:after="0" w:line="260"/>
+              <w:jc w:val="left"/>
+            </w:pPr>
+            <w:r>
+              <w:rPr>
+                <w:rFonts w:ascii="Calibri" w:cs="Calibri" w:eastAsia="Calibri" w:hAnsi="Calibri"/>
+                <w:b w:val="false"/>
+                <w:bCs w:val="false"/>
+                <w:color w:val="000000"/>
+                <w:sz w:val="19"/>
+                <w:szCs w:val="19"/>
+              </w:rPr>
               <w:t xml:space="preserve">merge: integra la rama fase-2/pipeline-datos en main</w:t>
-            </w:r>
-          </w:p>
-        </w:tc>
-      </w:tr>
-      <w:tr>
-        <w:tc>
-          <w:tcPr>
-            <w:tcW w:type="dxa" w:w="1123"/>
-            <w:tcMar>
-              <w:top w:type="dxa" w:w="60"/>
-              <w:left w:type="dxa" w:w="100"/>
-              <w:bottom w:type="dxa" w:w="60"/>
-              <w:right w:type="dxa" w:w="100"/>
-            </w:tcMar>
-          </w:tcPr>
-          <w:p>
-            <w:pPr>
-              <w:spacing w:after="0" w:line="260"/>
-              <w:jc w:val="left"/>
-            </w:pPr>
-            <w:r>
-              <w:rPr>
-                <w:rFonts w:ascii="Calibri" w:cs="Calibri" w:eastAsia="Calibri" w:hAnsi="Calibri"/>
-                <w:b w:val="false"/>
-                <w:bCs w:val="false"/>
-                <w:color w:val="000000"/>
-                <w:sz w:val="19"/>
-                <w:szCs w:val="19"/>
-              </w:rPr>
-              <w:t xml:space="preserve">179960e</w:t>
-            </w:r>
-          </w:p>
-        </w:tc>
-        <w:tc>
-          <w:tcPr>
-            <w:tcW w:type="dxa" w:w="1404"/>
-            <w:tcMar>
-              <w:top w:type="dxa" w:w="60"/>
-              <w:left w:type="dxa" w:w="100"/>
-              <w:bottom w:type="dxa" w:w="60"/>
-              <w:right w:type="dxa" w:w="100"/>
-            </w:tcMar>
-          </w:tcPr>
-          <w:p>
-            <w:pPr>
-              <w:spacing w:after="0" w:line="260"/>
-              <w:jc w:val="left"/>
-            </w:pPr>
-            <w:r>
-              <w:rPr>
-                <w:rFonts w:ascii="Calibri" w:cs="Calibri" w:eastAsia="Calibri" w:hAnsi="Calibri"/>
-                <w:b w:val="false"/>
-                <w:bCs w:val="false"/>
-                <w:color w:val="000000"/>
-                <w:sz w:val="19"/>
-                <w:szCs w:val="19"/>
-              </w:rPr>
-              <w:t xml:space="preserve">2026-09-08</w:t>
-            </w:r>
-          </w:p>
-        </w:tc>
-        <w:tc>
-          <w:tcPr>
-            <w:tcW w:type="dxa" w:w="6833"/>
-            <w:tcMar>
-              <w:top w:type="dxa" w:w="60"/>
-              <w:left w:type="dxa" w:w="100"/>
-              <w:bottom w:type="dxa" w:w="60"/>
-              <w:right w:type="dxa" w:w="100"/>
-            </w:tcMar>
-          </w:tcPr>
-          <w:p>
-            <w:pPr>
-              <w:spacing w:after="0" w:line="260"/>
-              <w:jc w:val="left"/>
-            </w:pPr>
-            <w:r>
-              <w:rPr>
-                <w:rFonts w:ascii="Calibri" w:cs="Calibri" w:eastAsia="Calibri" w:hAnsi="Calibri"/>
-                <w:b w:val="false"/>
-                <w:bCs w:val="false"/>
-                <w:color w:val="000000"/>
-                <w:sz w:val="19"/>
-                <w:szCs w:val="19"/>
-              </w:rPr>
-              <w:t xml:space="preserve">docs(f2): ejecuta los notebooks y versiona figuras, tablas y muestra</w:t>
             </w:r>
           </w:p>
         </w:tc>
@@ -8254,7 +7957,7 @@
                 <w:sz w:val="19"/>
                 <w:szCs w:val="19"/>
               </w:rPr>
-              <w:t xml:space="preserve">a95bdd3</w:t>
+              <w:t xml:space="preserve">179960e</w:t>
             </w:r>
           </w:p>
         </w:tc>
@@ -8312,93 +8015,93 @@
                 <w:sz w:val="19"/>
                 <w:szCs w:val="19"/>
               </w:rPr>
+              <w:t xml:space="preserve">docs(f2): ejecuta los notebooks y versiona figuras, tablas y muestra</w:t>
+            </w:r>
+          </w:p>
+        </w:tc>
+      </w:tr>
+      <w:tr>
+        <w:tc>
+          <w:tcPr>
+            <w:tcW w:type="dxa" w:w="1123"/>
+            <w:tcMar>
+              <w:top w:type="dxa" w:w="60"/>
+              <w:left w:type="dxa" w:w="100"/>
+              <w:bottom w:type="dxa" w:w="60"/>
+              <w:right w:type="dxa" w:w="100"/>
+            </w:tcMar>
+          </w:tcPr>
+          <w:p>
+            <w:pPr>
+              <w:spacing w:after="0" w:line="260"/>
+              <w:jc w:val="left"/>
+            </w:pPr>
+            <w:r>
+              <w:rPr>
+                <w:rFonts w:ascii="Calibri" w:cs="Calibri" w:eastAsia="Calibri" w:hAnsi="Calibri"/>
+                <w:b w:val="false"/>
+                <w:bCs w:val="false"/>
+                <w:color w:val="000000"/>
+                <w:sz w:val="19"/>
+                <w:szCs w:val="19"/>
+              </w:rPr>
+              <w:t xml:space="preserve">a95bdd3</w:t>
+            </w:r>
+          </w:p>
+        </w:tc>
+        <w:tc>
+          <w:tcPr>
+            <w:tcW w:type="dxa" w:w="1404"/>
+            <w:tcMar>
+              <w:top w:type="dxa" w:w="60"/>
+              <w:left w:type="dxa" w:w="100"/>
+              <w:bottom w:type="dxa" w:w="60"/>
+              <w:right w:type="dxa" w:w="100"/>
+            </w:tcMar>
+          </w:tcPr>
+          <w:p>
+            <w:pPr>
+              <w:spacing w:after="0" w:line="260"/>
+              <w:jc w:val="left"/>
+            </w:pPr>
+            <w:r>
+              <w:rPr>
+                <w:rFonts w:ascii="Calibri" w:cs="Calibri" w:eastAsia="Calibri" w:hAnsi="Calibri"/>
+                <w:b w:val="false"/>
+                <w:bCs w:val="false"/>
+                <w:color w:val="000000"/>
+                <w:sz w:val="19"/>
+                <w:szCs w:val="19"/>
+              </w:rPr>
+              <w:t xml:space="preserve">2026-09-08</w:t>
+            </w:r>
+          </w:p>
+        </w:tc>
+        <w:tc>
+          <w:tcPr>
+            <w:tcW w:type="dxa" w:w="6833"/>
+            <w:tcMar>
+              <w:top w:type="dxa" w:w="60"/>
+              <w:left w:type="dxa" w:w="100"/>
+              <w:bottom w:type="dxa" w:w="60"/>
+              <w:right w:type="dxa" w:w="100"/>
+            </w:tcMar>
+          </w:tcPr>
+          <w:p>
+            <w:pPr>
+              <w:spacing w:after="0" w:line="260"/>
+              <w:jc w:val="left"/>
+            </w:pPr>
+            <w:r>
+              <w:rPr>
+                <w:rFonts w:ascii="Calibri" w:cs="Calibri" w:eastAsia="Calibri" w:hAnsi="Calibri"/>
+                <w:b w:val="false"/>
+                <w:bCs w:val="false"/>
+                <w:color w:val="000000"/>
+                <w:sz w:val="19"/>
+                <w:szCs w:val="19"/>
+              </w:rPr>
               <w:t xml:space="preserve">perf(limpieza): normaliza el catalogo de categorias en vez de fila por fila</w:t>
-            </w:r>
-          </w:p>
-        </w:tc>
-      </w:tr>
-      <w:tr>
-        <w:tc>
-          <w:tcPr>
-            <w:tcW w:type="dxa" w:w="1123"/>
-            <w:tcMar>
-              <w:top w:type="dxa" w:w="60"/>
-              <w:left w:type="dxa" w:w="100"/>
-              <w:bottom w:type="dxa" w:w="60"/>
-              <w:right w:type="dxa" w:w="100"/>
-            </w:tcMar>
-          </w:tcPr>
-          <w:p>
-            <w:pPr>
-              <w:spacing w:after="0" w:line="260"/>
-              <w:jc w:val="left"/>
-            </w:pPr>
-            <w:r>
-              <w:rPr>
-                <w:rFonts w:ascii="Calibri" w:cs="Calibri" w:eastAsia="Calibri" w:hAnsi="Calibri"/>
-                <w:b w:val="false"/>
-                <w:bCs w:val="false"/>
-                <w:color w:val="000000"/>
-                <w:sz w:val="19"/>
-                <w:szCs w:val="19"/>
-              </w:rPr>
-              <w:t xml:space="preserve">daf70dd</w:t>
-            </w:r>
-          </w:p>
-        </w:tc>
-        <w:tc>
-          <w:tcPr>
-            <w:tcW w:type="dxa" w:w="1404"/>
-            <w:tcMar>
-              <w:top w:type="dxa" w:w="60"/>
-              <w:left w:type="dxa" w:w="100"/>
-              <w:bottom w:type="dxa" w:w="60"/>
-              <w:right w:type="dxa" w:w="100"/>
-            </w:tcMar>
-          </w:tcPr>
-          <w:p>
-            <w:pPr>
-              <w:spacing w:after="0" w:line="260"/>
-              <w:jc w:val="left"/>
-            </w:pPr>
-            <w:r>
-              <w:rPr>
-                <w:rFonts w:ascii="Calibri" w:cs="Calibri" w:eastAsia="Calibri" w:hAnsi="Calibri"/>
-                <w:b w:val="false"/>
-                <w:bCs w:val="false"/>
-                <w:color w:val="000000"/>
-                <w:sz w:val="19"/>
-                <w:szCs w:val="19"/>
-              </w:rPr>
-              <w:t xml:space="preserve">2026-09-08</w:t>
-            </w:r>
-          </w:p>
-        </w:tc>
-        <w:tc>
-          <w:tcPr>
-            <w:tcW w:type="dxa" w:w="6833"/>
-            <w:tcMar>
-              <w:top w:type="dxa" w:w="60"/>
-              <w:left w:type="dxa" w:w="100"/>
-              <w:bottom w:type="dxa" w:w="60"/>
-              <w:right w:type="dxa" w:w="100"/>
-            </w:tcMar>
-          </w:tcPr>
-          <w:p>
-            <w:pPr>
-              <w:spacing w:after="0" w:line="260"/>
-              <w:jc w:val="left"/>
-            </w:pPr>
-            <w:r>
-              <w:rPr>
-                <w:rFonts w:ascii="Calibri" w:cs="Calibri" w:eastAsia="Calibri" w:hAnsi="Calibri"/>
-                <w:b w:val="false"/>
-                <w:bCs w:val="false"/>
-                <w:color w:val="000000"/>
-                <w:sz w:val="19"/>
-                <w:szCs w:val="19"/>
-              </w:rPr>
-              <w:t xml:space="preserve">fix(viz,transformacion): compatibilidad con los tipos anulables de pandas</w:t>
             </w:r>
           </w:p>
         </w:tc>
@@ -8429,7 +8132,7 @@
                 <w:sz w:val="19"/>
                 <w:szCs w:val="19"/>
               </w:rPr>
-              <w:t xml:space="preserve">1b4b202</w:t>
+              <w:t xml:space="preserve">daf70dd</w:t>
             </w:r>
           </w:p>
         </w:tc>
@@ -8487,93 +8190,93 @@
                 <w:sz w:val="19"/>
                 <w:szCs w:val="19"/>
               </w:rPr>
+              <w:t xml:space="preserve">fix(viz,transformacion): compatibilidad con los tipos anulables de pandas</w:t>
+            </w:r>
+          </w:p>
+        </w:tc>
+      </w:tr>
+      <w:tr>
+        <w:tc>
+          <w:tcPr>
+            <w:tcW w:type="dxa" w:w="1123"/>
+            <w:tcMar>
+              <w:top w:type="dxa" w:w="60"/>
+              <w:left w:type="dxa" w:w="100"/>
+              <w:bottom w:type="dxa" w:w="60"/>
+              <w:right w:type="dxa" w:w="100"/>
+            </w:tcMar>
+          </w:tcPr>
+          <w:p>
+            <w:pPr>
+              <w:spacing w:after="0" w:line="260"/>
+              <w:jc w:val="left"/>
+            </w:pPr>
+            <w:r>
+              <w:rPr>
+                <w:rFonts w:ascii="Calibri" w:cs="Calibri" w:eastAsia="Calibri" w:hAnsi="Calibri"/>
+                <w:b w:val="false"/>
+                <w:bCs w:val="false"/>
+                <w:color w:val="000000"/>
+                <w:sz w:val="19"/>
+                <w:szCs w:val="19"/>
+              </w:rPr>
+              <w:t xml:space="preserve">1b4b202</w:t>
+            </w:r>
+          </w:p>
+        </w:tc>
+        <w:tc>
+          <w:tcPr>
+            <w:tcW w:type="dxa" w:w="1404"/>
+            <w:tcMar>
+              <w:top w:type="dxa" w:w="60"/>
+              <w:left w:type="dxa" w:w="100"/>
+              <w:bottom w:type="dxa" w:w="60"/>
+              <w:right w:type="dxa" w:w="100"/>
+            </w:tcMar>
+          </w:tcPr>
+          <w:p>
+            <w:pPr>
+              <w:spacing w:after="0" w:line="260"/>
+              <w:jc w:val="left"/>
+            </w:pPr>
+            <w:r>
+              <w:rPr>
+                <w:rFonts w:ascii="Calibri" w:cs="Calibri" w:eastAsia="Calibri" w:hAnsi="Calibri"/>
+                <w:b w:val="false"/>
+                <w:bCs w:val="false"/>
+                <w:color w:val="000000"/>
+                <w:sz w:val="19"/>
+                <w:szCs w:val="19"/>
+              </w:rPr>
+              <w:t xml:space="preserve">2026-09-08</w:t>
+            </w:r>
+          </w:p>
+        </w:tc>
+        <w:tc>
+          <w:tcPr>
+            <w:tcW w:type="dxa" w:w="6833"/>
+            <w:tcMar>
+              <w:top w:type="dxa" w:w="60"/>
+              <w:left w:type="dxa" w:w="100"/>
+              <w:bottom w:type="dxa" w:w="60"/>
+              <w:right w:type="dxa" w:w="100"/>
+            </w:tcMar>
+          </w:tcPr>
+          <w:p>
+            <w:pPr>
+              <w:spacing w:after="0" w:line="260"/>
+              <w:jc w:val="left"/>
+            </w:pPr>
+            <w:r>
+              <w:rPr>
+                <w:rFonts w:ascii="Calibri" w:cs="Calibri" w:eastAsia="Calibri" w:hAnsi="Calibri"/>
+                <w:b w:val="false"/>
+                <w:bCs w:val="false"/>
+                <w:color w:val="000000"/>
+                <w:sz w:val="19"/>
+                <w:szCs w:val="19"/>
+              </w:rPr>
               <w:t xml:space="preserve">docs(f2): notebooks de obtencion, limpieza, transformacion y validacion</w:t>
-            </w:r>
-          </w:p>
-        </w:tc>
-      </w:tr>
-      <w:tr>
-        <w:tc>
-          <w:tcPr>
-            <w:tcW w:type="dxa" w:w="1123"/>
-            <w:tcMar>
-              <w:top w:type="dxa" w:w="60"/>
-              <w:left w:type="dxa" w:w="100"/>
-              <w:bottom w:type="dxa" w:w="60"/>
-              <w:right w:type="dxa" w:w="100"/>
-            </w:tcMar>
-          </w:tcPr>
-          <w:p>
-            <w:pPr>
-              <w:spacing w:after="0" w:line="260"/>
-              <w:jc w:val="left"/>
-            </w:pPr>
-            <w:r>
-              <w:rPr>
-                <w:rFonts w:ascii="Calibri" w:cs="Calibri" w:eastAsia="Calibri" w:hAnsi="Calibri"/>
-                <w:b w:val="false"/>
-                <w:bCs w:val="false"/>
-                <w:color w:val="000000"/>
-                <w:sz w:val="19"/>
-                <w:szCs w:val="19"/>
-              </w:rPr>
-              <w:t xml:space="preserve">5b3cb36</w:t>
-            </w:r>
-          </w:p>
-        </w:tc>
-        <w:tc>
-          <w:tcPr>
-            <w:tcW w:type="dxa" w:w="1404"/>
-            <w:tcMar>
-              <w:top w:type="dxa" w:w="60"/>
-              <w:left w:type="dxa" w:w="100"/>
-              <w:bottom w:type="dxa" w:w="60"/>
-              <w:right w:type="dxa" w:w="100"/>
-            </w:tcMar>
-          </w:tcPr>
-          <w:p>
-            <w:pPr>
-              <w:spacing w:after="0" w:line="260"/>
-              <w:jc w:val="left"/>
-            </w:pPr>
-            <w:r>
-              <w:rPr>
-                <w:rFonts w:ascii="Calibri" w:cs="Calibri" w:eastAsia="Calibri" w:hAnsi="Calibri"/>
-                <w:b w:val="false"/>
-                <w:bCs w:val="false"/>
-                <w:color w:val="000000"/>
-                <w:sz w:val="19"/>
-                <w:szCs w:val="19"/>
-              </w:rPr>
-              <w:t xml:space="preserve">2026-09-08</w:t>
-            </w:r>
-          </w:p>
-        </w:tc>
-        <w:tc>
-          <w:tcPr>
-            <w:tcW w:type="dxa" w:w="6833"/>
-            <w:tcMar>
-              <w:top w:type="dxa" w:w="60"/>
-              <w:left w:type="dxa" w:w="100"/>
-              <w:bottom w:type="dxa" w:w="60"/>
-              <w:right w:type="dxa" w:w="100"/>
-            </w:tcMar>
-          </w:tcPr>
-          <w:p>
-            <w:pPr>
-              <w:spacing w:after="0" w:line="260"/>
-              <w:jc w:val="left"/>
-            </w:pPr>
-            <w:r>
-              <w:rPr>
-                <w:rFonts w:ascii="Calibri" w:cs="Calibri" w:eastAsia="Calibri" w:hAnsi="Calibri"/>
-                <w:b w:val="false"/>
-                <w:bCs w:val="false"/>
-                <w:color w:val="000000"/>
-                <w:sz w:val="19"/>
-                <w:szCs w:val="19"/>
-              </w:rPr>
-              <w:t xml:space="preserve">docs(f1): notebook de definicion del proyecto y entorno reproducible</w:t>
             </w:r>
           </w:p>
         </w:tc>
@@ -8604,7 +8307,7 @@
                 <w:sz w:val="19"/>
                 <w:szCs w:val="19"/>
               </w:rPr>
-              <w:t xml:space="preserve">cbd0486</w:t>
+              <w:t xml:space="preserve">5b3cb36</w:t>
             </w:r>
           </w:p>
         </w:tc>
@@ -8662,93 +8365,93 @@
                 <w:sz w:val="19"/>
                 <w:szCs w:val="19"/>
               </w:rPr>
+              <w:t xml:space="preserve">docs(f1): notebook de definicion del proyecto y entorno reproducible</w:t>
+            </w:r>
+          </w:p>
+        </w:tc>
+      </w:tr>
+      <w:tr>
+        <w:tc>
+          <w:tcPr>
+            <w:tcW w:type="dxa" w:w="1123"/>
+            <w:tcMar>
+              <w:top w:type="dxa" w:w="60"/>
+              <w:left w:type="dxa" w:w="100"/>
+              <w:bottom w:type="dxa" w:w="60"/>
+              <w:right w:type="dxa" w:w="100"/>
+            </w:tcMar>
+          </w:tcPr>
+          <w:p>
+            <w:pPr>
+              <w:spacing w:after="0" w:line="260"/>
+              <w:jc w:val="left"/>
+            </w:pPr>
+            <w:r>
+              <w:rPr>
+                <w:rFonts w:ascii="Calibri" w:cs="Calibri" w:eastAsia="Calibri" w:hAnsi="Calibri"/>
+                <w:b w:val="false"/>
+                <w:bCs w:val="false"/>
+                <w:color w:val="000000"/>
+                <w:sz w:val="19"/>
+                <w:szCs w:val="19"/>
+              </w:rPr>
+              <w:t xml:space="preserve">cbd0486</w:t>
+            </w:r>
+          </w:p>
+        </w:tc>
+        <w:tc>
+          <w:tcPr>
+            <w:tcW w:type="dxa" w:w="1404"/>
+            <w:tcMar>
+              <w:top w:type="dxa" w:w="60"/>
+              <w:left w:type="dxa" w:w="100"/>
+              <w:bottom w:type="dxa" w:w="60"/>
+              <w:right w:type="dxa" w:w="100"/>
+            </w:tcMar>
+          </w:tcPr>
+          <w:p>
+            <w:pPr>
+              <w:spacing w:after="0" w:line="260"/>
+              <w:jc w:val="left"/>
+            </w:pPr>
+            <w:r>
+              <w:rPr>
+                <w:rFonts w:ascii="Calibri" w:cs="Calibri" w:eastAsia="Calibri" w:hAnsi="Calibri"/>
+                <w:b w:val="false"/>
+                <w:bCs w:val="false"/>
+                <w:color w:val="000000"/>
+                <w:sz w:val="19"/>
+                <w:szCs w:val="19"/>
+              </w:rPr>
+              <w:t xml:space="preserve">2026-09-08</w:t>
+            </w:r>
+          </w:p>
+        </w:tc>
+        <w:tc>
+          <w:tcPr>
+            <w:tcW w:type="dxa" w:w="6833"/>
+            <w:tcMar>
+              <w:top w:type="dxa" w:w="60"/>
+              <w:left w:type="dxa" w:w="100"/>
+              <w:bottom w:type="dxa" w:w="60"/>
+              <w:right w:type="dxa" w:w="100"/>
+            </w:tcMar>
+          </w:tcPr>
+          <w:p>
+            <w:pPr>
+              <w:spacing w:after="0" w:line="260"/>
+              <w:jc w:val="left"/>
+            </w:pPr>
+            <w:r>
+              <w:rPr>
+                <w:rFonts w:ascii="Calibri" w:cs="Calibri" w:eastAsia="Calibri" w:hAnsi="Calibri"/>
+                <w:b w:val="false"/>
+                <w:bCs w:val="false"/>
+                <w:color w:val="000000"/>
+                <w:sz w:val="19"/>
+                <w:szCs w:val="19"/>
+              </w:rPr>
               <w:t xml:space="preserve">feat(viz,pipeline): estilo unificado de figuras y orquestador ejecutable</w:t>
-            </w:r>
-          </w:p>
-        </w:tc>
-      </w:tr>
-      <w:tr>
-        <w:tc>
-          <w:tcPr>
-            <w:tcW w:type="dxa" w:w="1123"/>
-            <w:tcMar>
-              <w:top w:type="dxa" w:w="60"/>
-              <w:left w:type="dxa" w:w="100"/>
-              <w:bottom w:type="dxa" w:w="60"/>
-              <w:right w:type="dxa" w:w="100"/>
-            </w:tcMar>
-          </w:tcPr>
-          <w:p>
-            <w:pPr>
-              <w:spacing w:after="0" w:line="260"/>
-              <w:jc w:val="left"/>
-            </w:pPr>
-            <w:r>
-              <w:rPr>
-                <w:rFonts w:ascii="Calibri" w:cs="Calibri" w:eastAsia="Calibri" w:hAnsi="Calibri"/>
-                <w:b w:val="false"/>
-                <w:bCs w:val="false"/>
-                <w:color w:val="000000"/>
-                <w:sz w:val="19"/>
-                <w:szCs w:val="19"/>
-              </w:rPr>
-              <w:t xml:space="preserve">34bac9d</w:t>
-            </w:r>
-          </w:p>
-        </w:tc>
-        <w:tc>
-          <w:tcPr>
-            <w:tcW w:type="dxa" w:w="1404"/>
-            <w:tcMar>
-              <w:top w:type="dxa" w:w="60"/>
-              <w:left w:type="dxa" w:w="100"/>
-              <w:bottom w:type="dxa" w:w="60"/>
-              <w:right w:type="dxa" w:w="100"/>
-            </w:tcMar>
-          </w:tcPr>
-          <w:p>
-            <w:pPr>
-              <w:spacing w:after="0" w:line="260"/>
-              <w:jc w:val="left"/>
-            </w:pPr>
-            <w:r>
-              <w:rPr>
-                <w:rFonts w:ascii="Calibri" w:cs="Calibri" w:eastAsia="Calibri" w:hAnsi="Calibri"/>
-                <w:b w:val="false"/>
-                <w:bCs w:val="false"/>
-                <w:color w:val="000000"/>
-                <w:sz w:val="19"/>
-                <w:szCs w:val="19"/>
-              </w:rPr>
-              <w:t xml:space="preserve">2026-09-08</w:t>
-            </w:r>
-          </w:p>
-        </w:tc>
-        <w:tc>
-          <w:tcPr>
-            <w:tcW w:type="dxa" w:w="6833"/>
-            <w:tcMar>
-              <w:top w:type="dxa" w:w="60"/>
-              <w:left w:type="dxa" w:w="100"/>
-              <w:bottom w:type="dxa" w:w="60"/>
-              <w:right w:type="dxa" w:w="100"/>
-            </w:tcMar>
-          </w:tcPr>
-          <w:p>
-            <w:pPr>
-              <w:spacing w:after="0" w:line="260"/>
-              <w:jc w:val="left"/>
-            </w:pPr>
-            <w:r>
-              <w:rPr>
-                <w:rFonts w:ascii="Calibri" w:cs="Calibri" w:eastAsia="Calibri" w:hAnsi="Calibri"/>
-                <w:b w:val="false"/>
-                <w:bCs w:val="false"/>
-                <w:color w:val="000000"/>
-                <w:sz w:val="19"/>
-                <w:szCs w:val="19"/>
-              </w:rPr>
-              <w:t xml:space="preserve">test: cubre casos normales, limite y excepciones del pipeline</w:t>
             </w:r>
           </w:p>
         </w:tc>
@@ -8779,7 +8482,7 @@
                 <w:sz w:val="19"/>
                 <w:szCs w:val="19"/>
               </w:rPr>
-              <w:t xml:space="preserve">36126c1</w:t>
+              <w:t xml:space="preserve">34bac9d</w:t>
             </w:r>
           </w:p>
         </w:tc>
@@ -8837,93 +8540,93 @@
                 <w:sz w:val="19"/>
                 <w:szCs w:val="19"/>
               </w:rPr>
+              <w:t xml:space="preserve">test: cubre casos normales, limite y excepciones del pipeline</w:t>
+            </w:r>
+          </w:p>
+        </w:tc>
+      </w:tr>
+      <w:tr>
+        <w:tc>
+          <w:tcPr>
+            <w:tcW w:type="dxa" w:w="1123"/>
+            <w:tcMar>
+              <w:top w:type="dxa" w:w="60"/>
+              <w:left w:type="dxa" w:w="100"/>
+              <w:bottom w:type="dxa" w:w="60"/>
+              <w:right w:type="dxa" w:w="100"/>
+            </w:tcMar>
+          </w:tcPr>
+          <w:p>
+            <w:pPr>
+              <w:spacing w:after="0" w:line="260"/>
+              <w:jc w:val="left"/>
+            </w:pPr>
+            <w:r>
+              <w:rPr>
+                <w:rFonts w:ascii="Calibri" w:cs="Calibri" w:eastAsia="Calibri" w:hAnsi="Calibri"/>
+                <w:b w:val="false"/>
+                <w:bCs w:val="false"/>
+                <w:color w:val="000000"/>
+                <w:sz w:val="19"/>
+                <w:szCs w:val="19"/>
+              </w:rPr>
+              <w:t xml:space="preserve">36126c1</w:t>
+            </w:r>
+          </w:p>
+        </w:tc>
+        <w:tc>
+          <w:tcPr>
+            <w:tcW w:type="dxa" w:w="1404"/>
+            <w:tcMar>
+              <w:top w:type="dxa" w:w="60"/>
+              <w:left w:type="dxa" w:w="100"/>
+              <w:bottom w:type="dxa" w:w="60"/>
+              <w:right w:type="dxa" w:w="100"/>
+            </w:tcMar>
+          </w:tcPr>
+          <w:p>
+            <w:pPr>
+              <w:spacing w:after="0" w:line="260"/>
+              <w:jc w:val="left"/>
+            </w:pPr>
+            <w:r>
+              <w:rPr>
+                <w:rFonts w:ascii="Calibri" w:cs="Calibri" w:eastAsia="Calibri" w:hAnsi="Calibri"/>
+                <w:b w:val="false"/>
+                <w:bCs w:val="false"/>
+                <w:color w:val="000000"/>
+                <w:sz w:val="19"/>
+                <w:szCs w:val="19"/>
+              </w:rPr>
+              <w:t xml:space="preserve">2026-09-08</w:t>
+            </w:r>
+          </w:p>
+        </w:tc>
+        <w:tc>
+          <w:tcPr>
+            <w:tcW w:type="dxa" w:w="6833"/>
+            <w:tcMar>
+              <w:top w:type="dxa" w:w="60"/>
+              <w:left w:type="dxa" w:w="100"/>
+              <w:bottom w:type="dxa" w:w="60"/>
+              <w:right w:type="dxa" w:w="100"/>
+            </w:tcMar>
+          </w:tcPr>
+          <w:p>
+            <w:pPr>
+              <w:spacing w:after="0" w:line="260"/>
+              <w:jc w:val="left"/>
+            </w:pPr>
+            <w:r>
+              <w:rPr>
+                <w:rFonts w:ascii="Calibri" w:cs="Calibri" w:eastAsia="Calibri" w:hAnsi="Calibri"/>
+                <w:b w:val="false"/>
+                <w:bCs w:val="false"/>
+                <w:color w:val="000000"/>
+                <w:sz w:val="19"/>
+                <w:szCs w:val="19"/>
+              </w:rPr>
               <w:t xml:space="preserve">feat(validacion): motor de reglas orientado a objetos</w:t>
-            </w:r>
-          </w:p>
-        </w:tc>
-      </w:tr>
-      <w:tr>
-        <w:tc>
-          <w:tcPr>
-            <w:tcW w:type="dxa" w:w="1123"/>
-            <w:tcMar>
-              <w:top w:type="dxa" w:w="60"/>
-              <w:left w:type="dxa" w:w="100"/>
-              <w:bottom w:type="dxa" w:w="60"/>
-              <w:right w:type="dxa" w:w="100"/>
-            </w:tcMar>
-          </w:tcPr>
-          <w:p>
-            <w:pPr>
-              <w:spacing w:after="0" w:line="260"/>
-              <w:jc w:val="left"/>
-            </w:pPr>
-            <w:r>
-              <w:rPr>
-                <w:rFonts w:ascii="Calibri" w:cs="Calibri" w:eastAsia="Calibri" w:hAnsi="Calibri"/>
-                <w:b w:val="false"/>
-                <w:bCs w:val="false"/>
-                <w:color w:val="000000"/>
-                <w:sz w:val="19"/>
-                <w:szCs w:val="19"/>
-              </w:rPr>
-              <w:t xml:space="preserve">ffa9c2e</w:t>
-            </w:r>
-          </w:p>
-        </w:tc>
-        <w:tc>
-          <w:tcPr>
-            <w:tcW w:type="dxa" w:w="1404"/>
-            <w:tcMar>
-              <w:top w:type="dxa" w:w="60"/>
-              <w:left w:type="dxa" w:w="100"/>
-              <w:bottom w:type="dxa" w:w="60"/>
-              <w:right w:type="dxa" w:w="100"/>
-            </w:tcMar>
-          </w:tcPr>
-          <w:p>
-            <w:pPr>
-              <w:spacing w:after="0" w:line="260"/>
-              <w:jc w:val="left"/>
-            </w:pPr>
-            <w:r>
-              <w:rPr>
-                <w:rFonts w:ascii="Calibri" w:cs="Calibri" w:eastAsia="Calibri" w:hAnsi="Calibri"/>
-                <w:b w:val="false"/>
-                <w:bCs w:val="false"/>
-                <w:color w:val="000000"/>
-                <w:sz w:val="19"/>
-                <w:szCs w:val="19"/>
-              </w:rPr>
-              <w:t xml:space="preserve">2026-09-08</w:t>
-            </w:r>
-          </w:p>
-        </w:tc>
-        <w:tc>
-          <w:tcPr>
-            <w:tcW w:type="dxa" w:w="6833"/>
-            <w:tcMar>
-              <w:top w:type="dxa" w:w="60"/>
-              <w:left w:type="dxa" w:w="100"/>
-              <w:bottom w:type="dxa" w:w="60"/>
-              <w:right w:type="dxa" w:w="100"/>
-            </w:tcMar>
-          </w:tcPr>
-          <w:p>
-            <w:pPr>
-              <w:spacing w:after="0" w:line="260"/>
-              <w:jc w:val="left"/>
-            </w:pPr>
-            <w:r>
-              <w:rPr>
-                <w:rFonts w:ascii="Calibri" w:cs="Calibri" w:eastAsia="Calibri" w:hAnsi="Calibri"/>
-                <w:b w:val="false"/>
-                <w:bCs w:val="false"/>
-                <w:color w:val="000000"/>
-                <w:sz w:val="19"/>
-                <w:szCs w:val="19"/>
-              </w:rPr>
-              <w:t xml:space="preserve">feat(transformacion): reconstruye la duracion real y la sobreduracion</w:t>
             </w:r>
           </w:p>
         </w:tc>
@@ -8954,7 +8657,7 @@
                 <w:sz w:val="19"/>
                 <w:szCs w:val="19"/>
               </w:rPr>
-              <w:t xml:space="preserve">61dd691</w:t>
+              <w:t xml:space="preserve">ffa9c2e</w:t>
             </w:r>
           </w:p>
         </w:tc>
@@ -9012,93 +8715,93 @@
                 <w:sz w:val="19"/>
                 <w:szCs w:val="19"/>
               </w:rPr>
+              <w:t xml:space="preserve">feat(transformacion): reconstruye la duracion real y la sobreduracion</w:t>
+            </w:r>
+          </w:p>
+        </w:tc>
+      </w:tr>
+      <w:tr>
+        <w:tc>
+          <w:tcPr>
+            <w:tcW w:type="dxa" w:w="1123"/>
+            <w:tcMar>
+              <w:top w:type="dxa" w:w="60"/>
+              <w:left w:type="dxa" w:w="100"/>
+              <w:bottom w:type="dxa" w:w="60"/>
+              <w:right w:type="dxa" w:w="100"/>
+            </w:tcMar>
+          </w:tcPr>
+          <w:p>
+            <w:pPr>
+              <w:spacing w:after="0" w:line="260"/>
+              <w:jc w:val="left"/>
+            </w:pPr>
+            <w:r>
+              <w:rPr>
+                <w:rFonts w:ascii="Calibri" w:cs="Calibri" w:eastAsia="Calibri" w:hAnsi="Calibri"/>
+                <w:b w:val="false"/>
+                <w:bCs w:val="false"/>
+                <w:color w:val="000000"/>
+                <w:sz w:val="19"/>
+                <w:szCs w:val="19"/>
+              </w:rPr>
+              <w:t xml:space="preserve">61dd691</w:t>
+            </w:r>
+          </w:p>
+        </w:tc>
+        <w:tc>
+          <w:tcPr>
+            <w:tcW w:type="dxa" w:w="1404"/>
+            <w:tcMar>
+              <w:top w:type="dxa" w:w="60"/>
+              <w:left w:type="dxa" w:w="100"/>
+              <w:bottom w:type="dxa" w:w="60"/>
+              <w:right w:type="dxa" w:w="100"/>
+            </w:tcMar>
+          </w:tcPr>
+          <w:p>
+            <w:pPr>
+              <w:spacing w:after="0" w:line="260"/>
+              <w:jc w:val="left"/>
+            </w:pPr>
+            <w:r>
+              <w:rPr>
+                <w:rFonts w:ascii="Calibri" w:cs="Calibri" w:eastAsia="Calibri" w:hAnsi="Calibri"/>
+                <w:b w:val="false"/>
+                <w:bCs w:val="false"/>
+                <w:color w:val="000000"/>
+                <w:sz w:val="19"/>
+                <w:szCs w:val="19"/>
+              </w:rPr>
+              <w:t xml:space="preserve">2026-09-08</w:t>
+            </w:r>
+          </w:p>
+        </w:tc>
+        <w:tc>
+          <w:tcPr>
+            <w:tcW w:type="dxa" w:w="6833"/>
+            <w:tcMar>
+              <w:top w:type="dxa" w:w="60"/>
+              <w:left w:type="dxa" w:w="100"/>
+              <w:bottom w:type="dxa" w:w="60"/>
+              <w:right w:type="dxa" w:w="100"/>
+            </w:tcMar>
+          </w:tcPr>
+          <w:p>
+            <w:pPr>
+              <w:spacing w:after="0" w:line="260"/>
+              <w:jc w:val="left"/>
+            </w:pPr>
+            <w:r>
+              <w:rPr>
+                <w:rFonts w:ascii="Calibri" w:cs="Calibri" w:eastAsia="Calibri" w:hAnsi="Calibri"/>
+                <w:b w:val="false"/>
+                <w:bCs w:val="false"/>
+                <w:color w:val="000000"/>
+                <w:sz w:val="19"/>
+                <w:szCs w:val="19"/>
+              </w:rPr>
               <w:t xml:space="preserve">feat(limpieza): convierte codigos centinela del SIES en nulos explicitos</w:t>
-            </w:r>
-          </w:p>
-        </w:tc>
-      </w:tr>
-      <w:tr>
-        <w:tc>
-          <w:tcPr>
-            <w:tcW w:type="dxa" w:w="1123"/>
-            <w:tcMar>
-              <w:top w:type="dxa" w:w="60"/>
-              <w:left w:type="dxa" w:w="100"/>
-              <w:bottom w:type="dxa" w:w="60"/>
-              <w:right w:type="dxa" w:w="100"/>
-            </w:tcMar>
-          </w:tcPr>
-          <w:p>
-            <w:pPr>
-              <w:spacing w:after="0" w:line="260"/>
-              <w:jc w:val="left"/>
-            </w:pPr>
-            <w:r>
-              <w:rPr>
-                <w:rFonts w:ascii="Calibri" w:cs="Calibri" w:eastAsia="Calibri" w:hAnsi="Calibri"/>
-                <w:b w:val="false"/>
-                <w:bCs w:val="false"/>
-                <w:color w:val="000000"/>
-                <w:sz w:val="19"/>
-                <w:szCs w:val="19"/>
-              </w:rPr>
-              <w:t xml:space="preserve">f57dfd9</w:t>
-            </w:r>
-          </w:p>
-        </w:tc>
-        <w:tc>
-          <w:tcPr>
-            <w:tcW w:type="dxa" w:w="1404"/>
-            <w:tcMar>
-              <w:top w:type="dxa" w:w="60"/>
-              <w:left w:type="dxa" w:w="100"/>
-              <w:bottom w:type="dxa" w:w="60"/>
-              <w:right w:type="dxa" w:w="100"/>
-            </w:tcMar>
-          </w:tcPr>
-          <w:p>
-            <w:pPr>
-              <w:spacing w:after="0" w:line="260"/>
-              <w:jc w:val="left"/>
-            </w:pPr>
-            <w:r>
-              <w:rPr>
-                <w:rFonts w:ascii="Calibri" w:cs="Calibri" w:eastAsia="Calibri" w:hAnsi="Calibri"/>
-                <w:b w:val="false"/>
-                <w:bCs w:val="false"/>
-                <w:color w:val="000000"/>
-                <w:sz w:val="19"/>
-                <w:szCs w:val="19"/>
-              </w:rPr>
-              <w:t xml:space="preserve">2026-09-08</w:t>
-            </w:r>
-          </w:p>
-        </w:tc>
-        <w:tc>
-          <w:tcPr>
-            <w:tcW w:type="dxa" w:w="6833"/>
-            <w:tcMar>
-              <w:top w:type="dxa" w:w="60"/>
-              <w:left w:type="dxa" w:w="100"/>
-              <w:bottom w:type="dxa" w:w="60"/>
-              <w:right w:type="dxa" w:w="100"/>
-            </w:tcMar>
-          </w:tcPr>
-          <w:p>
-            <w:pPr>
-              <w:spacing w:after="0" w:line="260"/>
-              <w:jc w:val="left"/>
-            </w:pPr>
-            <w:r>
-              <w:rPr>
-                <w:rFonts w:ascii="Calibri" w:cs="Calibri" w:eastAsia="Calibri" w:hAnsi="Calibri"/>
-                <w:b w:val="false"/>
-                <w:bCs w:val="false"/>
-                <w:color w:val="000000"/>
-                <w:sz w:val="19"/>
-                <w:szCs w:val="19"/>
-              </w:rPr>
-              <w:t xml:space="preserve">feat(ingesta): consolida los seis anios con lectura por bloques</w:t>
             </w:r>
           </w:p>
         </w:tc>
@@ -9129,7 +8832,7 @@
                 <w:sz w:val="19"/>
                 <w:szCs w:val="19"/>
               </w:rPr>
-              <w:t xml:space="preserve">522dbb3</w:t>
+              <w:t xml:space="preserve">f57dfd9</w:t>
             </w:r>
           </w:p>
         </w:tc>
@@ -9187,6 +8890,92 @@
                 <w:sz w:val="19"/>
                 <w:szCs w:val="19"/>
               </w:rPr>
+              <w:t xml:space="preserve">feat(ingesta): consolida los seis anios con lectura por bloques</w:t>
+            </w:r>
+          </w:p>
+        </w:tc>
+      </w:tr>
+      <w:tr>
+        <w:tc>
+          <w:tcPr>
+            <w:tcW w:type="dxa" w:w="1123"/>
+            <w:tcMar>
+              <w:top w:type="dxa" w:w="60"/>
+              <w:left w:type="dxa" w:w="100"/>
+              <w:bottom w:type="dxa" w:w="60"/>
+              <w:right w:type="dxa" w:w="100"/>
+            </w:tcMar>
+          </w:tcPr>
+          <w:p>
+            <w:pPr>
+              <w:spacing w:after="0" w:line="260"/>
+              <w:jc w:val="left"/>
+            </w:pPr>
+            <w:r>
+              <w:rPr>
+                <w:rFonts w:ascii="Calibri" w:cs="Calibri" w:eastAsia="Calibri" w:hAnsi="Calibri"/>
+                <w:b w:val="false"/>
+                <w:bCs w:val="false"/>
+                <w:color w:val="000000"/>
+                <w:sz w:val="19"/>
+                <w:szCs w:val="19"/>
+              </w:rPr>
+              <w:t xml:space="preserve">522dbb3</w:t>
+            </w:r>
+          </w:p>
+        </w:tc>
+        <w:tc>
+          <w:tcPr>
+            <w:tcW w:type="dxa" w:w="1404"/>
+            <w:tcMar>
+              <w:top w:type="dxa" w:w="60"/>
+              <w:left w:type="dxa" w:w="100"/>
+              <w:bottom w:type="dxa" w:w="60"/>
+              <w:right w:type="dxa" w:w="100"/>
+            </w:tcMar>
+          </w:tcPr>
+          <w:p>
+            <w:pPr>
+              <w:spacing w:after="0" w:line="260"/>
+              <w:jc w:val="left"/>
+            </w:pPr>
+            <w:r>
+              <w:rPr>
+                <w:rFonts w:ascii="Calibri" w:cs="Calibri" w:eastAsia="Calibri" w:hAnsi="Calibri"/>
+                <w:b w:val="false"/>
+                <w:bCs w:val="false"/>
+                <w:color w:val="000000"/>
+                <w:sz w:val="19"/>
+                <w:szCs w:val="19"/>
+              </w:rPr>
+              <w:t xml:space="preserve">2026-09-08</w:t>
+            </w:r>
+          </w:p>
+        </w:tc>
+        <w:tc>
+          <w:tcPr>
+            <w:tcW w:type="dxa" w:w="6833"/>
+            <w:tcMar>
+              <w:top w:type="dxa" w:w="60"/>
+              <w:left w:type="dxa" w:w="100"/>
+              <w:bottom w:type="dxa" w:w="60"/>
+              <w:right w:type="dxa" w:w="100"/>
+            </w:tcMar>
+          </w:tcPr>
+          <w:p>
+            <w:pPr>
+              <w:spacing w:after="0" w:line="260"/>
+              <w:jc w:val="left"/>
+            </w:pPr>
+            <w:r>
+              <w:rPr>
+                <w:rFonts w:ascii="Calibri" w:cs="Calibri" w:eastAsia="Calibri" w:hAnsi="Calibri"/>
+                <w:b w:val="false"/>
+                <w:bCs w:val="false"/>
+                <w:color w:val="000000"/>
+                <w:sz w:val="19"/>
+                <w:szCs w:val="19"/>
+              </w:rPr>
               <w:t xml:space="preserve">feat(config): centraliza rutas, esquema de datos y parametros</w:t>
             </w:r>
           </w:p>
@@ -9196,6 +8985,7 @@
         <w:tc>
           <w:tcPr>
             <w:tcW w:type="dxa" w:w="1123"/>
+            <w:shd w:fill="F2F5F8" w:val="clear"/>
             <w:tcMar>
               <w:top w:type="dxa" w:w="60"/>
               <w:left w:type="dxa" w:w="100"/>
@@ -9224,6 +9014,7 @@
         <w:tc>
           <w:tcPr>
             <w:tcW w:type="dxa" w:w="1404"/>
+            <w:shd w:fill="F2F5F8" w:val="clear"/>
             <w:tcMar>
               <w:top w:type="dxa" w:w="60"/>
               <w:left w:type="dxa" w:w="100"/>
@@ -9252,6 +9043,7 @@
         <w:tc>
           <w:tcPr>
             <w:tcW w:type="dxa" w:w="6833"/>
+            <w:shd w:fill="F2F5F8" w:val="clear"/>
             <w:tcMar>
               <w:top w:type="dxa" w:w="60"/>
               <w:left w:type="dxa" w:w="100"/>
@@ -9362,8 +9154,8 @@
             <w:r>
               <w:rPr>
                 <w:rFonts w:ascii="Consolas" w:cs="Consolas" w:eastAsia="Consolas" w:hAnsi="Consolas"/>
-                <w:sz w:val="17"/>
-                <w:szCs w:val="17"/>
+                <w:sz w:val="16"/>
+                <w:szCs w:val="16"/>
               </w:rPr>
               <w:t xml:space="preserve">*   43035f5 merge: integra la rama fase-2/pipeline-datos en main</w:t>
             </w:r>
@@ -9389,8 +9181,8 @@
             <w:r>
               <w:rPr>
                 <w:rFonts w:ascii="Consolas" w:cs="Consolas" w:eastAsia="Consolas" w:hAnsi="Consolas"/>
-                <w:sz w:val="17"/>
-                <w:szCs w:val="17"/>
+                <w:sz w:val="16"/>
+                <w:szCs w:val="16"/>
               </w:rPr>
               <w:t xml:space="preserve">|\</w:t>
             </w:r>
@@ -9416,8 +9208,8 @@
             <w:r>
               <w:rPr>
                 <w:rFonts w:ascii="Consolas" w:cs="Consolas" w:eastAsia="Consolas" w:hAnsi="Consolas"/>
-                <w:sz w:val="17"/>
-                <w:szCs w:val="17"/>
+                <w:sz w:val="16"/>
+                <w:szCs w:val="16"/>
               </w:rPr>
               <w:t xml:space="preserve">| * 179960e docs(f2): ejecuta los notebooks y versiona figuras, tablas y muestra</w:t>
             </w:r>
@@ -9443,8 +9235,8 @@
             <w:r>
               <w:rPr>
                 <w:rFonts w:ascii="Consolas" w:cs="Consolas" w:eastAsia="Consolas" w:hAnsi="Consolas"/>
-                <w:sz w:val="17"/>
-                <w:szCs w:val="17"/>
+                <w:sz w:val="16"/>
+                <w:szCs w:val="16"/>
               </w:rPr>
               <w:t xml:space="preserve">| * a95bdd3 perf(limpieza): normaliza el catalogo de categorias en vez de fila por fila</w:t>
             </w:r>
@@ -9470,8 +9262,8 @@
             <w:r>
               <w:rPr>
                 <w:rFonts w:ascii="Consolas" w:cs="Consolas" w:eastAsia="Consolas" w:hAnsi="Consolas"/>
-                <w:sz w:val="17"/>
-                <w:szCs w:val="17"/>
+                <w:sz w:val="16"/>
+                <w:szCs w:val="16"/>
               </w:rPr>
               <w:t xml:space="preserve">| * daf70dd fix(viz,transformacion): compatibilidad con los tipos anulables de pandas</w:t>
             </w:r>
@@ -9497,8 +9289,8 @@
             <w:r>
               <w:rPr>
                 <w:rFonts w:ascii="Consolas" w:cs="Consolas" w:eastAsia="Consolas" w:hAnsi="Consolas"/>
-                <w:sz w:val="17"/>
-                <w:szCs w:val="17"/>
+                <w:sz w:val="16"/>
+                <w:szCs w:val="16"/>
               </w:rPr>
               <w:t xml:space="preserve">| * 1b4b202 docs(f2): notebooks de obtencion, limpieza, transformacion y validacion</w:t>
             </w:r>
@@ -9524,8 +9316,8 @@
             <w:r>
               <w:rPr>
                 <w:rFonts w:ascii="Consolas" w:cs="Consolas" w:eastAsia="Consolas" w:hAnsi="Consolas"/>
-                <w:sz w:val="17"/>
-                <w:szCs w:val="17"/>
+                <w:sz w:val="16"/>
+                <w:szCs w:val="16"/>
               </w:rPr>
               <w:t xml:space="preserve">|/</w:t>
             </w:r>
@@ -9551,8 +9343,8 @@
             <w:r>
               <w:rPr>
                 <w:rFonts w:ascii="Consolas" w:cs="Consolas" w:eastAsia="Consolas" w:hAnsi="Consolas"/>
-                <w:sz w:val="17"/>
-                <w:szCs w:val="17"/>
+                <w:sz w:val="16"/>
+                <w:szCs w:val="16"/>
               </w:rPr>
               <w:t xml:space="preserve">* 5b3cb36 docs(f1): notebook de definicion del proyecto y entorno reproducible</w:t>
             </w:r>
@@ -9649,8 +9441,8 @@
             <w:r>
               <w:rPr>
                 <w:rFonts w:ascii="Consolas" w:cs="Consolas" w:eastAsia="Consolas" w:hAnsi="Consolas"/>
-                <w:sz w:val="17"/>
-                <w:szCs w:val="17"/>
+                <w:sz w:val="16"/>
+                <w:szCs w:val="16"/>
               </w:rPr>
               <w:t xml:space="preserve">git config user.name "Nombre Apellido"</w:t>
             </w:r>
@@ -9676,8 +9468,8 @@
             <w:r>
               <w:rPr>
                 <w:rFonts w:ascii="Consolas" w:cs="Consolas" w:eastAsia="Consolas" w:hAnsi="Consolas"/>
-                <w:sz w:val="17"/>
-                <w:szCs w:val="17"/>
+                <w:sz w:val="16"/>
+                <w:szCs w:val="16"/>
               </w:rPr>
               <w:t xml:space="preserve">git config user.email "correo@institucion.cl"</w:t>
             </w:r>
@@ -9703,8 +9495,8 @@
             <w:r>
               <w:rPr>
                 <w:rFonts w:ascii="Consolas" w:cs="Consolas" w:eastAsia="Consolas" w:hAnsi="Consolas"/>
-                <w:sz w:val="17"/>
-                <w:szCs w:val="17"/>
+                <w:sz w:val="16"/>
+                <w:szCs w:val="16"/>
               </w:rPr>
               <w:t xml:space="preserve"> </w:t>
             </w:r>
@@ -9730,8 +9522,8 @@
             <w:r>
               <w:rPr>
                 <w:rFonts w:ascii="Consolas" w:cs="Consolas" w:eastAsia="Consolas" w:hAnsi="Consolas"/>
-                <w:sz w:val="17"/>
-                <w:szCs w:val="17"/>
+                <w:sz w:val="16"/>
+                <w:szCs w:val="16"/>
               </w:rPr>
               <w:t xml:space="preserve">git shortlog -sn --all      # contribuciones acumuladas por integrante</w:t>
             </w:r>
@@ -10869,8 +10661,8 @@
             <w:r>
               <w:rPr>
                 <w:rFonts w:ascii="Consolas" w:cs="Consolas" w:eastAsia="Consolas" w:hAnsi="Consolas"/>
-                <w:sz w:val="17"/>
-                <w:szCs w:val="17"/>
+                <w:sz w:val="16"/>
+                <w:szCs w:val="16"/>
               </w:rPr>
               <w:t xml:space="preserve">proyecto-titulados/</w:t>
             </w:r>
@@ -10896,8 +10688,8 @@
             <w:r>
               <w:rPr>
                 <w:rFonts w:ascii="Consolas" w:cs="Consolas" w:eastAsia="Consolas" w:hAnsi="Consolas"/>
-                <w:sz w:val="17"/>
-                <w:szCs w:val="17"/>
+                <w:sz w:val="16"/>
+                <w:szCs w:val="16"/>
               </w:rPr>
               <w:t xml:space="preserve">|-- F1/</w:t>
             </w:r>
@@ -10923,8 +10715,8 @@
             <w:r>
               <w:rPr>
                 <w:rFonts w:ascii="Consolas" w:cs="Consolas" w:eastAsia="Consolas" w:hAnsi="Consolas"/>
-                <w:sz w:val="17"/>
-                <w:szCs w:val="17"/>
+                <w:sz w:val="16"/>
+                <w:szCs w:val="16"/>
               </w:rPr>
               <w:t xml:space="preserve">|   \-- F1_Definición.ipynb                    Definición del problema y entorno</w:t>
             </w:r>
@@ -10950,8 +10742,8 @@
             <w:r>
               <w:rPr>
                 <w:rFonts w:ascii="Consolas" w:cs="Consolas" w:eastAsia="Consolas" w:hAnsi="Consolas"/>
-                <w:sz w:val="17"/>
-                <w:szCs w:val="17"/>
+                <w:sz w:val="16"/>
+                <w:szCs w:val="16"/>
               </w:rPr>
               <w:t xml:space="preserve">|-- F2/</w:t>
             </w:r>
@@ -10977,8 +10769,8 @@
             <w:r>
               <w:rPr>
                 <w:rFonts w:ascii="Consolas" w:cs="Consolas" w:eastAsia="Consolas" w:hAnsi="Consolas"/>
-                <w:sz w:val="17"/>
-                <w:szCs w:val="17"/>
+                <w:sz w:val="16"/>
+                <w:szCs w:val="16"/>
               </w:rPr>
               <w:t xml:space="preserve">|   |-- F2_1_Obtencion_Exploracion.ipynb       Consolidación y exploración (EDA)</w:t>
             </w:r>
@@ -11004,8 +10796,8 @@
             <w:r>
               <w:rPr>
                 <w:rFonts w:ascii="Consolas" w:cs="Consolas" w:eastAsia="Consolas" w:hAnsi="Consolas"/>
-                <w:sz w:val="17"/>
-                <w:szCs w:val="17"/>
+                <w:sz w:val="16"/>
+                <w:szCs w:val="16"/>
               </w:rPr>
               <w:t xml:space="preserve">|   |-- F2_2_Limpieza_Transformacion.ipynb     Depuración y variables derivadas</w:t>
             </w:r>
@@ -11031,8 +10823,8 @@
             <w:r>
               <w:rPr>
                 <w:rFonts w:ascii="Consolas" w:cs="Consolas" w:eastAsia="Consolas" w:hAnsi="Consolas"/>
-                <w:sz w:val="17"/>
-                <w:szCs w:val="17"/>
+                <w:sz w:val="16"/>
+                <w:szCs w:val="16"/>
               </w:rPr>
               <w:t xml:space="preserve">|   \-- F2_3_Validacion_Analisis.ipynb         Validación técnica y resultados</w:t>
             </w:r>
@@ -11058,8 +10850,8 @@
             <w:r>
               <w:rPr>
                 <w:rFonts w:ascii="Consolas" w:cs="Consolas" w:eastAsia="Consolas" w:hAnsi="Consolas"/>
-                <w:sz w:val="17"/>
-                <w:szCs w:val="17"/>
+                <w:sz w:val="16"/>
+                <w:szCs w:val="16"/>
               </w:rPr>
               <w:t xml:space="preserve">|-- src/                                       Paquete con los 7 módulos del pipeline</w:t>
             </w:r>
@@ -11085,8 +10877,8 @@
             <w:r>
               <w:rPr>
                 <w:rFonts w:ascii="Consolas" w:cs="Consolas" w:eastAsia="Consolas" w:hAnsi="Consolas"/>
-                <w:sz w:val="17"/>
-                <w:szCs w:val="17"/>
+                <w:sz w:val="16"/>
+                <w:szCs w:val="16"/>
               </w:rPr>
               <w:t xml:space="preserve">|-- tests/test_pipeline.py                     22 pruebas automatizadas</w:t>
             </w:r>
@@ -11112,8 +10904,8 @@
             <w:r>
               <w:rPr>
                 <w:rFonts w:ascii="Consolas" w:cs="Consolas" w:eastAsia="Consolas" w:hAnsi="Consolas"/>
-                <w:sz w:val="17"/>
-                <w:szCs w:val="17"/>
+                <w:sz w:val="16"/>
+                <w:szCs w:val="16"/>
               </w:rPr>
               <w:t xml:space="preserve">|-- data/</w:t>
             </w:r>
@@ -11139,8 +10931,8 @@
             <w:r>
               <w:rPr>
                 <w:rFonts w:ascii="Consolas" w:cs="Consolas" w:eastAsia="Consolas" w:hAnsi="Consolas"/>
-                <w:sz w:val="17"/>
-                <w:szCs w:val="17"/>
+                <w:sz w:val="16"/>
+                <w:szCs w:val="16"/>
               </w:rPr>
               <w:t xml:space="preserve">|   |-- raw/         CSV originales del SIES (no versionados: 955 MB)</w:t>
             </w:r>
@@ -11166,8 +10958,8 @@
             <w:r>
               <w:rPr>
                 <w:rFonts w:ascii="Consolas" w:cs="Consolas" w:eastAsia="Consolas" w:hAnsi="Consolas"/>
-                <w:sz w:val="17"/>
-                <w:szCs w:val="17"/>
+                <w:sz w:val="16"/>
+                <w:szCs w:val="16"/>
               </w:rPr>
               <w:t xml:space="preserve">|   |-- interim/     Consolidado en Parquet (no versionado)</w:t>
             </w:r>
@@ -11193,8 +10985,8 @@
             <w:r>
               <w:rPr>
                 <w:rFonts w:ascii="Consolas" w:cs="Consolas" w:eastAsia="Consolas" w:hAnsi="Consolas"/>
-                <w:sz w:val="17"/>
-                <w:szCs w:val="17"/>
+                <w:sz w:val="16"/>
+                <w:szCs w:val="16"/>
               </w:rPr>
               <w:t xml:space="preserve">|   \-- processed/   Conjunto analítico y muestra de 5.000 filas</w:t>
             </w:r>
@@ -11220,8 +11012,8 @@
             <w:r>
               <w:rPr>
                 <w:rFonts w:ascii="Consolas" w:cs="Consolas" w:eastAsia="Consolas" w:hAnsi="Consolas"/>
-                <w:sz w:val="17"/>
-                <w:szCs w:val="17"/>
+                <w:sz w:val="16"/>
+                <w:szCs w:val="16"/>
               </w:rPr>
               <w:t xml:space="preserve">|-- reports/</w:t>
             </w:r>
@@ -11247,8 +11039,8 @@
             <w:r>
               <w:rPr>
                 <w:rFonts w:ascii="Consolas" w:cs="Consolas" w:eastAsia="Consolas" w:hAnsi="Consolas"/>
-                <w:sz w:val="17"/>
-                <w:szCs w:val="17"/>
+                <w:sz w:val="16"/>
+                <w:szCs w:val="16"/>
               </w:rPr>
               <w:t xml:space="preserve">|   |-- figures/     17 figuras generadas por los notebooks</w:t>
             </w:r>
@@ -11274,8 +11066,8 @@
             <w:r>
               <w:rPr>
                 <w:rFonts w:ascii="Consolas" w:cs="Consolas" w:eastAsia="Consolas" w:hAnsi="Consolas"/>
-                <w:sz w:val="17"/>
-                <w:szCs w:val="17"/>
+                <w:sz w:val="16"/>
+                <w:szCs w:val="16"/>
               </w:rPr>
               <w:t xml:space="preserve">|   \-- tables/      13 tablas de resultados en CSV</w:t>
             </w:r>
@@ -11301,8 +11093,8 @@
             <w:r>
               <w:rPr>
                 <w:rFonts w:ascii="Consolas" w:cs="Consolas" w:eastAsia="Consolas" w:hAnsi="Consolas"/>
-                <w:sz w:val="17"/>
-                <w:szCs w:val="17"/>
+                <w:sz w:val="16"/>
+                <w:szCs w:val="16"/>
               </w:rPr>
               <w:t xml:space="preserve">|-- docs/            Esquema de registro oficial del SIES</w:t>
             </w:r>
@@ -11328,8 +11120,8 @@
             <w:r>
               <w:rPr>
                 <w:rFonts w:ascii="Consolas" w:cs="Consolas" w:eastAsia="Consolas" w:hAnsi="Consolas"/>
-                <w:sz w:val="17"/>
-                <w:szCs w:val="17"/>
+                <w:sz w:val="16"/>
+                <w:szCs w:val="16"/>
               </w:rPr>
               <w:t xml:space="preserve">|-- informe/         Informe técnico de las Fases 1 y 2</w:t>
             </w:r>
@@ -11355,8 +11147,8 @@
             <w:r>
               <w:rPr>
                 <w:rFonts w:ascii="Consolas" w:cs="Consolas" w:eastAsia="Consolas" w:hAnsi="Consolas"/>
-                <w:sz w:val="17"/>
-                <w:szCs w:val="17"/>
+                <w:sz w:val="16"/>
+                <w:szCs w:val="16"/>
               </w:rPr>
               <w:t xml:space="preserve">|-- requirements.txt</w:t>
             </w:r>
@@ -11382,8 +11174,8 @@
             <w:r>
               <w:rPr>
                 <w:rFonts w:ascii="Consolas" w:cs="Consolas" w:eastAsia="Consolas" w:hAnsi="Consolas"/>
-                <w:sz w:val="17"/>
-                <w:szCs w:val="17"/>
+                <w:sz w:val="16"/>
+                <w:szCs w:val="16"/>
               </w:rPr>
               <w:t xml:space="preserve">|-- .gitignore</w:t>
             </w:r>
@@ -11409,8 +11201,8 @@
             <w:r>
               <w:rPr>
                 <w:rFonts w:ascii="Consolas" w:cs="Consolas" w:eastAsia="Consolas" w:hAnsi="Consolas"/>
-                <w:sz w:val="17"/>
-                <w:szCs w:val="17"/>
+                <w:sz w:val="16"/>
+                <w:szCs w:val="16"/>
               </w:rPr>
               <w:t xml:space="preserve">\-- README.md</w:t>
             </w:r>
@@ -11588,8 +11380,8 @@
             <w:r>
               <w:rPr>
                 <w:rFonts w:ascii="Consolas" w:cs="Consolas" w:eastAsia="Consolas" w:hAnsi="Consolas"/>
-                <w:sz w:val="17"/>
-                <w:szCs w:val="17"/>
+                <w:sz w:val="16"/>
+                <w:szCs w:val="16"/>
               </w:rPr>
               <w:t xml:space="preserve">def leer_anio(ruta: Path, chunksize: int = 200_000) -&gt; tuple[pd.DataFrame, dict]:</w:t>
             </w:r>
@@ -11615,8 +11407,8 @@
             <w:r>
               <w:rPr>
                 <w:rFonts w:ascii="Consolas" w:cs="Consolas" w:eastAsia="Consolas" w:hAnsi="Consolas"/>
-                <w:sz w:val="17"/>
-                <w:szCs w:val="17"/>
+                <w:sz w:val="16"/>
+                <w:szCs w:val="16"/>
               </w:rPr>
               <w:t xml:space="preserve">    """Lee un CSV anual por bloques y devuelve el DataFrame y sus coerciones."""</w:t>
             </w:r>
@@ -11642,8 +11434,8 @@
             <w:r>
               <w:rPr>
                 <w:rFonts w:ascii="Consolas" w:cs="Consolas" w:eastAsia="Consolas" w:hAnsi="Consolas"/>
-                <w:sz w:val="17"/>
-                <w:szCs w:val="17"/>
+                <w:sz w:val="16"/>
+                <w:szCs w:val="16"/>
               </w:rPr>
               <w:t xml:space="preserve">    bloques: list[pd.DataFrame] = []</w:t>
             </w:r>
@@ -11669,8 +11461,8 @@
             <w:r>
               <w:rPr>
                 <w:rFonts w:ascii="Consolas" w:cs="Consolas" w:eastAsia="Consolas" w:hAnsi="Consolas"/>
-                <w:sz w:val="17"/>
-                <w:szCs w:val="17"/>
+                <w:sz w:val="16"/>
+                <w:szCs w:val="16"/>
               </w:rPr>
               <w:t xml:space="preserve">    coerciones_totales: dict[str, int] = {}</w:t>
             </w:r>
@@ -11696,8 +11488,8 @@
             <w:r>
               <w:rPr>
                 <w:rFonts w:ascii="Consolas" w:cs="Consolas" w:eastAsia="Consolas" w:hAnsi="Consolas"/>
-                <w:sz w:val="17"/>
-                <w:szCs w:val="17"/>
+                <w:sz w:val="16"/>
+                <w:szCs w:val="16"/>
               </w:rPr>
               <w:t xml:space="preserve"> </w:t>
             </w:r>
@@ -11723,8 +11515,8 @@
             <w:r>
               <w:rPr>
                 <w:rFonts w:ascii="Consolas" w:cs="Consolas" w:eastAsia="Consolas" w:hAnsi="Consolas"/>
-                <w:sz w:val="17"/>
-                <w:szCs w:val="17"/>
+                <w:sz w:val="16"/>
+                <w:szCs w:val="16"/>
               </w:rPr>
               <w:t xml:space="preserve">    lector = pd.read_csv(</w:t>
             </w:r>
@@ -11750,8 +11542,8 @@
             <w:r>
               <w:rPr>
                 <w:rFonts w:ascii="Consolas" w:cs="Consolas" w:eastAsia="Consolas" w:hAnsi="Consolas"/>
-                <w:sz w:val="17"/>
-                <w:szCs w:val="17"/>
+                <w:sz w:val="16"/>
+                <w:szCs w:val="16"/>
               </w:rPr>
               <w:t xml:space="preserve">        ruta,</w:t>
             </w:r>
@@ -11777,8 +11569,8 @@
             <w:r>
               <w:rPr>
                 <w:rFonts w:ascii="Consolas" w:cs="Consolas" w:eastAsia="Consolas" w:hAnsi="Consolas"/>
-                <w:sz w:val="17"/>
-                <w:szCs w:val="17"/>
+                <w:sz w:val="16"/>
+                <w:szCs w:val="16"/>
               </w:rPr>
               <w:t xml:space="preserve">        sep=config.SEPARADOR,          # el SIES delimita con punto y coma</w:t>
             </w:r>
@@ -11804,8 +11596,8 @@
             <w:r>
               <w:rPr>
                 <w:rFonts w:ascii="Consolas" w:cs="Consolas" w:eastAsia="Consolas" w:hAnsi="Consolas"/>
-                <w:sz w:val="17"/>
-                <w:szCs w:val="17"/>
+                <w:sz w:val="16"/>
+                <w:szCs w:val="16"/>
               </w:rPr>
               <w:t xml:space="preserve">        encoding=config.ENCODING,</w:t>
             </w:r>
@@ -11831,8 +11623,8 @@
             <w:r>
               <w:rPr>
                 <w:rFonts w:ascii="Consolas" w:cs="Consolas" w:eastAsia="Consolas" w:hAnsi="Consolas"/>
-                <w:sz w:val="17"/>
-                <w:szCs w:val="17"/>
+                <w:sz w:val="16"/>
+                <w:szCs w:val="16"/>
               </w:rPr>
               <w:t xml:space="preserve">        usecols=list(config.COLUMNAS_USADAS),   # 30 de las 40 columnas</w:t>
             </w:r>
@@ -11858,8 +11650,8 @@
             <w:r>
               <w:rPr>
                 <w:rFonts w:ascii="Consolas" w:cs="Consolas" w:eastAsia="Consolas" w:hAnsi="Consolas"/>
-                <w:sz w:val="17"/>
-                <w:szCs w:val="17"/>
+                <w:sz w:val="16"/>
+                <w:szCs w:val="16"/>
               </w:rPr>
               <w:t xml:space="preserve">        dtype=str,                     # se lee como texto y se convierte despues</w:t>
             </w:r>
@@ -11885,8 +11677,8 @@
             <w:r>
               <w:rPr>
                 <w:rFonts w:ascii="Consolas" w:cs="Consolas" w:eastAsia="Consolas" w:hAnsi="Consolas"/>
-                <w:sz w:val="17"/>
-                <w:szCs w:val="17"/>
+                <w:sz w:val="16"/>
+                <w:szCs w:val="16"/>
               </w:rPr>
               <w:t xml:space="preserve">        chunksize=chunksize,           # la memoria no depende del tamano del archivo</w:t>
             </w:r>
@@ -11912,8 +11704,8 @@
             <w:r>
               <w:rPr>
                 <w:rFonts w:ascii="Consolas" w:cs="Consolas" w:eastAsia="Consolas" w:hAnsi="Consolas"/>
-                <w:sz w:val="17"/>
-                <w:szCs w:val="17"/>
+                <w:sz w:val="16"/>
+                <w:szCs w:val="16"/>
               </w:rPr>
               <w:t xml:space="preserve">    )</w:t>
             </w:r>
@@ -11939,8 +11731,8 @@
             <w:r>
               <w:rPr>
                 <w:rFonts w:ascii="Consolas" w:cs="Consolas" w:eastAsia="Consolas" w:hAnsi="Consolas"/>
-                <w:sz w:val="17"/>
-                <w:szCs w:val="17"/>
+                <w:sz w:val="16"/>
+                <w:szCs w:val="16"/>
               </w:rPr>
               <w:t xml:space="preserve">    for bloque in lector:</w:t>
             </w:r>
@@ -11966,8 +11758,8 @@
             <w:r>
               <w:rPr>
                 <w:rFonts w:ascii="Consolas" w:cs="Consolas" w:eastAsia="Consolas" w:hAnsi="Consolas"/>
-                <w:sz w:val="17"/>
-                <w:szCs w:val="17"/>
+                <w:sz w:val="16"/>
+                <w:szCs w:val="16"/>
               </w:rPr>
               <w:t xml:space="preserve">        bloque, coerciones = _convertir_tipos(bloque)</w:t>
             </w:r>
@@ -11993,8 +11785,8 @@
             <w:r>
               <w:rPr>
                 <w:rFonts w:ascii="Consolas" w:cs="Consolas" w:eastAsia="Consolas" w:hAnsi="Consolas"/>
-                <w:sz w:val="17"/>
-                <w:szCs w:val="17"/>
+                <w:sz w:val="16"/>
+                <w:szCs w:val="16"/>
               </w:rPr>
               <w:t xml:space="preserve">        for columna, cantidad in coerciones.items():</w:t>
             </w:r>
@@ -12020,8 +11812,8 @@
             <w:r>
               <w:rPr>
                 <w:rFonts w:ascii="Consolas" w:cs="Consolas" w:eastAsia="Consolas" w:hAnsi="Consolas"/>
-                <w:sz w:val="17"/>
-                <w:szCs w:val="17"/>
+                <w:sz w:val="16"/>
+                <w:szCs w:val="16"/>
               </w:rPr>
               <w:t xml:space="preserve">            coerciones_totales[columna] = coerciones_totales.get(columna, 0) + cantidad</w:t>
             </w:r>
@@ -12047,8 +11839,8 @@
             <w:r>
               <w:rPr>
                 <w:rFonts w:ascii="Consolas" w:cs="Consolas" w:eastAsia="Consolas" w:hAnsi="Consolas"/>
-                <w:sz w:val="17"/>
-                <w:szCs w:val="17"/>
+                <w:sz w:val="16"/>
+                <w:szCs w:val="16"/>
               </w:rPr>
               <w:t xml:space="preserve">        bloques.append(bloque)</w:t>
             </w:r>
@@ -12074,8 +11866,8 @@
             <w:r>
               <w:rPr>
                 <w:rFonts w:ascii="Consolas" w:cs="Consolas" w:eastAsia="Consolas" w:hAnsi="Consolas"/>
-                <w:sz w:val="17"/>
-                <w:szCs w:val="17"/>
+                <w:sz w:val="16"/>
+                <w:szCs w:val="16"/>
               </w:rPr>
               <w:t xml:space="preserve"> </w:t>
             </w:r>
@@ -12101,8 +11893,8 @@
             <w:r>
               <w:rPr>
                 <w:rFonts w:ascii="Consolas" w:cs="Consolas" w:eastAsia="Consolas" w:hAnsi="Consolas"/>
-                <w:sz w:val="17"/>
-                <w:szCs w:val="17"/>
+                <w:sz w:val="16"/>
+                <w:szCs w:val="16"/>
               </w:rPr>
               <w:t xml:space="preserve">    df = pd.concat(bloques, ignore_index=True)</w:t>
             </w:r>
@@ -12128,8 +11920,8 @@
             <w:r>
               <w:rPr>
                 <w:rFonts w:ascii="Consolas" w:cs="Consolas" w:eastAsia="Consolas" w:hAnsi="Consolas"/>
-                <w:sz w:val="17"/>
-                <w:szCs w:val="17"/>
+                <w:sz w:val="16"/>
+                <w:szCs w:val="16"/>
               </w:rPr>
               <w:t xml:space="preserve">    return df, coerciones_totales</w:t>
             </w:r>
@@ -12242,8 +12034,8 @@
             <w:r>
               <w:rPr>
                 <w:rFonts w:ascii="Consolas" w:cs="Consolas" w:eastAsia="Consolas" w:hAnsi="Consolas"/>
-                <w:sz w:val="17"/>
-                <w:szCs w:val="17"/>
+                <w:sz w:val="16"/>
+                <w:szCs w:val="16"/>
               </w:rPr>
               <w:t xml:space="preserve">bitacora = limpieza.BitacoraLimpieza()</w:t>
             </w:r>
@@ -12269,8 +12061,8 @@
             <w:r>
               <w:rPr>
                 <w:rFonts w:ascii="Consolas" w:cs="Consolas" w:eastAsia="Consolas" w:hAnsi="Consolas"/>
-                <w:sz w:val="17"/>
-                <w:szCs w:val="17"/>
+                <w:sz w:val="16"/>
+                <w:szCs w:val="16"/>
               </w:rPr>
               <w:t xml:space="preserve"> </w:t>
             </w:r>
@@ -12296,8 +12088,8 @@
             <w:r>
               <w:rPr>
                 <w:rFonts w:ascii="Consolas" w:cs="Consolas" w:eastAsia="Consolas" w:hAnsi="Consolas"/>
-                <w:sz w:val="17"/>
-                <w:szCs w:val="17"/>
+                <w:sz w:val="16"/>
+                <w:szCs w:val="16"/>
               </w:rPr>
               <w:t xml:space="preserve">df = limpieza.marcar_sentinelas(df, bitacora)        # 1.710.167 -&gt; 1.710.167</w:t>
             </w:r>
@@ -12323,8 +12115,8 @@
             <w:r>
               <w:rPr>
                 <w:rFonts w:ascii="Consolas" w:cs="Consolas" w:eastAsia="Consolas" w:hAnsi="Consolas"/>
-                <w:sz w:val="17"/>
-                <w:szCs w:val="17"/>
+                <w:sz w:val="16"/>
+                <w:szCs w:val="16"/>
               </w:rPr>
               <w:t xml:space="preserve">df = limpieza.normalizar_categorias(df, bitacora=bitacora)</w:t>
             </w:r>
@@ -12350,8 +12142,8 @@
             <w:r>
               <w:rPr>
                 <w:rFonts w:ascii="Consolas" w:cs="Consolas" w:eastAsia="Consolas" w:hAnsi="Consolas"/>
-                <w:sz w:val="17"/>
-                <w:szCs w:val="17"/>
+                <w:sz w:val="16"/>
+                <w:szCs w:val="16"/>
               </w:rPr>
               <w:t xml:space="preserve">df = limpieza.filtrar_nivel(df, bitacora=bitacora)   # 1.710.167 -&gt; 1.311.776</w:t>
             </w:r>
@@ -12377,8 +12169,8 @@
             <w:r>
               <w:rPr>
                 <w:rFonts w:ascii="Consolas" w:cs="Consolas" w:eastAsia="Consolas" w:hAnsi="Consolas"/>
-                <w:sz w:val="17"/>
-                <w:szCs w:val="17"/>
+                <w:sz w:val="16"/>
+                <w:szCs w:val="16"/>
               </w:rPr>
               <w:t xml:space="preserve">df = limpieza.eliminar_duplicados(df, bitacora=bitacora)</w:t>
             </w:r>
@@ -12404,8 +12196,8 @@
             <w:r>
               <w:rPr>
                 <w:rFonts w:ascii="Consolas" w:cs="Consolas" w:eastAsia="Consolas" w:hAnsi="Consolas"/>
-                <w:sz w:val="17"/>
-                <w:szCs w:val="17"/>
+                <w:sz w:val="16"/>
+                <w:szCs w:val="16"/>
               </w:rPr>
               <w:t xml:space="preserve">df = limpieza.descartar_sin_insumos(df, bitacora=bitacora)</w:t>
             </w:r>
@@ -12431,8 +12223,8 @@
             <w:r>
               <w:rPr>
                 <w:rFonts w:ascii="Consolas" w:cs="Consolas" w:eastAsia="Consolas" w:hAnsi="Consolas"/>
-                <w:sz w:val="17"/>
-                <w:szCs w:val="17"/>
+                <w:sz w:val="16"/>
+                <w:szCs w:val="16"/>
               </w:rPr>
               <w:t xml:space="preserve">df = transformacion.construir_dataset_analitico(df, bitacora)</w:t>
             </w:r>
@@ -12458,8 +12250,8 @@
             <w:r>
               <w:rPr>
                 <w:rFonts w:ascii="Consolas" w:cs="Consolas" w:eastAsia="Consolas" w:hAnsi="Consolas"/>
-                <w:sz w:val="17"/>
-                <w:szCs w:val="17"/>
+                <w:sz w:val="16"/>
+                <w:szCs w:val="16"/>
               </w:rPr>
               <w:t xml:space="preserve">df = transformacion.filtrar_atipicos(df, bitacora)   # -&gt; 1.246.760</w:t>
             </w:r>
@@ -12615,8 +12407,8 @@
             <w:r>
               <w:rPr>
                 <w:rFonts w:ascii="Consolas" w:cs="Consolas" w:eastAsia="Consolas" w:hAnsi="Consolas"/>
-                <w:sz w:val="17"/>
-                <w:szCs w:val="17"/>
+                <w:sz w:val="16"/>
+                <w:szCs w:val="16"/>
               </w:rPr>
               <w:t xml:space="preserve">@dataclass</w:t>
             </w:r>
@@ -12642,8 +12434,8 @@
             <w:r>
               <w:rPr>
                 <w:rFonts w:ascii="Consolas" w:cs="Consolas" w:eastAsia="Consolas" w:hAnsi="Consolas"/>
-                <w:sz w:val="17"/>
-                <w:szCs w:val="17"/>
+                <w:sz w:val="16"/>
+                <w:szCs w:val="16"/>
               </w:rPr>
               <w:t xml:space="preserve">class Regla:</w:t>
             </w:r>
@@ -12669,8 +12461,8 @@
             <w:r>
               <w:rPr>
                 <w:rFonts w:ascii="Consolas" w:cs="Consolas" w:eastAsia="Consolas" w:hAnsi="Consolas"/>
-                <w:sz w:val="17"/>
-                <w:szCs w:val="17"/>
+                <w:sz w:val="16"/>
+                <w:szCs w:val="16"/>
               </w:rPr>
               <w:t xml:space="preserve">    nombre: str</w:t>
             </w:r>
@@ -12696,8 +12488,8 @@
             <w:r>
               <w:rPr>
                 <w:rFonts w:ascii="Consolas" w:cs="Consolas" w:eastAsia="Consolas" w:hAnsi="Consolas"/>
-                <w:sz w:val="17"/>
-                <w:szCs w:val="17"/>
+                <w:sz w:val="16"/>
+                <w:szCs w:val="16"/>
               </w:rPr>
               <w:t xml:space="preserve">    descripcion: str</w:t>
             </w:r>
@@ -12723,8 +12515,8 @@
             <w:r>
               <w:rPr>
                 <w:rFonts w:ascii="Consolas" w:cs="Consolas" w:eastAsia="Consolas" w:hAnsi="Consolas"/>
-                <w:sz w:val="17"/>
-                <w:szCs w:val="17"/>
+                <w:sz w:val="16"/>
+                <w:szCs w:val="16"/>
               </w:rPr>
               <w:t xml:space="preserve">    funcion: FuncionRegla</w:t>
             </w:r>
@@ -12750,8 +12542,8 @@
             <w:r>
               <w:rPr>
                 <w:rFonts w:ascii="Consolas" w:cs="Consolas" w:eastAsia="Consolas" w:hAnsi="Consolas"/>
-                <w:sz w:val="17"/>
-                <w:szCs w:val="17"/>
+                <w:sz w:val="16"/>
+                <w:szCs w:val="16"/>
               </w:rPr>
               <w:t xml:space="preserve">    critica: bool = True          # False -&gt; se reporta como advertencia</w:t>
             </w:r>
@@ -12777,8 +12569,8 @@
             <w:r>
               <w:rPr>
                 <w:rFonts w:ascii="Consolas" w:cs="Consolas" w:eastAsia="Consolas" w:hAnsi="Consolas"/>
-                <w:sz w:val="17"/>
-                <w:szCs w:val="17"/>
+                <w:sz w:val="16"/>
+                <w:szCs w:val="16"/>
               </w:rPr>
               <w:t xml:space="preserve"> </w:t>
             </w:r>
@@ -12804,8 +12596,8 @@
             <w:r>
               <w:rPr>
                 <w:rFonts w:ascii="Consolas" w:cs="Consolas" w:eastAsia="Consolas" w:hAnsi="Consolas"/>
-                <w:sz w:val="17"/>
-                <w:szCs w:val="17"/>
+                <w:sz w:val="16"/>
+                <w:szCs w:val="16"/>
               </w:rPr>
               <w:t xml:space="preserve">    def evaluar(self, df: pd.DataFrame) -&gt; dict:</w:t>
             </w:r>
@@ -12831,8 +12623,8 @@
             <w:r>
               <w:rPr>
                 <w:rFonts w:ascii="Consolas" w:cs="Consolas" w:eastAsia="Consolas" w:hAnsi="Consolas"/>
-                <w:sz w:val="17"/>
-                <w:szCs w:val="17"/>
+                <w:sz w:val="16"/>
+                <w:szCs w:val="16"/>
               </w:rPr>
               <w:t xml:space="preserve">        """Ejecuta la regla capturando cualquier excepcion como incumplimiento."""</w:t>
             </w:r>
@@ -12858,8 +12650,8 @@
             <w:r>
               <w:rPr>
                 <w:rFonts w:ascii="Consolas" w:cs="Consolas" w:eastAsia="Consolas" w:hAnsi="Consolas"/>
-                <w:sz w:val="17"/>
-                <w:szCs w:val="17"/>
+                <w:sz w:val="16"/>
+                <w:szCs w:val="16"/>
               </w:rPr>
               <w:t xml:space="preserve">        try:</w:t>
             </w:r>
@@ -12885,8 +12677,8 @@
             <w:r>
               <w:rPr>
                 <w:rFonts w:ascii="Consolas" w:cs="Consolas" w:eastAsia="Consolas" w:hAnsi="Consolas"/>
-                <w:sz w:val="17"/>
-                <w:szCs w:val="17"/>
+                <w:sz w:val="16"/>
+                <w:szCs w:val="16"/>
               </w:rPr>
               <w:t xml:space="preserve">            cumple, detalle = self.funcion(df)</w:t>
             </w:r>
@@ -12912,8 +12704,8 @@
             <w:r>
               <w:rPr>
                 <w:rFonts w:ascii="Consolas" w:cs="Consolas" w:eastAsia="Consolas" w:hAnsi="Consolas"/>
-                <w:sz w:val="17"/>
-                <w:szCs w:val="17"/>
+                <w:sz w:val="16"/>
+                <w:szCs w:val="16"/>
               </w:rPr>
               <w:t xml:space="preserve">        except Exception as exc:   # la validacion nunca debe abortar el pipeline</w:t>
             </w:r>
@@ -12939,8 +12731,8 @@
             <w:r>
               <w:rPr>
                 <w:rFonts w:ascii="Consolas" w:cs="Consolas" w:eastAsia="Consolas" w:hAnsi="Consolas"/>
-                <w:sz w:val="17"/>
-                <w:szCs w:val="17"/>
+                <w:sz w:val="16"/>
+                <w:szCs w:val="16"/>
               </w:rPr>
               <w:t xml:space="preserve">            cumple, detalle = False, f"Error al evaluar: {type(exc).__name__}: {exc}"</w:t>
             </w:r>
@@ -12966,8 +12758,8 @@
             <w:r>
               <w:rPr>
                 <w:rFonts w:ascii="Consolas" w:cs="Consolas" w:eastAsia="Consolas" w:hAnsi="Consolas"/>
-                <w:sz w:val="17"/>
-                <w:szCs w:val="17"/>
+                <w:sz w:val="16"/>
+                <w:szCs w:val="16"/>
               </w:rPr>
               <w:t xml:space="preserve">        return {"regla": self.nombre, "estado": "PASA" if cumple else "FALLA", ...}</w:t>
             </w:r>
@@ -15561,8 +15353,8 @@
             <w:r>
               <w:rPr>
                 <w:rFonts w:ascii="Consolas" w:cs="Consolas" w:eastAsia="Consolas" w:hAnsi="Consolas"/>
-                <w:sz w:val="17"/>
-                <w:szCs w:val="17"/>
+                <w:sz w:val="16"/>
+                <w:szCs w:val="16"/>
               </w:rPr>
               <w:t xml:space="preserve">def calcular_duracion_real(df: pd.DataFrame) -&gt; pd.DataFrame:</w:t>
             </w:r>
@@ -15588,8 +15380,8 @@
             <w:r>
               <w:rPr>
                 <w:rFonts w:ascii="Consolas" w:cs="Consolas" w:eastAsia="Consolas" w:hAnsi="Consolas"/>
-                <w:sz w:val="17"/>
-                <w:szCs w:val="17"/>
+                <w:sz w:val="16"/>
+                <w:szCs w:val="16"/>
               </w:rPr>
               <w:t xml:space="preserve">    """Calcula la duracion real de la trayectoria, en semestres academicos."""</w:t>
             </w:r>
@@ -15615,8 +15407,8 @@
             <w:r>
               <w:rPr>
                 <w:rFonts w:ascii="Consolas" w:cs="Consolas" w:eastAsia="Consolas" w:hAnsi="Consolas"/>
-                <w:sz w:val="17"/>
-                <w:szCs w:val="17"/>
+                <w:sz w:val="16"/>
+                <w:szCs w:val="16"/>
               </w:rPr>
               <w:t xml:space="preserve">    anios = df["anio_titulo"].astype("Int32") - df["anio_ing_carr_ori"].astype("Int32")</w:t>
             </w:r>
@@ -15642,8 +15434,8 @@
             <w:r>
               <w:rPr>
                 <w:rFonts w:ascii="Consolas" w:cs="Consolas" w:eastAsia="Consolas" w:hAnsi="Consolas"/>
-                <w:sz w:val="17"/>
-                <w:szCs w:val="17"/>
+                <w:sz w:val="16"/>
+                <w:szCs w:val="16"/>
               </w:rPr>
               <w:t xml:space="preserve">    semestres = df["semestre_titulo"].astype("Int16") - df["sem_ing_carr_ori"].astype("Int16")</w:t>
             </w:r>
@@ -15669,8 +15461,8 @@
             <w:r>
               <w:rPr>
                 <w:rFonts w:ascii="Consolas" w:cs="Consolas" w:eastAsia="Consolas" w:hAnsi="Consolas"/>
-                <w:sz w:val="17"/>
-                <w:szCs w:val="17"/>
+                <w:sz w:val="16"/>
+                <w:szCs w:val="16"/>
               </w:rPr>
               <w:t xml:space="preserve">    df["duracion_real_sem"] = (anios * config.SEMESTRES_POR_ANIO + semestres + 1).astype("Int16")</w:t>
             </w:r>
@@ -15696,8 +15488,8 @@
             <w:r>
               <w:rPr>
                 <w:rFonts w:ascii="Consolas" w:cs="Consolas" w:eastAsia="Consolas" w:hAnsi="Consolas"/>
-                <w:sz w:val="17"/>
-                <w:szCs w:val="17"/>
+                <w:sz w:val="16"/>
+                <w:szCs w:val="16"/>
               </w:rPr>
               <w:t xml:space="preserve">    return df</w:t>
             </w:r>
@@ -19836,8 +19628,8 @@
             <w:r>
               <w:rPr>
                 <w:rFonts w:ascii="Consolas" w:cs="Consolas" w:eastAsia="Consolas" w:hAnsi="Consolas"/>
-                <w:sz w:val="17"/>
-                <w:szCs w:val="17"/>
+                <w:sz w:val="16"/>
+                <w:szCs w:val="16"/>
               </w:rPr>
               <w:t xml:space="preserve">============================= test session starts =============================</w:t>
             </w:r>
@@ -19863,8 +19655,8 @@
             <w:r>
               <w:rPr>
                 <w:rFonts w:ascii="Consolas" w:cs="Consolas" w:eastAsia="Consolas" w:hAnsi="Consolas"/>
-                <w:sz w:val="17"/>
-                <w:szCs w:val="17"/>
+                <w:sz w:val="16"/>
+                <w:szCs w:val="16"/>
               </w:rPr>
               <w:t xml:space="preserve">tests/test_pipeline.py::test_duracion_real_caso_normal PASSED            [  4%]</w:t>
             </w:r>
@@ -19890,8 +19682,8 @@
             <w:r>
               <w:rPr>
                 <w:rFonts w:ascii="Consolas" w:cs="Consolas" w:eastAsia="Consolas" w:hAnsi="Consolas"/>
-                <w:sz w:val="17"/>
-                <w:szCs w:val="17"/>
+                <w:sz w:val="16"/>
+                <w:szCs w:val="16"/>
               </w:rPr>
               <w:t xml:space="preserve">tests/test_pipeline.py::test_sobreduracion_y_categoria PASSED            [  9%]</w:t>
             </w:r>
@@ -19917,8 +19709,8 @@
             <w:r>
               <w:rPr>
                 <w:rFonts w:ascii="Consolas" w:cs="Consolas" w:eastAsia="Consolas" w:hAnsi="Consolas"/>
-                <w:sz w:val="17"/>
-                <w:szCs w:val="17"/>
+                <w:sz w:val="16"/>
+                <w:szCs w:val="16"/>
               </w:rPr>
               <w:t xml:space="preserve">tests/test_pipeline.py::test_edad_descuenta_mes_no_cumplido PASSED       [ 13%]</w:t>
             </w:r>
@@ -19944,8 +19736,8 @@
             <w:r>
               <w:rPr>
                 <w:rFonts w:ascii="Consolas" w:cs="Consolas" w:eastAsia="Consolas" w:hAnsi="Consolas"/>
-                <w:sz w:val="17"/>
-                <w:szCs w:val="17"/>
+                <w:sz w:val="16"/>
+                <w:szCs w:val="16"/>
               </w:rPr>
               <w:t xml:space="preserve">tests/test_pipeline.py::test_edad_cuando_aun_no_cumple_anios PASSED      [ 18%]</w:t>
             </w:r>
@@ -19971,8 +19763,8 @@
             <w:r>
               <w:rPr>
                 <w:rFonts w:ascii="Consolas" w:cs="Consolas" w:eastAsia="Consolas" w:hAnsi="Consolas"/>
-                <w:sz w:val="17"/>
-                <w:szCs w:val="17"/>
+                <w:sz w:val="16"/>
+                <w:szCs w:val="16"/>
               </w:rPr>
               <w:t xml:space="preserve">tests/test_pipeline.py::test_semestre_de_titulacion_segun_mes PASSED     [ 22%]</w:t>
             </w:r>
@@ -19998,8 +19790,8 @@
             <w:r>
               <w:rPr>
                 <w:rFonts w:ascii="Consolas" w:cs="Consolas" w:eastAsia="Consolas" w:hAnsi="Consolas"/>
-                <w:sz w:val="17"/>
-                <w:szCs w:val="17"/>
+                <w:sz w:val="16"/>
+                <w:szCs w:val="16"/>
               </w:rPr>
               <w:t xml:space="preserve">tests/test_pipeline.py::test_duracion_minima_es_uno PASSED               [ 27%]</w:t>
             </w:r>
@@ -20025,8 +19817,8 @@
             <w:r>
               <w:rPr>
                 <w:rFonts w:ascii="Consolas" w:cs="Consolas" w:eastAsia="Consolas" w:hAnsi="Consolas"/>
-                <w:sz w:val="17"/>
-                <w:szCs w:val="17"/>
+                <w:sz w:val="16"/>
+                <w:szCs w:val="16"/>
               </w:rPr>
               <w:t xml:space="preserve">tests/test_pipeline.py::test_clasificacion_en_los_bordes PASSED          [ 31%]</w:t>
             </w:r>
@@ -20052,8 +19844,8 @@
             <w:r>
               <w:rPr>
                 <w:rFonts w:ascii="Consolas" w:cs="Consolas" w:eastAsia="Consolas" w:hAnsi="Consolas"/>
-                <w:sz w:val="17"/>
-                <w:szCs w:val="17"/>
+                <w:sz w:val="16"/>
+                <w:szCs w:val="16"/>
               </w:rPr>
               <w:t xml:space="preserve">tests/test_pipeline.py::test_sentinelas_se_convierten_en_na PASSED       [ 36%]</w:t>
             </w:r>
@@ -20079,8 +19871,8 @@
             <w:r>
               <w:rPr>
                 <w:rFonts w:ascii="Consolas" w:cs="Consolas" w:eastAsia="Consolas" w:hAnsi="Consolas"/>
-                <w:sz w:val="17"/>
-                <w:szCs w:val="17"/>
+                <w:sz w:val="16"/>
+                <w:szCs w:val="16"/>
               </w:rPr>
               <w:t xml:space="preserve">tests/test_pipeline.py::test_normalizacion_de_texto_respeta_nombres_propios PASSED [ 40%]</w:t>
             </w:r>
@@ -20106,8 +19898,8 @@
             <w:r>
               <w:rPr>
                 <w:rFonts w:ascii="Consolas" w:cs="Consolas" w:eastAsia="Consolas" w:hAnsi="Consolas"/>
-                <w:sz w:val="17"/>
-                <w:szCs w:val="17"/>
+                <w:sz w:val="16"/>
+                <w:szCs w:val="16"/>
               </w:rPr>
               <w:t xml:space="preserve">tests/test_pipeline.py::test_duplicados_sin_mrun_no_se_colapsan PASSED   [ 45%]</w:t>
             </w:r>
@@ -20133,8 +19925,8 @@
             <w:r>
               <w:rPr>
                 <w:rFonts w:ascii="Consolas" w:cs="Consolas" w:eastAsia="Consolas" w:hAnsi="Consolas"/>
-                <w:sz w:val="17"/>
-                <w:szCs w:val="17"/>
+                <w:sz w:val="16"/>
+                <w:szCs w:val="16"/>
               </w:rPr>
               <w:t xml:space="preserve">tests/test_pipeline.py::test_duplicado_exacto_se_elimina PASSED          [ 50%]</w:t>
             </w:r>
@@ -20160,8 +19952,8 @@
             <w:r>
               <w:rPr>
                 <w:rFonts w:ascii="Consolas" w:cs="Consolas" w:eastAsia="Consolas" w:hAnsi="Consolas"/>
-                <w:sz w:val="17"/>
-                <w:szCs w:val="17"/>
+                <w:sz w:val="16"/>
+                <w:szCs w:val="16"/>
               </w:rPr>
               <w:t xml:space="preserve">tests/test_pipeline.py::test_duracion_teorica_cero_no_divide_por_cero PASSED [ 54%]</w:t>
             </w:r>
@@ -20187,8 +19979,8 @@
             <w:r>
               <w:rPr>
                 <w:rFonts w:ascii="Consolas" w:cs="Consolas" w:eastAsia="Consolas" w:hAnsi="Consolas"/>
-                <w:sz w:val="17"/>
-                <w:szCs w:val="17"/>
+                <w:sz w:val="16"/>
+                <w:szCs w:val="16"/>
               </w:rPr>
               <w:t xml:space="preserve">tests/test_pipeline.py::test_registro_sin_fecha_nacimiento_se_marca_atipico PASSED [ 59%]</w:t>
             </w:r>
@@ -20214,8 +20006,8 @@
             <w:r>
               <w:rPr>
                 <w:rFonts w:ascii="Consolas" w:cs="Consolas" w:eastAsia="Consolas" w:hAnsi="Consolas"/>
-                <w:sz w:val="17"/>
-                <w:szCs w:val="17"/>
+                <w:sz w:val="16"/>
+                <w:szCs w:val="16"/>
               </w:rPr>
               <w:t xml:space="preserve">tests/test_pipeline.py::test_archivos_faltantes_lanza_excepcion PASSED   [ 63%]</w:t>
             </w:r>
@@ -20241,8 +20033,8 @@
             <w:r>
               <w:rPr>
                 <w:rFonts w:ascii="Consolas" w:cs="Consolas" w:eastAsia="Consolas" w:hAnsi="Consolas"/>
-                <w:sz w:val="17"/>
-                <w:szCs w:val="17"/>
+                <w:sz w:val="16"/>
+                <w:szCs w:val="16"/>
               </w:rPr>
               <w:t xml:space="preserve">tests/test_pipeline.py::test_cargar_consolidado_inexistente PASSED       [ 68%]</w:t>
             </w:r>
@@ -20268,8 +20060,8 @@
             <w:r>
               <w:rPr>
                 <w:rFonts w:ascii="Consolas" w:cs="Consolas" w:eastAsia="Consolas" w:hAnsi="Consolas"/>
-                <w:sz w:val="17"/>
-                <w:szCs w:val="17"/>
+                <w:sz w:val="16"/>
+                <w:szCs w:val="16"/>
               </w:rPr>
               <w:t xml:space="preserve">tests/test_pipeline.py::test_validador_detecta_dataset_corrupto PASSED   [ 72%]</w:t>
             </w:r>
@@ -20295,8 +20087,8 @@
             <w:r>
               <w:rPr>
                 <w:rFonts w:ascii="Consolas" w:cs="Consolas" w:eastAsia="Consolas" w:hAnsi="Consolas"/>
-                <w:sz w:val="17"/>
-                <w:szCs w:val="17"/>
+                <w:sz w:val="16"/>
+                <w:szCs w:val="16"/>
               </w:rPr>
               <w:t xml:space="preserve">tests/test_pipeline.py::test_validador_aprueba_dataset_correcto PASSED   [ 77%]</w:t>
             </w:r>
@@ -20322,8 +20114,8 @@
             <w:r>
               <w:rPr>
                 <w:rFonts w:ascii="Consolas" w:cs="Consolas" w:eastAsia="Consolas" w:hAnsi="Consolas"/>
-                <w:sz w:val="17"/>
-                <w:szCs w:val="17"/>
+                <w:sz w:val="16"/>
+                <w:szCs w:val="16"/>
               </w:rPr>
               <w:t xml:space="preserve">tests/test_pipeline.py::test_estado_antes_de_ejecutar_lanza_error PASSED [ 81%]</w:t>
             </w:r>
@@ -20349,8 +20141,8 @@
             <w:r>
               <w:rPr>
                 <w:rFonts w:ascii="Consolas" w:cs="Consolas" w:eastAsia="Consolas" w:hAnsi="Consolas"/>
-                <w:sz w:val="17"/>
-                <w:szCs w:val="17"/>
+                <w:sz w:val="16"/>
+                <w:szCs w:val="16"/>
               </w:rPr>
               <w:t xml:space="preserve">tests/test_pipeline.py::test_regla_con_excepcion_se_reporta_como_falla PASSED [ 86%]</w:t>
             </w:r>
@@ -20376,8 +20168,8 @@
             <w:r>
               <w:rPr>
                 <w:rFonts w:ascii="Consolas" w:cs="Consolas" w:eastAsia="Consolas" w:hAnsi="Consolas"/>
-                <w:sz w:val="17"/>
-                <w:szCs w:val="17"/>
+                <w:sz w:val="16"/>
+                <w:szCs w:val="16"/>
               </w:rPr>
               <w:t xml:space="preserve">tests/test_pipeline.py::test_tabla_agregada_respeta_minimo_de_casos PASSED [ 90%]</w:t>
             </w:r>
@@ -20403,8 +20195,8 @@
             <w:r>
               <w:rPr>
                 <w:rFonts w:ascii="Consolas" w:cs="Consolas" w:eastAsia="Consolas" w:hAnsi="Consolas"/>
-                <w:sz w:val="17"/>
-                <w:szCs w:val="17"/>
+                <w:sz w:val="16"/>
+                <w:szCs w:val="16"/>
               </w:rPr>
               <w:t xml:space="preserve">tests/test_pipeline.py::test_formato_numerico_chileno PASSED             [ 95%]</w:t>
             </w:r>
@@ -20430,8 +20222,8 @@
             <w:r>
               <w:rPr>
                 <w:rFonts w:ascii="Consolas" w:cs="Consolas" w:eastAsia="Consolas" w:hAnsi="Consolas"/>
-                <w:sz w:val="17"/>
-                <w:szCs w:val="17"/>
+                <w:sz w:val="16"/>
+                <w:szCs w:val="16"/>
               </w:rPr>
               <w:t xml:space="preserve">tests/test_pipeline.py::test_configuracion_expone_versiones PASSED       [100%]</w:t>
             </w:r>
@@ -20457,8 +20249,8 @@
             <w:r>
               <w:rPr>
                 <w:rFonts w:ascii="Consolas" w:cs="Consolas" w:eastAsia="Consolas" w:hAnsi="Consolas"/>
-                <w:sz w:val="17"/>
-                <w:szCs w:val="17"/>
+                <w:sz w:val="16"/>
+                <w:szCs w:val="16"/>
               </w:rPr>
               <w:t xml:space="preserve">============================= 22 passed in 1.68s ==============================</w:t>
             </w:r>
@@ -20559,7 +20351,7 @@
           <w:sz w:val="22"/>
           <w:szCs w:val="22"/>
         </w:rPr>
-        <w:t xml:space="preserve">El notebook de la Fase 1 contiene 31 celdas —16 de documentación en markdown y 15 de código— y se ejecuta completo sin errores dentro del entorno configurado. Su alcance se restringe deliberadamente a lo propio de la Fase 1: no consolida ni transforma el conjunto de datos, tarea que corresponde a la Fase 2.</w:t>
+        <w:t xml:space="preserve">El notebook de la Fase 1 contiene 31 celdas —19 de documentación en markdown y 12 de código— y se ejecuta completo sin errores dentro del entorno configurado. Su alcance se restringe deliberadamente a lo propio de la Fase 1: no consolida ni transforma el conjunto de datos, tarea que corresponde a la Fase 2.</w:t>
       </w:r>
     </w:p>
     <w:p>
@@ -33310,7 +33102,7 @@
                 <w:sz w:val="19"/>
                 <w:szCs w:val="19"/>
               </w:rPr>
-              <w:t xml:space="preserve">Repositorio Git con 15 commits descriptivos, una rama de trabajo y una fusión explícita.</w:t>
+              <w:t xml:space="preserve">Repositorio Git con 16 commits descriptivos, una rama de trabajo y una fusión explícita.</w:t>
             </w:r>
           </w:p>
         </w:tc>
@@ -33426,7 +33218,7 @@
                 <w:sz w:val="19"/>
                 <w:szCs w:val="19"/>
               </w:rPr>
-              <w:t xml:space="preserve">Paquete src/ con 7 módulos, 30 funciones y 5 clases.</w:t>
+              <w:t xml:space="preserve">Paquete src/ con 7 módulos, 36 funciones y 5 clases.</w:t>
             </w:r>
           </w:p>
         </w:tc>
@@ -38220,8 +38012,8 @@
             <w:r>
               <w:rPr>
                 <w:rFonts w:ascii="Consolas" w:cs="Consolas" w:eastAsia="Consolas" w:hAnsi="Consolas"/>
-                <w:sz w:val="17"/>
-                <w:szCs w:val="17"/>
+                <w:sz w:val="16"/>
+                <w:szCs w:val="16"/>
               </w:rPr>
               <w:t xml:space="preserve">============================= test session starts =============================</w:t>
             </w:r>
@@ -38247,8 +38039,8 @@
             <w:r>
               <w:rPr>
                 <w:rFonts w:ascii="Consolas" w:cs="Consolas" w:eastAsia="Consolas" w:hAnsi="Consolas"/>
-                <w:sz w:val="17"/>
-                <w:szCs w:val="17"/>
+                <w:sz w:val="16"/>
+                <w:szCs w:val="16"/>
               </w:rPr>
               <w:t xml:space="preserve">collecting ... collected 22 items</w:t>
             </w:r>
@@ -38274,8 +38066,8 @@
             <w:r>
               <w:rPr>
                 <w:rFonts w:ascii="Consolas" w:cs="Consolas" w:eastAsia="Consolas" w:hAnsi="Consolas"/>
-                <w:sz w:val="17"/>
-                <w:szCs w:val="17"/>
+                <w:sz w:val="16"/>
+                <w:szCs w:val="16"/>
               </w:rPr>
               <w:t xml:space="preserve"> </w:t>
             </w:r>
@@ -38301,8 +38093,8 @@
             <w:r>
               <w:rPr>
                 <w:rFonts w:ascii="Consolas" w:cs="Consolas" w:eastAsia="Consolas" w:hAnsi="Consolas"/>
-                <w:sz w:val="17"/>
-                <w:szCs w:val="17"/>
+                <w:sz w:val="16"/>
+                <w:szCs w:val="16"/>
               </w:rPr>
               <w:t xml:space="preserve">tests/test_pipeline.py::test_duracion_real_caso_normal PASSED            [  4%]</w:t>
             </w:r>
@@ -38328,8 +38120,8 @@
             <w:r>
               <w:rPr>
                 <w:rFonts w:ascii="Consolas" w:cs="Consolas" w:eastAsia="Consolas" w:hAnsi="Consolas"/>
-                <w:sz w:val="17"/>
-                <w:szCs w:val="17"/>
+                <w:sz w:val="16"/>
+                <w:szCs w:val="16"/>
               </w:rPr>
               <w:t xml:space="preserve">tests/test_pipeline.py::test_sobreduracion_y_categoria PASSED            [  9%]</w:t>
             </w:r>
@@ -38355,8 +38147,8 @@
             <w:r>
               <w:rPr>
                 <w:rFonts w:ascii="Consolas" w:cs="Consolas" w:eastAsia="Consolas" w:hAnsi="Consolas"/>
-                <w:sz w:val="17"/>
-                <w:szCs w:val="17"/>
+                <w:sz w:val="16"/>
+                <w:szCs w:val="16"/>
               </w:rPr>
               <w:t xml:space="preserve">tests/test_pipeline.py::test_edad_descuenta_mes_no_cumplido PASSED       [ 13%]</w:t>
             </w:r>
@@ -38382,8 +38174,8 @@
             <w:r>
               <w:rPr>
                 <w:rFonts w:ascii="Consolas" w:cs="Consolas" w:eastAsia="Consolas" w:hAnsi="Consolas"/>
-                <w:sz w:val="17"/>
-                <w:szCs w:val="17"/>
+                <w:sz w:val="16"/>
+                <w:szCs w:val="16"/>
               </w:rPr>
               <w:t xml:space="preserve">tests/test_pipeline.py::test_edad_cuando_aun_no_cumple_anios PASSED      [ 18%]</w:t>
             </w:r>
@@ -38409,8 +38201,8 @@
             <w:r>
               <w:rPr>
                 <w:rFonts w:ascii="Consolas" w:cs="Consolas" w:eastAsia="Consolas" w:hAnsi="Consolas"/>
-                <w:sz w:val="17"/>
-                <w:szCs w:val="17"/>
+                <w:sz w:val="16"/>
+                <w:szCs w:val="16"/>
               </w:rPr>
               <w:t xml:space="preserve">tests/test_pipeline.py::test_semestre_de_titulacion_segun_mes PASSED     [ 22%]</w:t>
             </w:r>
@@ -38436,8 +38228,8 @@
             <w:r>
               <w:rPr>
                 <w:rFonts w:ascii="Consolas" w:cs="Consolas" w:eastAsia="Consolas" w:hAnsi="Consolas"/>
-                <w:sz w:val="17"/>
-                <w:szCs w:val="17"/>
+                <w:sz w:val="16"/>
+                <w:szCs w:val="16"/>
               </w:rPr>
               <w:t xml:space="preserve">tests/test_pipeline.py::test_duracion_minima_es_uno PASSED               [ 27%]</w:t>
             </w:r>
@@ -38463,8 +38255,8 @@
             <w:r>
               <w:rPr>
                 <w:rFonts w:ascii="Consolas" w:cs="Consolas" w:eastAsia="Consolas" w:hAnsi="Consolas"/>
-                <w:sz w:val="17"/>
-                <w:szCs w:val="17"/>
+                <w:sz w:val="16"/>
+                <w:szCs w:val="16"/>
               </w:rPr>
               <w:t xml:space="preserve">tests/test_pipeline.py::test_clasificacion_en_los_bordes PASSED          [ 31%]</w:t>
             </w:r>
@@ -38490,8 +38282,8 @@
             <w:r>
               <w:rPr>
                 <w:rFonts w:ascii="Consolas" w:cs="Consolas" w:eastAsia="Consolas" w:hAnsi="Consolas"/>
-                <w:sz w:val="17"/>
-                <w:szCs w:val="17"/>
+                <w:sz w:val="16"/>
+                <w:szCs w:val="16"/>
               </w:rPr>
               <w:t xml:space="preserve">tests/test_pipeline.py::test_sentinelas_se_convierten_en_na PASSED       [ 36%]</w:t>
             </w:r>
@@ -38517,8 +38309,8 @@
             <w:r>
               <w:rPr>
                 <w:rFonts w:ascii="Consolas" w:cs="Consolas" w:eastAsia="Consolas" w:hAnsi="Consolas"/>
-                <w:sz w:val="17"/>
-                <w:szCs w:val="17"/>
+                <w:sz w:val="16"/>
+                <w:szCs w:val="16"/>
               </w:rPr>
               <w:t xml:space="preserve">tests/test_pipeline.py::test_normalizacion_de_texto_respeta_nombres_propios PASSED [ 40%]</w:t>
             </w:r>
@@ -38544,8 +38336,8 @@
             <w:r>
               <w:rPr>
                 <w:rFonts w:ascii="Consolas" w:cs="Consolas" w:eastAsia="Consolas" w:hAnsi="Consolas"/>
-                <w:sz w:val="17"/>
-                <w:szCs w:val="17"/>
+                <w:sz w:val="16"/>
+                <w:szCs w:val="16"/>
               </w:rPr>
               <w:t xml:space="preserve">tests/test_pipeline.py::test_duplicados_sin_mrun_no_se_colapsan PASSED   [ 45%]</w:t>
             </w:r>
@@ -38571,8 +38363,8 @@
             <w:r>
               <w:rPr>
                 <w:rFonts w:ascii="Consolas" w:cs="Consolas" w:eastAsia="Consolas" w:hAnsi="Consolas"/>
-                <w:sz w:val="17"/>
-                <w:szCs w:val="17"/>
+                <w:sz w:val="16"/>
+                <w:szCs w:val="16"/>
               </w:rPr>
               <w:t xml:space="preserve">tests/test_pipeline.py::test_duplicado_exacto_se_elimina PASSED          [ 50%]</w:t>
             </w:r>
@@ -38598,8 +38390,8 @@
             <w:r>
               <w:rPr>
                 <w:rFonts w:ascii="Consolas" w:cs="Consolas" w:eastAsia="Consolas" w:hAnsi="Consolas"/>
-                <w:sz w:val="17"/>
-                <w:szCs w:val="17"/>
+                <w:sz w:val="16"/>
+                <w:szCs w:val="16"/>
               </w:rPr>
               <w:t xml:space="preserve">tests/test_pipeline.py::test_duracion_teorica_cero_no_divide_por_cero PASSED [ 54%]</w:t>
             </w:r>
@@ -38625,8 +38417,8 @@
             <w:r>
               <w:rPr>
                 <w:rFonts w:ascii="Consolas" w:cs="Consolas" w:eastAsia="Consolas" w:hAnsi="Consolas"/>
-                <w:sz w:val="17"/>
-                <w:szCs w:val="17"/>
+                <w:sz w:val="16"/>
+                <w:szCs w:val="16"/>
               </w:rPr>
               <w:t xml:space="preserve">tests/test_pipeline.py::test_registro_sin_fecha_nacimiento_se_marca_atipico PASSED [ 59%]</w:t>
             </w:r>
@@ -38652,8 +38444,8 @@
             <w:r>
               <w:rPr>
                 <w:rFonts w:ascii="Consolas" w:cs="Consolas" w:eastAsia="Consolas" w:hAnsi="Consolas"/>
-                <w:sz w:val="17"/>
-                <w:szCs w:val="17"/>
+                <w:sz w:val="16"/>
+                <w:szCs w:val="16"/>
               </w:rPr>
               <w:t xml:space="preserve">tests/test_pipeline.py::test_archivos_faltantes_lanza_excepcion PASSED   [ 63%]</w:t>
             </w:r>
@@ -38679,8 +38471,8 @@
             <w:r>
               <w:rPr>
                 <w:rFonts w:ascii="Consolas" w:cs="Consolas" w:eastAsia="Consolas" w:hAnsi="Consolas"/>
-                <w:sz w:val="17"/>
-                <w:szCs w:val="17"/>
+                <w:sz w:val="16"/>
+                <w:szCs w:val="16"/>
               </w:rPr>
               <w:t xml:space="preserve">tests/test_pipeline.py::test_cargar_consolidado_inexistente PASSED       [ 68%]</w:t>
             </w:r>
@@ -38706,8 +38498,8 @@
             <w:r>
               <w:rPr>
                 <w:rFonts w:ascii="Consolas" w:cs="Consolas" w:eastAsia="Consolas" w:hAnsi="Consolas"/>
-                <w:sz w:val="17"/>
-                <w:szCs w:val="17"/>
+                <w:sz w:val="16"/>
+                <w:szCs w:val="16"/>
               </w:rPr>
               <w:t xml:space="preserve">tests/test_pipeline.py::test_validador_detecta_dataset_corrupto PASSED   [ 72%]</w:t>
             </w:r>
@@ -38733,8 +38525,8 @@
             <w:r>
               <w:rPr>
                 <w:rFonts w:ascii="Consolas" w:cs="Consolas" w:eastAsia="Consolas" w:hAnsi="Consolas"/>
-                <w:sz w:val="17"/>
-                <w:szCs w:val="17"/>
+                <w:sz w:val="16"/>
+                <w:szCs w:val="16"/>
               </w:rPr>
               <w:t xml:space="preserve">tests/test_pipeline.py::test_validador_aprueba_dataset_correcto PASSED   [ 77%]</w:t>
             </w:r>
@@ -38760,8 +38552,8 @@
             <w:r>
               <w:rPr>
                 <w:rFonts w:ascii="Consolas" w:cs="Consolas" w:eastAsia="Consolas" w:hAnsi="Consolas"/>
-                <w:sz w:val="17"/>
-                <w:szCs w:val="17"/>
+                <w:sz w:val="16"/>
+                <w:szCs w:val="16"/>
               </w:rPr>
               <w:t xml:space="preserve">tests/test_pipeline.py::test_estado_antes_de_ejecutar_lanza_error PASSED [ 81%]</w:t>
             </w:r>
@@ -38787,8 +38579,8 @@
             <w:r>
               <w:rPr>
                 <w:rFonts w:ascii="Consolas" w:cs="Consolas" w:eastAsia="Consolas" w:hAnsi="Consolas"/>
-                <w:sz w:val="17"/>
-                <w:szCs w:val="17"/>
+                <w:sz w:val="16"/>
+                <w:szCs w:val="16"/>
               </w:rPr>
               <w:t xml:space="preserve">tests/test_pipeline.py::test_regla_con_excepcion_se_reporta_como_falla PASSED [ 86%]</w:t>
             </w:r>
@@ -38814,8 +38606,8 @@
             <w:r>
               <w:rPr>
                 <w:rFonts w:ascii="Consolas" w:cs="Consolas" w:eastAsia="Consolas" w:hAnsi="Consolas"/>
-                <w:sz w:val="17"/>
-                <w:szCs w:val="17"/>
+                <w:sz w:val="16"/>
+                <w:szCs w:val="16"/>
               </w:rPr>
               <w:t xml:space="preserve">tests/test_pipeline.py::test_tabla_agregada_respeta_minimo_de_casos PASSED [ 90%]</w:t>
             </w:r>
@@ -38841,8 +38633,8 @@
             <w:r>
               <w:rPr>
                 <w:rFonts w:ascii="Consolas" w:cs="Consolas" w:eastAsia="Consolas" w:hAnsi="Consolas"/>
-                <w:sz w:val="17"/>
-                <w:szCs w:val="17"/>
+                <w:sz w:val="16"/>
+                <w:szCs w:val="16"/>
               </w:rPr>
               <w:t xml:space="preserve">tests/test_pipeline.py::test_formato_numerico_chileno PASSED             [ 95%]</w:t>
             </w:r>
@@ -38868,8 +38660,8 @@
             <w:r>
               <w:rPr>
                 <w:rFonts w:ascii="Consolas" w:cs="Consolas" w:eastAsia="Consolas" w:hAnsi="Consolas"/>
-                <w:sz w:val="17"/>
-                <w:szCs w:val="17"/>
+                <w:sz w:val="16"/>
+                <w:szCs w:val="16"/>
               </w:rPr>
               <w:t xml:space="preserve">tests/test_pipeline.py::test_configuracion_expone_versiones PASSED       [100%]</w:t>
             </w:r>
@@ -38895,8 +38687,8 @@
             <w:r>
               <w:rPr>
                 <w:rFonts w:ascii="Consolas" w:cs="Consolas" w:eastAsia="Consolas" w:hAnsi="Consolas"/>
-                <w:sz w:val="17"/>
-                <w:szCs w:val="17"/>
+                <w:sz w:val="16"/>
+                <w:szCs w:val="16"/>
               </w:rPr>
               <w:t xml:space="preserve"> </w:t>
             </w:r>
@@ -38922,8 +38714,8 @@
             <w:r>
               <w:rPr>
                 <w:rFonts w:ascii="Consolas" w:cs="Consolas" w:eastAsia="Consolas" w:hAnsi="Consolas"/>
-                <w:sz w:val="17"/>
-                <w:szCs w:val="17"/>
+                <w:sz w:val="16"/>
+                <w:szCs w:val="16"/>
               </w:rPr>
               <w:t xml:space="preserve">============================= 22 passed in 1.68s ==============================</w:t>
             </w:r>
@@ -38949,8 +38741,8 @@
             <w:r>
               <w:rPr>
                 <w:rFonts w:ascii="Consolas" w:cs="Consolas" w:eastAsia="Consolas" w:hAnsi="Consolas"/>
-                <w:sz w:val="17"/>
-                <w:szCs w:val="17"/>
+                <w:sz w:val="16"/>
+                <w:szCs w:val="16"/>
               </w:rPr>
               <w:t xml:space="preserve"> </w:t>
             </w:r>
@@ -39028,10 +38820,10 @@
             <w:r>
               <w:rPr>
                 <w:rFonts w:ascii="Consolas" w:cs="Consolas" w:eastAsia="Consolas" w:hAnsi="Consolas"/>
-                <w:sz w:val="17"/>
-                <w:szCs w:val="17"/>
-              </w:rPr>
-              <w:t xml:space="preserve">    15	Sebastian Antunez</w:t>
+                <w:sz w:val="16"/>
+                <w:szCs w:val="16"/>
+              </w:rPr>
+              <w:t xml:space="preserve">    16	Sebastian Antunez</w:t>
             </w:r>
           </w:p>
         </w:tc>
@@ -39055,8 +38847,8 @@
             <w:r>
               <w:rPr>
                 <w:rFonts w:ascii="Consolas" w:cs="Consolas" w:eastAsia="Consolas" w:hAnsi="Consolas"/>
-                <w:sz w:val="17"/>
-                <w:szCs w:val="17"/>
+                <w:sz w:val="16"/>
+                <w:szCs w:val="16"/>
               </w:rPr>
               <w:t xml:space="preserve"> </w:t>
             </w:r>
@@ -39131,8 +38923,8 @@
             <w:r>
               <w:rPr>
                 <w:rFonts w:ascii="Consolas" w:cs="Consolas" w:eastAsia="Consolas" w:hAnsi="Consolas"/>
-                <w:sz w:val="17"/>
-                <w:szCs w:val="17"/>
+                <w:sz w:val="16"/>
+                <w:szCs w:val="16"/>
               </w:rPr>
               <w:t xml:space="preserve"># 1. Clonar el repositorio</w:t>
             </w:r>
@@ -39158,8 +38950,8 @@
             <w:r>
               <w:rPr>
                 <w:rFonts w:ascii="Consolas" w:cs="Consolas" w:eastAsia="Consolas" w:hAnsi="Consolas"/>
-                <w:sz w:val="17"/>
-                <w:szCs w:val="17"/>
+                <w:sz w:val="16"/>
+                <w:szCs w:val="16"/>
               </w:rPr>
               <w:t xml:space="preserve">git clone «URL del repositorio»</w:t>
             </w:r>
@@ -39185,8 +38977,8 @@
             <w:r>
               <w:rPr>
                 <w:rFonts w:ascii="Consolas" w:cs="Consolas" w:eastAsia="Consolas" w:hAnsi="Consolas"/>
-                <w:sz w:val="17"/>
-                <w:szCs w:val="17"/>
+                <w:sz w:val="16"/>
+                <w:szCs w:val="16"/>
               </w:rPr>
               <w:t xml:space="preserve">cd proyecto-titulados</w:t>
             </w:r>
@@ -39212,8 +39004,8 @@
             <w:r>
               <w:rPr>
                 <w:rFonts w:ascii="Consolas" w:cs="Consolas" w:eastAsia="Consolas" w:hAnsi="Consolas"/>
-                <w:sz w:val="17"/>
-                <w:szCs w:val="17"/>
+                <w:sz w:val="16"/>
+                <w:szCs w:val="16"/>
               </w:rPr>
               <w:t xml:space="preserve"> </w:t>
             </w:r>
@@ -39239,8 +39031,8 @@
             <w:r>
               <w:rPr>
                 <w:rFonts w:ascii="Consolas" w:cs="Consolas" w:eastAsia="Consolas" w:hAnsi="Consolas"/>
-                <w:sz w:val="17"/>
-                <w:szCs w:val="17"/>
+                <w:sz w:val="16"/>
+                <w:szCs w:val="16"/>
               </w:rPr>
               <w:t xml:space="preserve"># 2. Crear el entorno virtual e instalar las dependencias</w:t>
             </w:r>
@@ -39266,8 +39058,8 @@
             <w:r>
               <w:rPr>
                 <w:rFonts w:ascii="Consolas" w:cs="Consolas" w:eastAsia="Consolas" w:hAnsi="Consolas"/>
-                <w:sz w:val="17"/>
-                <w:szCs w:val="17"/>
+                <w:sz w:val="16"/>
+                <w:szCs w:val="16"/>
               </w:rPr>
               <w:t xml:space="preserve">python -m venv .venv</w:t>
             </w:r>
@@ -39293,8 +39085,8 @@
             <w:r>
               <w:rPr>
                 <w:rFonts w:ascii="Consolas" w:cs="Consolas" w:eastAsia="Consolas" w:hAnsi="Consolas"/>
-                <w:sz w:val="17"/>
-                <w:szCs w:val="17"/>
+                <w:sz w:val="16"/>
+                <w:szCs w:val="16"/>
               </w:rPr>
               <w:t xml:space="preserve">.\.venv\Scripts\Activate.ps1</w:t>
             </w:r>
@@ -39320,8 +39112,8 @@
             <w:r>
               <w:rPr>
                 <w:rFonts w:ascii="Consolas" w:cs="Consolas" w:eastAsia="Consolas" w:hAnsi="Consolas"/>
-                <w:sz w:val="17"/>
-                <w:szCs w:val="17"/>
+                <w:sz w:val="16"/>
+                <w:szCs w:val="16"/>
               </w:rPr>
               <w:t xml:space="preserve">pip install -r requirements.txt</w:t>
             </w:r>
@@ -39347,8 +39139,8 @@
             <w:r>
               <w:rPr>
                 <w:rFonts w:ascii="Consolas" w:cs="Consolas" w:eastAsia="Consolas" w:hAnsi="Consolas"/>
-                <w:sz w:val="17"/>
-                <w:szCs w:val="17"/>
+                <w:sz w:val="16"/>
+                <w:szCs w:val="16"/>
               </w:rPr>
               <w:t xml:space="preserve"> </w:t>
             </w:r>
@@ -39374,8 +39166,8 @@
             <w:r>
               <w:rPr>
                 <w:rFonts w:ascii="Consolas" w:cs="Consolas" w:eastAsia="Consolas" w:hAnsi="Consolas"/>
-                <w:sz w:val="17"/>
-                <w:szCs w:val="17"/>
+                <w:sz w:val="16"/>
+                <w:szCs w:val="16"/>
               </w:rPr>
               <w:t xml:space="preserve"># 3. Descargar los seis CSV del SIES y dejarlos en data/raw/</w:t>
             </w:r>
@@ -39401,8 +39193,8 @@
             <w:r>
               <w:rPr>
                 <w:rFonts w:ascii="Consolas" w:cs="Consolas" w:eastAsia="Consolas" w:hAnsi="Consolas"/>
-                <w:sz w:val="17"/>
-                <w:szCs w:val="17"/>
+                <w:sz w:val="16"/>
+                <w:szCs w:val="16"/>
               </w:rPr>
               <w:t xml:space="preserve">#    (o definir la variable de entorno TITULADOS_RAW_DIR)</w:t>
             </w:r>
@@ -39428,8 +39220,8 @@
             <w:r>
               <w:rPr>
                 <w:rFonts w:ascii="Consolas" w:cs="Consolas" w:eastAsia="Consolas" w:hAnsi="Consolas"/>
-                <w:sz w:val="17"/>
-                <w:szCs w:val="17"/>
+                <w:sz w:val="16"/>
+                <w:szCs w:val="16"/>
               </w:rPr>
               <w:t xml:space="preserve"> </w:t>
             </w:r>
@@ -39455,8 +39247,8 @@
             <w:r>
               <w:rPr>
                 <w:rFonts w:ascii="Consolas" w:cs="Consolas" w:eastAsia="Consolas" w:hAnsi="Consolas"/>
-                <w:sz w:val="17"/>
-                <w:szCs w:val="17"/>
+                <w:sz w:val="16"/>
+                <w:szCs w:val="16"/>
               </w:rPr>
               <w:t xml:space="preserve"># 4. Verificar el entorno y ejecutar las pruebas</w:t>
             </w:r>
@@ -39482,8 +39274,8 @@
             <w:r>
               <w:rPr>
                 <w:rFonts w:ascii="Consolas" w:cs="Consolas" w:eastAsia="Consolas" w:hAnsi="Consolas"/>
-                <w:sz w:val="17"/>
-                <w:szCs w:val="17"/>
+                <w:sz w:val="16"/>
+                <w:szCs w:val="16"/>
               </w:rPr>
               <w:t xml:space="preserve">python -c "from src import config; print(config.describir_entorno())"</w:t>
             </w:r>
@@ -39509,8 +39301,8 @@
             <w:r>
               <w:rPr>
                 <w:rFonts w:ascii="Consolas" w:cs="Consolas" w:eastAsia="Consolas" w:hAnsi="Consolas"/>
-                <w:sz w:val="17"/>
-                <w:szCs w:val="17"/>
+                <w:sz w:val="16"/>
+                <w:szCs w:val="16"/>
               </w:rPr>
               <w:t xml:space="preserve">python -m pytest tests/ -v</w:t>
             </w:r>
@@ -39536,8 +39328,8 @@
             <w:r>
               <w:rPr>
                 <w:rFonts w:ascii="Consolas" w:cs="Consolas" w:eastAsia="Consolas" w:hAnsi="Consolas"/>
-                <w:sz w:val="17"/>
-                <w:szCs w:val="17"/>
+                <w:sz w:val="16"/>
+                <w:szCs w:val="16"/>
               </w:rPr>
               <w:t xml:space="preserve"> </w:t>
             </w:r>
@@ -39563,8 +39355,8 @@
             <w:r>
               <w:rPr>
                 <w:rFonts w:ascii="Consolas" w:cs="Consolas" w:eastAsia="Consolas" w:hAnsi="Consolas"/>
-                <w:sz w:val="17"/>
-                <w:szCs w:val="17"/>
+                <w:sz w:val="16"/>
+                <w:szCs w:val="16"/>
               </w:rPr>
               <w:t xml:space="preserve"># 5. Ejecutar el pipeline completo</w:t>
             </w:r>
@@ -39590,8 +39382,8 @@
             <w:r>
               <w:rPr>
                 <w:rFonts w:ascii="Consolas" w:cs="Consolas" w:eastAsia="Consolas" w:hAnsi="Consolas"/>
-                <w:sz w:val="17"/>
-                <w:szCs w:val="17"/>
+                <w:sz w:val="16"/>
+                <w:szCs w:val="16"/>
               </w:rPr>
               <w:t xml:space="preserve">python -m src.pipeline</w:t>
             </w:r>
@@ -39617,8 +39409,8 @@
             <w:r>
               <w:rPr>
                 <w:rFonts w:ascii="Consolas" w:cs="Consolas" w:eastAsia="Consolas" w:hAnsi="Consolas"/>
-                <w:sz w:val="17"/>
-                <w:szCs w:val="17"/>
+                <w:sz w:val="16"/>
+                <w:szCs w:val="16"/>
               </w:rPr>
               <w:t xml:space="preserve"> </w:t>
             </w:r>
@@ -39644,8 +39436,8 @@
             <w:r>
               <w:rPr>
                 <w:rFonts w:ascii="Consolas" w:cs="Consolas" w:eastAsia="Consolas" w:hAnsi="Consolas"/>
-                <w:sz w:val="17"/>
-                <w:szCs w:val="17"/>
+                <w:sz w:val="16"/>
+                <w:szCs w:val="16"/>
               </w:rPr>
               <w:t xml:space="preserve"># 6. Abrir los notebooks en orden: F1, F2_1, F2_2, F2_3</w:t>
             </w:r>
@@ -39671,8 +39463,8 @@
             <w:r>
               <w:rPr>
                 <w:rFonts w:ascii="Consolas" w:cs="Consolas" w:eastAsia="Consolas" w:hAnsi="Consolas"/>
-                <w:sz w:val="17"/>
-                <w:szCs w:val="17"/>
+                <w:sz w:val="16"/>
+                <w:szCs w:val="16"/>
               </w:rPr>
               <w:t xml:space="preserve">jupyter lab</w:t>
             </w:r>

</xml_diff>

<commit_message>
docs: actualiza el informe y el notebook F1 tras corregir la autoria
- Los 17 commits pasan a la cuenta institucional del autor, de modo que GitHub
  los atribuya al perfil correcto (evidencia de contribuciones individuales)
- El grafo de ramas del informe se lee ahora de informe/evidencias/git_graph.txt
  en lugar de estar copiado a mano, para que no vuelva a quedar desfasado
- Se regeneran las evidencias de ejecucion y se reejecuta el notebook F1

Co-Authored-By: Claude Opus 5 <noreply@anthropic.com>
</commit_message>
<xml_diff>
--- a/informe/f1_s01_evaluacion_entregable_grupox.docx
+++ b/informe/f1_s01_evaluacion_entregable_grupox.docx
@@ -7695,7 +7695,7 @@
                 <w:sz w:val="19"/>
                 <w:szCs w:val="19"/>
               </w:rPr>
-              <w:t xml:space="preserve">be52b95</w:t>
+              <w:t xml:space="preserve">b113334</w:t>
             </w:r>
           </w:p>
         </w:tc>
@@ -7751,7 +7751,7 @@
                 <w:sz w:val="19"/>
                 <w:szCs w:val="19"/>
               </w:rPr>
-              <w:t xml:space="preserve">style(viz): corrige la acentuacion de las etiquetas de los graficos</w:t>
+              <w:t xml:space="preserve">docs(informe): agrega el informe tecnico de las Fases 1 y 2</w:t>
             </w:r>
           </w:p>
         </w:tc>
@@ -7782,7 +7782,7 @@
                 <w:sz w:val="19"/>
                 <w:szCs w:val="19"/>
               </w:rPr>
-              <w:t xml:space="preserve">4954ad7</w:t>
+              <w:t xml:space="preserve">82f72f3</w:t>
             </w:r>
           </w:p>
         </w:tc>
@@ -7840,93 +7840,93 @@
                 <w:sz w:val="19"/>
                 <w:szCs w:val="19"/>
               </w:rPr>
+              <w:t xml:space="preserve">style(viz): corrige la acentuacion de las etiquetas de los graficos</w:t>
+            </w:r>
+          </w:p>
+        </w:tc>
+      </w:tr>
+      <w:tr>
+        <w:tc>
+          <w:tcPr>
+            <w:tcW w:type="dxa" w:w="1123"/>
+            <w:tcMar>
+              <w:top w:type="dxa" w:w="60"/>
+              <w:left w:type="dxa" w:w="100"/>
+              <w:bottom w:type="dxa" w:w="60"/>
+              <w:right w:type="dxa" w:w="100"/>
+            </w:tcMar>
+          </w:tcPr>
+          <w:p>
+            <w:pPr>
+              <w:spacing w:after="0" w:line="260"/>
+              <w:jc w:val="left"/>
+            </w:pPr>
+            <w:r>
+              <w:rPr>
+                <w:rFonts w:ascii="Calibri" w:cs="Calibri" w:eastAsia="Calibri" w:hAnsi="Calibri"/>
+                <w:b w:val="false"/>
+                <w:bCs w:val="false"/>
+                <w:color w:val="000000"/>
+                <w:sz w:val="19"/>
+                <w:szCs w:val="19"/>
+              </w:rPr>
+              <w:t xml:space="preserve">d64cac0</w:t>
+            </w:r>
+          </w:p>
+        </w:tc>
+        <w:tc>
+          <w:tcPr>
+            <w:tcW w:type="dxa" w:w="1404"/>
+            <w:tcMar>
+              <w:top w:type="dxa" w:w="60"/>
+              <w:left w:type="dxa" w:w="100"/>
+              <w:bottom w:type="dxa" w:w="60"/>
+              <w:right w:type="dxa" w:w="100"/>
+            </w:tcMar>
+          </w:tcPr>
+          <w:p>
+            <w:pPr>
+              <w:spacing w:after="0" w:line="260"/>
+              <w:jc w:val="left"/>
+            </w:pPr>
+            <w:r>
+              <w:rPr>
+                <w:rFonts w:ascii="Calibri" w:cs="Calibri" w:eastAsia="Calibri" w:hAnsi="Calibri"/>
+                <w:b w:val="false"/>
+                <w:bCs w:val="false"/>
+                <w:color w:val="000000"/>
+                <w:sz w:val="19"/>
+                <w:szCs w:val="19"/>
+              </w:rPr>
+              <w:t xml:space="preserve">2026-09-08</w:t>
+            </w:r>
+          </w:p>
+        </w:tc>
+        <w:tc>
+          <w:tcPr>
+            <w:tcW w:type="dxa" w:w="6833"/>
+            <w:tcMar>
+              <w:top w:type="dxa" w:w="60"/>
+              <w:left w:type="dxa" w:w="100"/>
+              <w:bottom w:type="dxa" w:w="60"/>
+              <w:right w:type="dxa" w:w="100"/>
+            </w:tcMar>
+          </w:tcPr>
+          <w:p>
+            <w:pPr>
+              <w:spacing w:after="0" w:line="260"/>
+              <w:jc w:val="left"/>
+            </w:pPr>
+            <w:r>
+              <w:rPr>
+                <w:rFonts w:ascii="Calibri" w:cs="Calibri" w:eastAsia="Calibri" w:hAnsi="Calibri"/>
+                <w:b w:val="false"/>
+                <w:bCs w:val="false"/>
+                <w:color w:val="000000"/>
+                <w:sz w:val="19"/>
+                <w:szCs w:val="19"/>
+              </w:rPr>
               <w:t xml:space="preserve">style(viz): rotula las figuras con formato numerico chileno</w:t>
-            </w:r>
-          </w:p>
-        </w:tc>
-      </w:tr>
-      <w:tr>
-        <w:tc>
-          <w:tcPr>
-            <w:tcW w:type="dxa" w:w="1123"/>
-            <w:tcMar>
-              <w:top w:type="dxa" w:w="60"/>
-              <w:left w:type="dxa" w:w="100"/>
-              <w:bottom w:type="dxa" w:w="60"/>
-              <w:right w:type="dxa" w:w="100"/>
-            </w:tcMar>
-          </w:tcPr>
-          <w:p>
-            <w:pPr>
-              <w:spacing w:after="0" w:line="260"/>
-              <w:jc w:val="left"/>
-            </w:pPr>
-            <w:r>
-              <w:rPr>
-                <w:rFonts w:ascii="Calibri" w:cs="Calibri" w:eastAsia="Calibri" w:hAnsi="Calibri"/>
-                <w:b w:val="false"/>
-                <w:bCs w:val="false"/>
-                <w:color w:val="000000"/>
-                <w:sz w:val="19"/>
-                <w:szCs w:val="19"/>
-              </w:rPr>
-              <w:t xml:space="preserve">43035f5</w:t>
-            </w:r>
-          </w:p>
-        </w:tc>
-        <w:tc>
-          <w:tcPr>
-            <w:tcW w:type="dxa" w:w="1404"/>
-            <w:tcMar>
-              <w:top w:type="dxa" w:w="60"/>
-              <w:left w:type="dxa" w:w="100"/>
-              <w:bottom w:type="dxa" w:w="60"/>
-              <w:right w:type="dxa" w:w="100"/>
-            </w:tcMar>
-          </w:tcPr>
-          <w:p>
-            <w:pPr>
-              <w:spacing w:after="0" w:line="260"/>
-              <w:jc w:val="left"/>
-            </w:pPr>
-            <w:r>
-              <w:rPr>
-                <w:rFonts w:ascii="Calibri" w:cs="Calibri" w:eastAsia="Calibri" w:hAnsi="Calibri"/>
-                <w:b w:val="false"/>
-                <w:bCs w:val="false"/>
-                <w:color w:val="000000"/>
-                <w:sz w:val="19"/>
-                <w:szCs w:val="19"/>
-              </w:rPr>
-              <w:t xml:space="preserve">2026-09-08</w:t>
-            </w:r>
-          </w:p>
-        </w:tc>
-        <w:tc>
-          <w:tcPr>
-            <w:tcW w:type="dxa" w:w="6833"/>
-            <w:tcMar>
-              <w:top w:type="dxa" w:w="60"/>
-              <w:left w:type="dxa" w:w="100"/>
-              <w:bottom w:type="dxa" w:w="60"/>
-              <w:right w:type="dxa" w:w="100"/>
-            </w:tcMar>
-          </w:tcPr>
-          <w:p>
-            <w:pPr>
-              <w:spacing w:after="0" w:line="260"/>
-              <w:jc w:val="left"/>
-            </w:pPr>
-            <w:r>
-              <w:rPr>
-                <w:rFonts w:ascii="Calibri" w:cs="Calibri" w:eastAsia="Calibri" w:hAnsi="Calibri"/>
-                <w:b w:val="false"/>
-                <w:bCs w:val="false"/>
-                <w:color w:val="000000"/>
-                <w:sz w:val="19"/>
-                <w:szCs w:val="19"/>
-              </w:rPr>
-              <w:t xml:space="preserve">merge: integra la rama fase-2/pipeline-datos en main</w:t>
             </w:r>
           </w:p>
         </w:tc>
@@ -7957,7 +7957,7 @@
                 <w:sz w:val="19"/>
                 <w:szCs w:val="19"/>
               </w:rPr>
-              <w:t xml:space="preserve">179960e</w:t>
+              <w:t xml:space="preserve">64c8e48</w:t>
             </w:r>
           </w:p>
         </w:tc>
@@ -8015,93 +8015,93 @@
                 <w:sz w:val="19"/>
                 <w:szCs w:val="19"/>
               </w:rPr>
+              <w:t xml:space="preserve">merge: integra la rama fase-2/pipeline-datos en main</w:t>
+            </w:r>
+          </w:p>
+        </w:tc>
+      </w:tr>
+      <w:tr>
+        <w:tc>
+          <w:tcPr>
+            <w:tcW w:type="dxa" w:w="1123"/>
+            <w:tcMar>
+              <w:top w:type="dxa" w:w="60"/>
+              <w:left w:type="dxa" w:w="100"/>
+              <w:bottom w:type="dxa" w:w="60"/>
+              <w:right w:type="dxa" w:w="100"/>
+            </w:tcMar>
+          </w:tcPr>
+          <w:p>
+            <w:pPr>
+              <w:spacing w:after="0" w:line="260"/>
+              <w:jc w:val="left"/>
+            </w:pPr>
+            <w:r>
+              <w:rPr>
+                <w:rFonts w:ascii="Calibri" w:cs="Calibri" w:eastAsia="Calibri" w:hAnsi="Calibri"/>
+                <w:b w:val="false"/>
+                <w:bCs w:val="false"/>
+                <w:color w:val="000000"/>
+                <w:sz w:val="19"/>
+                <w:szCs w:val="19"/>
+              </w:rPr>
+              <w:t xml:space="preserve">86aa78d</w:t>
+            </w:r>
+          </w:p>
+        </w:tc>
+        <w:tc>
+          <w:tcPr>
+            <w:tcW w:type="dxa" w:w="1404"/>
+            <w:tcMar>
+              <w:top w:type="dxa" w:w="60"/>
+              <w:left w:type="dxa" w:w="100"/>
+              <w:bottom w:type="dxa" w:w="60"/>
+              <w:right w:type="dxa" w:w="100"/>
+            </w:tcMar>
+          </w:tcPr>
+          <w:p>
+            <w:pPr>
+              <w:spacing w:after="0" w:line="260"/>
+              <w:jc w:val="left"/>
+            </w:pPr>
+            <w:r>
+              <w:rPr>
+                <w:rFonts w:ascii="Calibri" w:cs="Calibri" w:eastAsia="Calibri" w:hAnsi="Calibri"/>
+                <w:b w:val="false"/>
+                <w:bCs w:val="false"/>
+                <w:color w:val="000000"/>
+                <w:sz w:val="19"/>
+                <w:szCs w:val="19"/>
+              </w:rPr>
+              <w:t xml:space="preserve">2026-09-08</w:t>
+            </w:r>
+          </w:p>
+        </w:tc>
+        <w:tc>
+          <w:tcPr>
+            <w:tcW w:type="dxa" w:w="6833"/>
+            <w:tcMar>
+              <w:top w:type="dxa" w:w="60"/>
+              <w:left w:type="dxa" w:w="100"/>
+              <w:bottom w:type="dxa" w:w="60"/>
+              <w:right w:type="dxa" w:w="100"/>
+            </w:tcMar>
+          </w:tcPr>
+          <w:p>
+            <w:pPr>
+              <w:spacing w:after="0" w:line="260"/>
+              <w:jc w:val="left"/>
+            </w:pPr>
+            <w:r>
+              <w:rPr>
+                <w:rFonts w:ascii="Calibri" w:cs="Calibri" w:eastAsia="Calibri" w:hAnsi="Calibri"/>
+                <w:b w:val="false"/>
+                <w:bCs w:val="false"/>
+                <w:color w:val="000000"/>
+                <w:sz w:val="19"/>
+                <w:szCs w:val="19"/>
+              </w:rPr>
               <w:t xml:space="preserve">docs(f2): ejecuta los notebooks y versiona figuras, tablas y muestra</w:t>
-            </w:r>
-          </w:p>
-        </w:tc>
-      </w:tr>
-      <w:tr>
-        <w:tc>
-          <w:tcPr>
-            <w:tcW w:type="dxa" w:w="1123"/>
-            <w:tcMar>
-              <w:top w:type="dxa" w:w="60"/>
-              <w:left w:type="dxa" w:w="100"/>
-              <w:bottom w:type="dxa" w:w="60"/>
-              <w:right w:type="dxa" w:w="100"/>
-            </w:tcMar>
-          </w:tcPr>
-          <w:p>
-            <w:pPr>
-              <w:spacing w:after="0" w:line="260"/>
-              <w:jc w:val="left"/>
-            </w:pPr>
-            <w:r>
-              <w:rPr>
-                <w:rFonts w:ascii="Calibri" w:cs="Calibri" w:eastAsia="Calibri" w:hAnsi="Calibri"/>
-                <w:b w:val="false"/>
-                <w:bCs w:val="false"/>
-                <w:color w:val="000000"/>
-                <w:sz w:val="19"/>
-                <w:szCs w:val="19"/>
-              </w:rPr>
-              <w:t xml:space="preserve">a95bdd3</w:t>
-            </w:r>
-          </w:p>
-        </w:tc>
-        <w:tc>
-          <w:tcPr>
-            <w:tcW w:type="dxa" w:w="1404"/>
-            <w:tcMar>
-              <w:top w:type="dxa" w:w="60"/>
-              <w:left w:type="dxa" w:w="100"/>
-              <w:bottom w:type="dxa" w:w="60"/>
-              <w:right w:type="dxa" w:w="100"/>
-            </w:tcMar>
-          </w:tcPr>
-          <w:p>
-            <w:pPr>
-              <w:spacing w:after="0" w:line="260"/>
-              <w:jc w:val="left"/>
-            </w:pPr>
-            <w:r>
-              <w:rPr>
-                <w:rFonts w:ascii="Calibri" w:cs="Calibri" w:eastAsia="Calibri" w:hAnsi="Calibri"/>
-                <w:b w:val="false"/>
-                <w:bCs w:val="false"/>
-                <w:color w:val="000000"/>
-                <w:sz w:val="19"/>
-                <w:szCs w:val="19"/>
-              </w:rPr>
-              <w:t xml:space="preserve">2026-09-08</w:t>
-            </w:r>
-          </w:p>
-        </w:tc>
-        <w:tc>
-          <w:tcPr>
-            <w:tcW w:type="dxa" w:w="6833"/>
-            <w:tcMar>
-              <w:top w:type="dxa" w:w="60"/>
-              <w:left w:type="dxa" w:w="100"/>
-              <w:bottom w:type="dxa" w:w="60"/>
-              <w:right w:type="dxa" w:w="100"/>
-            </w:tcMar>
-          </w:tcPr>
-          <w:p>
-            <w:pPr>
-              <w:spacing w:after="0" w:line="260"/>
-              <w:jc w:val="left"/>
-            </w:pPr>
-            <w:r>
-              <w:rPr>
-                <w:rFonts w:ascii="Calibri" w:cs="Calibri" w:eastAsia="Calibri" w:hAnsi="Calibri"/>
-                <w:b w:val="false"/>
-                <w:bCs w:val="false"/>
-                <w:color w:val="000000"/>
-                <w:sz w:val="19"/>
-                <w:szCs w:val="19"/>
-              </w:rPr>
-              <w:t xml:space="preserve">perf(limpieza): normaliza el catalogo de categorias en vez de fila por fila</w:t>
             </w:r>
           </w:p>
         </w:tc>
@@ -8132,7 +8132,7 @@
                 <w:sz w:val="19"/>
                 <w:szCs w:val="19"/>
               </w:rPr>
-              <w:t xml:space="preserve">daf70dd</w:t>
+              <w:t xml:space="preserve">9a58f78</w:t>
             </w:r>
           </w:p>
         </w:tc>
@@ -8190,93 +8190,93 @@
                 <w:sz w:val="19"/>
                 <w:szCs w:val="19"/>
               </w:rPr>
+              <w:t xml:space="preserve">perf(limpieza): normaliza el catalogo de categorias en vez de fila por fila</w:t>
+            </w:r>
+          </w:p>
+        </w:tc>
+      </w:tr>
+      <w:tr>
+        <w:tc>
+          <w:tcPr>
+            <w:tcW w:type="dxa" w:w="1123"/>
+            <w:tcMar>
+              <w:top w:type="dxa" w:w="60"/>
+              <w:left w:type="dxa" w:w="100"/>
+              <w:bottom w:type="dxa" w:w="60"/>
+              <w:right w:type="dxa" w:w="100"/>
+            </w:tcMar>
+          </w:tcPr>
+          <w:p>
+            <w:pPr>
+              <w:spacing w:after="0" w:line="260"/>
+              <w:jc w:val="left"/>
+            </w:pPr>
+            <w:r>
+              <w:rPr>
+                <w:rFonts w:ascii="Calibri" w:cs="Calibri" w:eastAsia="Calibri" w:hAnsi="Calibri"/>
+                <w:b w:val="false"/>
+                <w:bCs w:val="false"/>
+                <w:color w:val="000000"/>
+                <w:sz w:val="19"/>
+                <w:szCs w:val="19"/>
+              </w:rPr>
+              <w:t xml:space="preserve">d41cc30</w:t>
+            </w:r>
+          </w:p>
+        </w:tc>
+        <w:tc>
+          <w:tcPr>
+            <w:tcW w:type="dxa" w:w="1404"/>
+            <w:tcMar>
+              <w:top w:type="dxa" w:w="60"/>
+              <w:left w:type="dxa" w:w="100"/>
+              <w:bottom w:type="dxa" w:w="60"/>
+              <w:right w:type="dxa" w:w="100"/>
+            </w:tcMar>
+          </w:tcPr>
+          <w:p>
+            <w:pPr>
+              <w:spacing w:after="0" w:line="260"/>
+              <w:jc w:val="left"/>
+            </w:pPr>
+            <w:r>
+              <w:rPr>
+                <w:rFonts w:ascii="Calibri" w:cs="Calibri" w:eastAsia="Calibri" w:hAnsi="Calibri"/>
+                <w:b w:val="false"/>
+                <w:bCs w:val="false"/>
+                <w:color w:val="000000"/>
+                <w:sz w:val="19"/>
+                <w:szCs w:val="19"/>
+              </w:rPr>
+              <w:t xml:space="preserve">2026-09-08</w:t>
+            </w:r>
+          </w:p>
+        </w:tc>
+        <w:tc>
+          <w:tcPr>
+            <w:tcW w:type="dxa" w:w="6833"/>
+            <w:tcMar>
+              <w:top w:type="dxa" w:w="60"/>
+              <w:left w:type="dxa" w:w="100"/>
+              <w:bottom w:type="dxa" w:w="60"/>
+              <w:right w:type="dxa" w:w="100"/>
+            </w:tcMar>
+          </w:tcPr>
+          <w:p>
+            <w:pPr>
+              <w:spacing w:after="0" w:line="260"/>
+              <w:jc w:val="left"/>
+            </w:pPr>
+            <w:r>
+              <w:rPr>
+                <w:rFonts w:ascii="Calibri" w:cs="Calibri" w:eastAsia="Calibri" w:hAnsi="Calibri"/>
+                <w:b w:val="false"/>
+                <w:bCs w:val="false"/>
+                <w:color w:val="000000"/>
+                <w:sz w:val="19"/>
+                <w:szCs w:val="19"/>
+              </w:rPr>
               <w:t xml:space="preserve">fix(viz,transformacion): compatibilidad con los tipos anulables de pandas</w:t>
-            </w:r>
-          </w:p>
-        </w:tc>
-      </w:tr>
-      <w:tr>
-        <w:tc>
-          <w:tcPr>
-            <w:tcW w:type="dxa" w:w="1123"/>
-            <w:tcMar>
-              <w:top w:type="dxa" w:w="60"/>
-              <w:left w:type="dxa" w:w="100"/>
-              <w:bottom w:type="dxa" w:w="60"/>
-              <w:right w:type="dxa" w:w="100"/>
-            </w:tcMar>
-          </w:tcPr>
-          <w:p>
-            <w:pPr>
-              <w:spacing w:after="0" w:line="260"/>
-              <w:jc w:val="left"/>
-            </w:pPr>
-            <w:r>
-              <w:rPr>
-                <w:rFonts w:ascii="Calibri" w:cs="Calibri" w:eastAsia="Calibri" w:hAnsi="Calibri"/>
-                <w:b w:val="false"/>
-                <w:bCs w:val="false"/>
-                <w:color w:val="000000"/>
-                <w:sz w:val="19"/>
-                <w:szCs w:val="19"/>
-              </w:rPr>
-              <w:t xml:space="preserve">1b4b202</w:t>
-            </w:r>
-          </w:p>
-        </w:tc>
-        <w:tc>
-          <w:tcPr>
-            <w:tcW w:type="dxa" w:w="1404"/>
-            <w:tcMar>
-              <w:top w:type="dxa" w:w="60"/>
-              <w:left w:type="dxa" w:w="100"/>
-              <w:bottom w:type="dxa" w:w="60"/>
-              <w:right w:type="dxa" w:w="100"/>
-            </w:tcMar>
-          </w:tcPr>
-          <w:p>
-            <w:pPr>
-              <w:spacing w:after="0" w:line="260"/>
-              <w:jc w:val="left"/>
-            </w:pPr>
-            <w:r>
-              <w:rPr>
-                <w:rFonts w:ascii="Calibri" w:cs="Calibri" w:eastAsia="Calibri" w:hAnsi="Calibri"/>
-                <w:b w:val="false"/>
-                <w:bCs w:val="false"/>
-                <w:color w:val="000000"/>
-                <w:sz w:val="19"/>
-                <w:szCs w:val="19"/>
-              </w:rPr>
-              <w:t xml:space="preserve">2026-09-08</w:t>
-            </w:r>
-          </w:p>
-        </w:tc>
-        <w:tc>
-          <w:tcPr>
-            <w:tcW w:type="dxa" w:w="6833"/>
-            <w:tcMar>
-              <w:top w:type="dxa" w:w="60"/>
-              <w:left w:type="dxa" w:w="100"/>
-              <w:bottom w:type="dxa" w:w="60"/>
-              <w:right w:type="dxa" w:w="100"/>
-            </w:tcMar>
-          </w:tcPr>
-          <w:p>
-            <w:pPr>
-              <w:spacing w:after="0" w:line="260"/>
-              <w:jc w:val="left"/>
-            </w:pPr>
-            <w:r>
-              <w:rPr>
-                <w:rFonts w:ascii="Calibri" w:cs="Calibri" w:eastAsia="Calibri" w:hAnsi="Calibri"/>
-                <w:b w:val="false"/>
-                <w:bCs w:val="false"/>
-                <w:color w:val="000000"/>
-                <w:sz w:val="19"/>
-                <w:szCs w:val="19"/>
-              </w:rPr>
-              <w:t xml:space="preserve">docs(f2): notebooks de obtencion, limpieza, transformacion y validacion</w:t>
             </w:r>
           </w:p>
         </w:tc>
@@ -8307,7 +8307,7 @@
                 <w:sz w:val="19"/>
                 <w:szCs w:val="19"/>
               </w:rPr>
-              <w:t xml:space="preserve">5b3cb36</w:t>
+              <w:t xml:space="preserve">1e0a197</w:t>
             </w:r>
           </w:p>
         </w:tc>
@@ -8365,93 +8365,93 @@
                 <w:sz w:val="19"/>
                 <w:szCs w:val="19"/>
               </w:rPr>
+              <w:t xml:space="preserve">docs(f2): notebooks de obtencion, limpieza, transformacion y validacion</w:t>
+            </w:r>
+          </w:p>
+        </w:tc>
+      </w:tr>
+      <w:tr>
+        <w:tc>
+          <w:tcPr>
+            <w:tcW w:type="dxa" w:w="1123"/>
+            <w:tcMar>
+              <w:top w:type="dxa" w:w="60"/>
+              <w:left w:type="dxa" w:w="100"/>
+              <w:bottom w:type="dxa" w:w="60"/>
+              <w:right w:type="dxa" w:w="100"/>
+            </w:tcMar>
+          </w:tcPr>
+          <w:p>
+            <w:pPr>
+              <w:spacing w:after="0" w:line="260"/>
+              <w:jc w:val="left"/>
+            </w:pPr>
+            <w:r>
+              <w:rPr>
+                <w:rFonts w:ascii="Calibri" w:cs="Calibri" w:eastAsia="Calibri" w:hAnsi="Calibri"/>
+                <w:b w:val="false"/>
+                <w:bCs w:val="false"/>
+                <w:color w:val="000000"/>
+                <w:sz w:val="19"/>
+                <w:szCs w:val="19"/>
+              </w:rPr>
+              <w:t xml:space="preserve">0dbee5a</w:t>
+            </w:r>
+          </w:p>
+        </w:tc>
+        <w:tc>
+          <w:tcPr>
+            <w:tcW w:type="dxa" w:w="1404"/>
+            <w:tcMar>
+              <w:top w:type="dxa" w:w="60"/>
+              <w:left w:type="dxa" w:w="100"/>
+              <w:bottom w:type="dxa" w:w="60"/>
+              <w:right w:type="dxa" w:w="100"/>
+            </w:tcMar>
+          </w:tcPr>
+          <w:p>
+            <w:pPr>
+              <w:spacing w:after="0" w:line="260"/>
+              <w:jc w:val="left"/>
+            </w:pPr>
+            <w:r>
+              <w:rPr>
+                <w:rFonts w:ascii="Calibri" w:cs="Calibri" w:eastAsia="Calibri" w:hAnsi="Calibri"/>
+                <w:b w:val="false"/>
+                <w:bCs w:val="false"/>
+                <w:color w:val="000000"/>
+                <w:sz w:val="19"/>
+                <w:szCs w:val="19"/>
+              </w:rPr>
+              <w:t xml:space="preserve">2026-09-08</w:t>
+            </w:r>
+          </w:p>
+        </w:tc>
+        <w:tc>
+          <w:tcPr>
+            <w:tcW w:type="dxa" w:w="6833"/>
+            <w:tcMar>
+              <w:top w:type="dxa" w:w="60"/>
+              <w:left w:type="dxa" w:w="100"/>
+              <w:bottom w:type="dxa" w:w="60"/>
+              <w:right w:type="dxa" w:w="100"/>
+            </w:tcMar>
+          </w:tcPr>
+          <w:p>
+            <w:pPr>
+              <w:spacing w:after="0" w:line="260"/>
+              <w:jc w:val="left"/>
+            </w:pPr>
+            <w:r>
+              <w:rPr>
+                <w:rFonts w:ascii="Calibri" w:cs="Calibri" w:eastAsia="Calibri" w:hAnsi="Calibri"/>
+                <w:b w:val="false"/>
+                <w:bCs w:val="false"/>
+                <w:color w:val="000000"/>
+                <w:sz w:val="19"/>
+                <w:szCs w:val="19"/>
+              </w:rPr>
               <w:t xml:space="preserve">docs(f1): notebook de definicion del proyecto y entorno reproducible</w:t>
-            </w:r>
-          </w:p>
-        </w:tc>
-      </w:tr>
-      <w:tr>
-        <w:tc>
-          <w:tcPr>
-            <w:tcW w:type="dxa" w:w="1123"/>
-            <w:tcMar>
-              <w:top w:type="dxa" w:w="60"/>
-              <w:left w:type="dxa" w:w="100"/>
-              <w:bottom w:type="dxa" w:w="60"/>
-              <w:right w:type="dxa" w:w="100"/>
-            </w:tcMar>
-          </w:tcPr>
-          <w:p>
-            <w:pPr>
-              <w:spacing w:after="0" w:line="260"/>
-              <w:jc w:val="left"/>
-            </w:pPr>
-            <w:r>
-              <w:rPr>
-                <w:rFonts w:ascii="Calibri" w:cs="Calibri" w:eastAsia="Calibri" w:hAnsi="Calibri"/>
-                <w:b w:val="false"/>
-                <w:bCs w:val="false"/>
-                <w:color w:val="000000"/>
-                <w:sz w:val="19"/>
-                <w:szCs w:val="19"/>
-              </w:rPr>
-              <w:t xml:space="preserve">cbd0486</w:t>
-            </w:r>
-          </w:p>
-        </w:tc>
-        <w:tc>
-          <w:tcPr>
-            <w:tcW w:type="dxa" w:w="1404"/>
-            <w:tcMar>
-              <w:top w:type="dxa" w:w="60"/>
-              <w:left w:type="dxa" w:w="100"/>
-              <w:bottom w:type="dxa" w:w="60"/>
-              <w:right w:type="dxa" w:w="100"/>
-            </w:tcMar>
-          </w:tcPr>
-          <w:p>
-            <w:pPr>
-              <w:spacing w:after="0" w:line="260"/>
-              <w:jc w:val="left"/>
-            </w:pPr>
-            <w:r>
-              <w:rPr>
-                <w:rFonts w:ascii="Calibri" w:cs="Calibri" w:eastAsia="Calibri" w:hAnsi="Calibri"/>
-                <w:b w:val="false"/>
-                <w:bCs w:val="false"/>
-                <w:color w:val="000000"/>
-                <w:sz w:val="19"/>
-                <w:szCs w:val="19"/>
-              </w:rPr>
-              <w:t xml:space="preserve">2026-09-08</w:t>
-            </w:r>
-          </w:p>
-        </w:tc>
-        <w:tc>
-          <w:tcPr>
-            <w:tcW w:type="dxa" w:w="6833"/>
-            <w:tcMar>
-              <w:top w:type="dxa" w:w="60"/>
-              <w:left w:type="dxa" w:w="100"/>
-              <w:bottom w:type="dxa" w:w="60"/>
-              <w:right w:type="dxa" w:w="100"/>
-            </w:tcMar>
-          </w:tcPr>
-          <w:p>
-            <w:pPr>
-              <w:spacing w:after="0" w:line="260"/>
-              <w:jc w:val="left"/>
-            </w:pPr>
-            <w:r>
-              <w:rPr>
-                <w:rFonts w:ascii="Calibri" w:cs="Calibri" w:eastAsia="Calibri" w:hAnsi="Calibri"/>
-                <w:b w:val="false"/>
-                <w:bCs w:val="false"/>
-                <w:color w:val="000000"/>
-                <w:sz w:val="19"/>
-                <w:szCs w:val="19"/>
-              </w:rPr>
-              <w:t xml:space="preserve">feat(viz,pipeline): estilo unificado de figuras y orquestador ejecutable</w:t>
             </w:r>
           </w:p>
         </w:tc>
@@ -8482,7 +8482,7 @@
                 <w:sz w:val="19"/>
                 <w:szCs w:val="19"/>
               </w:rPr>
-              <w:t xml:space="preserve">34bac9d</w:t>
+              <w:t xml:space="preserve">06cb784</w:t>
             </w:r>
           </w:p>
         </w:tc>
@@ -8540,93 +8540,93 @@
                 <w:sz w:val="19"/>
                 <w:szCs w:val="19"/>
               </w:rPr>
+              <w:t xml:space="preserve">feat(viz,pipeline): estilo unificado de figuras y orquestador ejecutable</w:t>
+            </w:r>
+          </w:p>
+        </w:tc>
+      </w:tr>
+      <w:tr>
+        <w:tc>
+          <w:tcPr>
+            <w:tcW w:type="dxa" w:w="1123"/>
+            <w:tcMar>
+              <w:top w:type="dxa" w:w="60"/>
+              <w:left w:type="dxa" w:w="100"/>
+              <w:bottom w:type="dxa" w:w="60"/>
+              <w:right w:type="dxa" w:w="100"/>
+            </w:tcMar>
+          </w:tcPr>
+          <w:p>
+            <w:pPr>
+              <w:spacing w:after="0" w:line="260"/>
+              <w:jc w:val="left"/>
+            </w:pPr>
+            <w:r>
+              <w:rPr>
+                <w:rFonts w:ascii="Calibri" w:cs="Calibri" w:eastAsia="Calibri" w:hAnsi="Calibri"/>
+                <w:b w:val="false"/>
+                <w:bCs w:val="false"/>
+                <w:color w:val="000000"/>
+                <w:sz w:val="19"/>
+                <w:szCs w:val="19"/>
+              </w:rPr>
+              <w:t xml:space="preserve">6c0e566</w:t>
+            </w:r>
+          </w:p>
+        </w:tc>
+        <w:tc>
+          <w:tcPr>
+            <w:tcW w:type="dxa" w:w="1404"/>
+            <w:tcMar>
+              <w:top w:type="dxa" w:w="60"/>
+              <w:left w:type="dxa" w:w="100"/>
+              <w:bottom w:type="dxa" w:w="60"/>
+              <w:right w:type="dxa" w:w="100"/>
+            </w:tcMar>
+          </w:tcPr>
+          <w:p>
+            <w:pPr>
+              <w:spacing w:after="0" w:line="260"/>
+              <w:jc w:val="left"/>
+            </w:pPr>
+            <w:r>
+              <w:rPr>
+                <w:rFonts w:ascii="Calibri" w:cs="Calibri" w:eastAsia="Calibri" w:hAnsi="Calibri"/>
+                <w:b w:val="false"/>
+                <w:bCs w:val="false"/>
+                <w:color w:val="000000"/>
+                <w:sz w:val="19"/>
+                <w:szCs w:val="19"/>
+              </w:rPr>
+              <w:t xml:space="preserve">2026-09-08</w:t>
+            </w:r>
+          </w:p>
+        </w:tc>
+        <w:tc>
+          <w:tcPr>
+            <w:tcW w:type="dxa" w:w="6833"/>
+            <w:tcMar>
+              <w:top w:type="dxa" w:w="60"/>
+              <w:left w:type="dxa" w:w="100"/>
+              <w:bottom w:type="dxa" w:w="60"/>
+              <w:right w:type="dxa" w:w="100"/>
+            </w:tcMar>
+          </w:tcPr>
+          <w:p>
+            <w:pPr>
+              <w:spacing w:after="0" w:line="260"/>
+              <w:jc w:val="left"/>
+            </w:pPr>
+            <w:r>
+              <w:rPr>
+                <w:rFonts w:ascii="Calibri" w:cs="Calibri" w:eastAsia="Calibri" w:hAnsi="Calibri"/>
+                <w:b w:val="false"/>
+                <w:bCs w:val="false"/>
+                <w:color w:val="000000"/>
+                <w:sz w:val="19"/>
+                <w:szCs w:val="19"/>
+              </w:rPr>
               <w:t xml:space="preserve">test: cubre casos normales, limite y excepciones del pipeline</w:t>
-            </w:r>
-          </w:p>
-        </w:tc>
-      </w:tr>
-      <w:tr>
-        <w:tc>
-          <w:tcPr>
-            <w:tcW w:type="dxa" w:w="1123"/>
-            <w:tcMar>
-              <w:top w:type="dxa" w:w="60"/>
-              <w:left w:type="dxa" w:w="100"/>
-              <w:bottom w:type="dxa" w:w="60"/>
-              <w:right w:type="dxa" w:w="100"/>
-            </w:tcMar>
-          </w:tcPr>
-          <w:p>
-            <w:pPr>
-              <w:spacing w:after="0" w:line="260"/>
-              <w:jc w:val="left"/>
-            </w:pPr>
-            <w:r>
-              <w:rPr>
-                <w:rFonts w:ascii="Calibri" w:cs="Calibri" w:eastAsia="Calibri" w:hAnsi="Calibri"/>
-                <w:b w:val="false"/>
-                <w:bCs w:val="false"/>
-                <w:color w:val="000000"/>
-                <w:sz w:val="19"/>
-                <w:szCs w:val="19"/>
-              </w:rPr>
-              <w:t xml:space="preserve">36126c1</w:t>
-            </w:r>
-          </w:p>
-        </w:tc>
-        <w:tc>
-          <w:tcPr>
-            <w:tcW w:type="dxa" w:w="1404"/>
-            <w:tcMar>
-              <w:top w:type="dxa" w:w="60"/>
-              <w:left w:type="dxa" w:w="100"/>
-              <w:bottom w:type="dxa" w:w="60"/>
-              <w:right w:type="dxa" w:w="100"/>
-            </w:tcMar>
-          </w:tcPr>
-          <w:p>
-            <w:pPr>
-              <w:spacing w:after="0" w:line="260"/>
-              <w:jc w:val="left"/>
-            </w:pPr>
-            <w:r>
-              <w:rPr>
-                <w:rFonts w:ascii="Calibri" w:cs="Calibri" w:eastAsia="Calibri" w:hAnsi="Calibri"/>
-                <w:b w:val="false"/>
-                <w:bCs w:val="false"/>
-                <w:color w:val="000000"/>
-                <w:sz w:val="19"/>
-                <w:szCs w:val="19"/>
-              </w:rPr>
-              <w:t xml:space="preserve">2026-09-08</w:t>
-            </w:r>
-          </w:p>
-        </w:tc>
-        <w:tc>
-          <w:tcPr>
-            <w:tcW w:type="dxa" w:w="6833"/>
-            <w:tcMar>
-              <w:top w:type="dxa" w:w="60"/>
-              <w:left w:type="dxa" w:w="100"/>
-              <w:bottom w:type="dxa" w:w="60"/>
-              <w:right w:type="dxa" w:w="100"/>
-            </w:tcMar>
-          </w:tcPr>
-          <w:p>
-            <w:pPr>
-              <w:spacing w:after="0" w:line="260"/>
-              <w:jc w:val="left"/>
-            </w:pPr>
-            <w:r>
-              <w:rPr>
-                <w:rFonts w:ascii="Calibri" w:cs="Calibri" w:eastAsia="Calibri" w:hAnsi="Calibri"/>
-                <w:b w:val="false"/>
-                <w:bCs w:val="false"/>
-                <w:color w:val="000000"/>
-                <w:sz w:val="19"/>
-                <w:szCs w:val="19"/>
-              </w:rPr>
-              <w:t xml:space="preserve">feat(validacion): motor de reglas orientado a objetos</w:t>
             </w:r>
           </w:p>
         </w:tc>
@@ -8657,7 +8657,7 @@
                 <w:sz w:val="19"/>
                 <w:szCs w:val="19"/>
               </w:rPr>
-              <w:t xml:space="preserve">ffa9c2e</w:t>
+              <w:t xml:space="preserve">280fb6c</w:t>
             </w:r>
           </w:p>
         </w:tc>
@@ -8715,93 +8715,93 @@
                 <w:sz w:val="19"/>
                 <w:szCs w:val="19"/>
               </w:rPr>
+              <w:t xml:space="preserve">feat(validacion): motor de reglas orientado a objetos</w:t>
+            </w:r>
+          </w:p>
+        </w:tc>
+      </w:tr>
+      <w:tr>
+        <w:tc>
+          <w:tcPr>
+            <w:tcW w:type="dxa" w:w="1123"/>
+            <w:tcMar>
+              <w:top w:type="dxa" w:w="60"/>
+              <w:left w:type="dxa" w:w="100"/>
+              <w:bottom w:type="dxa" w:w="60"/>
+              <w:right w:type="dxa" w:w="100"/>
+            </w:tcMar>
+          </w:tcPr>
+          <w:p>
+            <w:pPr>
+              <w:spacing w:after="0" w:line="260"/>
+              <w:jc w:val="left"/>
+            </w:pPr>
+            <w:r>
+              <w:rPr>
+                <w:rFonts w:ascii="Calibri" w:cs="Calibri" w:eastAsia="Calibri" w:hAnsi="Calibri"/>
+                <w:b w:val="false"/>
+                <w:bCs w:val="false"/>
+                <w:color w:val="000000"/>
+                <w:sz w:val="19"/>
+                <w:szCs w:val="19"/>
+              </w:rPr>
+              <w:t xml:space="preserve">0e125ee</w:t>
+            </w:r>
+          </w:p>
+        </w:tc>
+        <w:tc>
+          <w:tcPr>
+            <w:tcW w:type="dxa" w:w="1404"/>
+            <w:tcMar>
+              <w:top w:type="dxa" w:w="60"/>
+              <w:left w:type="dxa" w:w="100"/>
+              <w:bottom w:type="dxa" w:w="60"/>
+              <w:right w:type="dxa" w:w="100"/>
+            </w:tcMar>
+          </w:tcPr>
+          <w:p>
+            <w:pPr>
+              <w:spacing w:after="0" w:line="260"/>
+              <w:jc w:val="left"/>
+            </w:pPr>
+            <w:r>
+              <w:rPr>
+                <w:rFonts w:ascii="Calibri" w:cs="Calibri" w:eastAsia="Calibri" w:hAnsi="Calibri"/>
+                <w:b w:val="false"/>
+                <w:bCs w:val="false"/>
+                <w:color w:val="000000"/>
+                <w:sz w:val="19"/>
+                <w:szCs w:val="19"/>
+              </w:rPr>
+              <w:t xml:space="preserve">2026-09-08</w:t>
+            </w:r>
+          </w:p>
+        </w:tc>
+        <w:tc>
+          <w:tcPr>
+            <w:tcW w:type="dxa" w:w="6833"/>
+            <w:tcMar>
+              <w:top w:type="dxa" w:w="60"/>
+              <w:left w:type="dxa" w:w="100"/>
+              <w:bottom w:type="dxa" w:w="60"/>
+              <w:right w:type="dxa" w:w="100"/>
+            </w:tcMar>
+          </w:tcPr>
+          <w:p>
+            <w:pPr>
+              <w:spacing w:after="0" w:line="260"/>
+              <w:jc w:val="left"/>
+            </w:pPr>
+            <w:r>
+              <w:rPr>
+                <w:rFonts w:ascii="Calibri" w:cs="Calibri" w:eastAsia="Calibri" w:hAnsi="Calibri"/>
+                <w:b w:val="false"/>
+                <w:bCs w:val="false"/>
+                <w:color w:val="000000"/>
+                <w:sz w:val="19"/>
+                <w:szCs w:val="19"/>
+              </w:rPr>
               <w:t xml:space="preserve">feat(transformacion): reconstruye la duracion real y la sobreduracion</w:t>
-            </w:r>
-          </w:p>
-        </w:tc>
-      </w:tr>
-      <w:tr>
-        <w:tc>
-          <w:tcPr>
-            <w:tcW w:type="dxa" w:w="1123"/>
-            <w:tcMar>
-              <w:top w:type="dxa" w:w="60"/>
-              <w:left w:type="dxa" w:w="100"/>
-              <w:bottom w:type="dxa" w:w="60"/>
-              <w:right w:type="dxa" w:w="100"/>
-            </w:tcMar>
-          </w:tcPr>
-          <w:p>
-            <w:pPr>
-              <w:spacing w:after="0" w:line="260"/>
-              <w:jc w:val="left"/>
-            </w:pPr>
-            <w:r>
-              <w:rPr>
-                <w:rFonts w:ascii="Calibri" w:cs="Calibri" w:eastAsia="Calibri" w:hAnsi="Calibri"/>
-                <w:b w:val="false"/>
-                <w:bCs w:val="false"/>
-                <w:color w:val="000000"/>
-                <w:sz w:val="19"/>
-                <w:szCs w:val="19"/>
-              </w:rPr>
-              <w:t xml:space="preserve">61dd691</w:t>
-            </w:r>
-          </w:p>
-        </w:tc>
-        <w:tc>
-          <w:tcPr>
-            <w:tcW w:type="dxa" w:w="1404"/>
-            <w:tcMar>
-              <w:top w:type="dxa" w:w="60"/>
-              <w:left w:type="dxa" w:w="100"/>
-              <w:bottom w:type="dxa" w:w="60"/>
-              <w:right w:type="dxa" w:w="100"/>
-            </w:tcMar>
-          </w:tcPr>
-          <w:p>
-            <w:pPr>
-              <w:spacing w:after="0" w:line="260"/>
-              <w:jc w:val="left"/>
-            </w:pPr>
-            <w:r>
-              <w:rPr>
-                <w:rFonts w:ascii="Calibri" w:cs="Calibri" w:eastAsia="Calibri" w:hAnsi="Calibri"/>
-                <w:b w:val="false"/>
-                <w:bCs w:val="false"/>
-                <w:color w:val="000000"/>
-                <w:sz w:val="19"/>
-                <w:szCs w:val="19"/>
-              </w:rPr>
-              <w:t xml:space="preserve">2026-09-08</w:t>
-            </w:r>
-          </w:p>
-        </w:tc>
-        <w:tc>
-          <w:tcPr>
-            <w:tcW w:type="dxa" w:w="6833"/>
-            <w:tcMar>
-              <w:top w:type="dxa" w:w="60"/>
-              <w:left w:type="dxa" w:w="100"/>
-              <w:bottom w:type="dxa" w:w="60"/>
-              <w:right w:type="dxa" w:w="100"/>
-            </w:tcMar>
-          </w:tcPr>
-          <w:p>
-            <w:pPr>
-              <w:spacing w:after="0" w:line="260"/>
-              <w:jc w:val="left"/>
-            </w:pPr>
-            <w:r>
-              <w:rPr>
-                <w:rFonts w:ascii="Calibri" w:cs="Calibri" w:eastAsia="Calibri" w:hAnsi="Calibri"/>
-                <w:b w:val="false"/>
-                <w:bCs w:val="false"/>
-                <w:color w:val="000000"/>
-                <w:sz w:val="19"/>
-                <w:szCs w:val="19"/>
-              </w:rPr>
-              <w:t xml:space="preserve">feat(limpieza): convierte codigos centinela del SIES en nulos explicitos</w:t>
             </w:r>
           </w:p>
         </w:tc>
@@ -8832,7 +8832,7 @@
                 <w:sz w:val="19"/>
                 <w:szCs w:val="19"/>
               </w:rPr>
-              <w:t xml:space="preserve">f57dfd9</w:t>
+              <w:t xml:space="preserve">8c36c05</w:t>
             </w:r>
           </w:p>
         </w:tc>
@@ -8890,93 +8890,93 @@
                 <w:sz w:val="19"/>
                 <w:szCs w:val="19"/>
               </w:rPr>
+              <w:t xml:space="preserve">feat(limpieza): convierte codigos centinela del SIES en nulos explicitos</w:t>
+            </w:r>
+          </w:p>
+        </w:tc>
+      </w:tr>
+      <w:tr>
+        <w:tc>
+          <w:tcPr>
+            <w:tcW w:type="dxa" w:w="1123"/>
+            <w:tcMar>
+              <w:top w:type="dxa" w:w="60"/>
+              <w:left w:type="dxa" w:w="100"/>
+              <w:bottom w:type="dxa" w:w="60"/>
+              <w:right w:type="dxa" w:w="100"/>
+            </w:tcMar>
+          </w:tcPr>
+          <w:p>
+            <w:pPr>
+              <w:spacing w:after="0" w:line="260"/>
+              <w:jc w:val="left"/>
+            </w:pPr>
+            <w:r>
+              <w:rPr>
+                <w:rFonts w:ascii="Calibri" w:cs="Calibri" w:eastAsia="Calibri" w:hAnsi="Calibri"/>
+                <w:b w:val="false"/>
+                <w:bCs w:val="false"/>
+                <w:color w:val="000000"/>
+                <w:sz w:val="19"/>
+                <w:szCs w:val="19"/>
+              </w:rPr>
+              <w:t xml:space="preserve">304a04e</w:t>
+            </w:r>
+          </w:p>
+        </w:tc>
+        <w:tc>
+          <w:tcPr>
+            <w:tcW w:type="dxa" w:w="1404"/>
+            <w:tcMar>
+              <w:top w:type="dxa" w:w="60"/>
+              <w:left w:type="dxa" w:w="100"/>
+              <w:bottom w:type="dxa" w:w="60"/>
+              <w:right w:type="dxa" w:w="100"/>
+            </w:tcMar>
+          </w:tcPr>
+          <w:p>
+            <w:pPr>
+              <w:spacing w:after="0" w:line="260"/>
+              <w:jc w:val="left"/>
+            </w:pPr>
+            <w:r>
+              <w:rPr>
+                <w:rFonts w:ascii="Calibri" w:cs="Calibri" w:eastAsia="Calibri" w:hAnsi="Calibri"/>
+                <w:b w:val="false"/>
+                <w:bCs w:val="false"/>
+                <w:color w:val="000000"/>
+                <w:sz w:val="19"/>
+                <w:szCs w:val="19"/>
+              </w:rPr>
+              <w:t xml:space="preserve">2026-09-08</w:t>
+            </w:r>
+          </w:p>
+        </w:tc>
+        <w:tc>
+          <w:tcPr>
+            <w:tcW w:type="dxa" w:w="6833"/>
+            <w:tcMar>
+              <w:top w:type="dxa" w:w="60"/>
+              <w:left w:type="dxa" w:w="100"/>
+              <w:bottom w:type="dxa" w:w="60"/>
+              <w:right w:type="dxa" w:w="100"/>
+            </w:tcMar>
+          </w:tcPr>
+          <w:p>
+            <w:pPr>
+              <w:spacing w:after="0" w:line="260"/>
+              <w:jc w:val="left"/>
+            </w:pPr>
+            <w:r>
+              <w:rPr>
+                <w:rFonts w:ascii="Calibri" w:cs="Calibri" w:eastAsia="Calibri" w:hAnsi="Calibri"/>
+                <w:b w:val="false"/>
+                <w:bCs w:val="false"/>
+                <w:color w:val="000000"/>
+                <w:sz w:val="19"/>
+                <w:szCs w:val="19"/>
+              </w:rPr>
               <w:t xml:space="preserve">feat(ingesta): consolida los seis anios con lectura por bloques</w:t>
-            </w:r>
-          </w:p>
-        </w:tc>
-      </w:tr>
-      <w:tr>
-        <w:tc>
-          <w:tcPr>
-            <w:tcW w:type="dxa" w:w="1123"/>
-            <w:tcMar>
-              <w:top w:type="dxa" w:w="60"/>
-              <w:left w:type="dxa" w:w="100"/>
-              <w:bottom w:type="dxa" w:w="60"/>
-              <w:right w:type="dxa" w:w="100"/>
-            </w:tcMar>
-          </w:tcPr>
-          <w:p>
-            <w:pPr>
-              <w:spacing w:after="0" w:line="260"/>
-              <w:jc w:val="left"/>
-            </w:pPr>
-            <w:r>
-              <w:rPr>
-                <w:rFonts w:ascii="Calibri" w:cs="Calibri" w:eastAsia="Calibri" w:hAnsi="Calibri"/>
-                <w:b w:val="false"/>
-                <w:bCs w:val="false"/>
-                <w:color w:val="000000"/>
-                <w:sz w:val="19"/>
-                <w:szCs w:val="19"/>
-              </w:rPr>
-              <w:t xml:space="preserve">522dbb3</w:t>
-            </w:r>
-          </w:p>
-        </w:tc>
-        <w:tc>
-          <w:tcPr>
-            <w:tcW w:type="dxa" w:w="1404"/>
-            <w:tcMar>
-              <w:top w:type="dxa" w:w="60"/>
-              <w:left w:type="dxa" w:w="100"/>
-              <w:bottom w:type="dxa" w:w="60"/>
-              <w:right w:type="dxa" w:w="100"/>
-            </w:tcMar>
-          </w:tcPr>
-          <w:p>
-            <w:pPr>
-              <w:spacing w:after="0" w:line="260"/>
-              <w:jc w:val="left"/>
-            </w:pPr>
-            <w:r>
-              <w:rPr>
-                <w:rFonts w:ascii="Calibri" w:cs="Calibri" w:eastAsia="Calibri" w:hAnsi="Calibri"/>
-                <w:b w:val="false"/>
-                <w:bCs w:val="false"/>
-                <w:color w:val="000000"/>
-                <w:sz w:val="19"/>
-                <w:szCs w:val="19"/>
-              </w:rPr>
-              <w:t xml:space="preserve">2026-09-08</w:t>
-            </w:r>
-          </w:p>
-        </w:tc>
-        <w:tc>
-          <w:tcPr>
-            <w:tcW w:type="dxa" w:w="6833"/>
-            <w:tcMar>
-              <w:top w:type="dxa" w:w="60"/>
-              <w:left w:type="dxa" w:w="100"/>
-              <w:bottom w:type="dxa" w:w="60"/>
-              <w:right w:type="dxa" w:w="100"/>
-            </w:tcMar>
-          </w:tcPr>
-          <w:p>
-            <w:pPr>
-              <w:spacing w:after="0" w:line="260"/>
-              <w:jc w:val="left"/>
-            </w:pPr>
-            <w:r>
-              <w:rPr>
-                <w:rFonts w:ascii="Calibri" w:cs="Calibri" w:eastAsia="Calibri" w:hAnsi="Calibri"/>
-                <w:b w:val="false"/>
-                <w:bCs w:val="false"/>
-                <w:color w:val="000000"/>
-                <w:sz w:val="19"/>
-                <w:szCs w:val="19"/>
-              </w:rPr>
-              <w:t xml:space="preserve">feat(config): centraliza rutas, esquema de datos y parametros</w:t>
             </w:r>
           </w:p>
         </w:tc>
@@ -9007,7 +9007,7 @@
                 <w:sz w:val="19"/>
                 <w:szCs w:val="19"/>
               </w:rPr>
-              <w:t xml:space="preserve">579ee29</w:t>
+              <w:t xml:space="preserve">960617e</w:t>
             </w:r>
           </w:p>
         </w:tc>
@@ -9044,6 +9044,92 @@
           <w:tcPr>
             <w:tcW w:type="dxa" w:w="6833"/>
             <w:shd w:fill="F2F5F8" w:val="clear"/>
+            <w:tcMar>
+              <w:top w:type="dxa" w:w="60"/>
+              <w:left w:type="dxa" w:w="100"/>
+              <w:bottom w:type="dxa" w:w="60"/>
+              <w:right w:type="dxa" w:w="100"/>
+            </w:tcMar>
+          </w:tcPr>
+          <w:p>
+            <w:pPr>
+              <w:spacing w:after="0" w:line="260"/>
+              <w:jc w:val="left"/>
+            </w:pPr>
+            <w:r>
+              <w:rPr>
+                <w:rFonts w:ascii="Calibri" w:cs="Calibri" w:eastAsia="Calibri" w:hAnsi="Calibri"/>
+                <w:b w:val="false"/>
+                <w:bCs w:val="false"/>
+                <w:color w:val="000000"/>
+                <w:sz w:val="19"/>
+                <w:szCs w:val="19"/>
+              </w:rPr>
+              <w:t xml:space="preserve">feat(config): centraliza rutas, esquema de datos y parametros</w:t>
+            </w:r>
+          </w:p>
+        </w:tc>
+      </w:tr>
+      <w:tr>
+        <w:tc>
+          <w:tcPr>
+            <w:tcW w:type="dxa" w:w="1123"/>
+            <w:tcMar>
+              <w:top w:type="dxa" w:w="60"/>
+              <w:left w:type="dxa" w:w="100"/>
+              <w:bottom w:type="dxa" w:w="60"/>
+              <w:right w:type="dxa" w:w="100"/>
+            </w:tcMar>
+          </w:tcPr>
+          <w:p>
+            <w:pPr>
+              <w:spacing w:after="0" w:line="260"/>
+              <w:jc w:val="left"/>
+            </w:pPr>
+            <w:r>
+              <w:rPr>
+                <w:rFonts w:ascii="Calibri" w:cs="Calibri" w:eastAsia="Calibri" w:hAnsi="Calibri"/>
+                <w:b w:val="false"/>
+                <w:bCs w:val="false"/>
+                <w:color w:val="000000"/>
+                <w:sz w:val="19"/>
+                <w:szCs w:val="19"/>
+              </w:rPr>
+              <w:t xml:space="preserve">925d255</w:t>
+            </w:r>
+          </w:p>
+        </w:tc>
+        <w:tc>
+          <w:tcPr>
+            <w:tcW w:type="dxa" w:w="1404"/>
+            <w:tcMar>
+              <w:top w:type="dxa" w:w="60"/>
+              <w:left w:type="dxa" w:w="100"/>
+              <w:bottom w:type="dxa" w:w="60"/>
+              <w:right w:type="dxa" w:w="100"/>
+            </w:tcMar>
+          </w:tcPr>
+          <w:p>
+            <w:pPr>
+              <w:spacing w:after="0" w:line="260"/>
+              <w:jc w:val="left"/>
+            </w:pPr>
+            <w:r>
+              <w:rPr>
+                <w:rFonts w:ascii="Calibri" w:cs="Calibri" w:eastAsia="Calibri" w:hAnsi="Calibri"/>
+                <w:b w:val="false"/>
+                <w:bCs w:val="false"/>
+                <w:color w:val="000000"/>
+                <w:sz w:val="19"/>
+                <w:szCs w:val="19"/>
+              </w:rPr>
+              <w:t xml:space="preserve">2026-09-08</w:t>
+            </w:r>
+          </w:p>
+        </w:tc>
+        <w:tc>
+          <w:tcPr>
+            <w:tcW w:type="dxa" w:w="6833"/>
             <w:tcMar>
               <w:top w:type="dxa" w:w="60"/>
               <w:left w:type="dxa" w:w="100"/>
@@ -9157,7 +9243,7 @@
                 <w:sz w:val="16"/>
                 <w:szCs w:val="16"/>
               </w:rPr>
-              <w:t xml:space="preserve">*   43035f5 merge: integra la rama fase-2/pipeline-datos en main</w:t>
+              <w:t xml:space="preserve">* b113334 docs(informe): agrega el informe tecnico de las Fases 1 y 2</w:t>
             </w:r>
           </w:p>
         </w:tc>
@@ -9184,7 +9270,7 @@
                 <w:sz w:val="16"/>
                 <w:szCs w:val="16"/>
               </w:rPr>
-              <w:t xml:space="preserve">|\</w:t>
+              <w:t xml:space="preserve">* 82f72f3 style(viz): corrige la acentuacion de las etiquetas de los graficos</w:t>
             </w:r>
           </w:p>
         </w:tc>
@@ -9211,7 +9297,7 @@
                 <w:sz w:val="16"/>
                 <w:szCs w:val="16"/>
               </w:rPr>
-              <w:t xml:space="preserve">| * 179960e docs(f2): ejecuta los notebooks y versiona figuras, tablas y muestra</w:t>
+              <w:t xml:space="preserve">* d64cac0 style(viz): rotula las figuras con formato numerico chileno</w:t>
             </w:r>
           </w:p>
         </w:tc>
@@ -9238,7 +9324,7 @@
                 <w:sz w:val="16"/>
                 <w:szCs w:val="16"/>
               </w:rPr>
-              <w:t xml:space="preserve">| * a95bdd3 perf(limpieza): normaliza el catalogo de categorias en vez de fila por fila</w:t>
+              <w:t xml:space="preserve">*   64c8e48 merge: integra la rama fase-2/pipeline-datos en main</w:t>
             </w:r>
           </w:p>
         </w:tc>
@@ -9265,7 +9351,7 @@
                 <w:sz w:val="16"/>
                 <w:szCs w:val="16"/>
               </w:rPr>
-              <w:t xml:space="preserve">| * daf70dd fix(viz,transformacion): compatibilidad con los tipos anulables de pandas</w:t>
+              <w:t xml:space="preserve">|\  </w:t>
             </w:r>
           </w:p>
         </w:tc>
@@ -9292,7 +9378,7 @@
                 <w:sz w:val="16"/>
                 <w:szCs w:val="16"/>
               </w:rPr>
-              <w:t xml:space="preserve">| * 1b4b202 docs(f2): notebooks de obtencion, limpieza, transformacion y validacion</w:t>
+              <w:t xml:space="preserve">| * 86aa78d docs(f2): ejecuta los notebooks y versiona figuras, tablas y muestra</w:t>
             </w:r>
           </w:p>
         </w:tc>
@@ -9319,7 +9405,7 @@
                 <w:sz w:val="16"/>
                 <w:szCs w:val="16"/>
               </w:rPr>
-              <w:t xml:space="preserve">|/</w:t>
+              <w:t xml:space="preserve">| * 9a58f78 perf(limpieza): normaliza el catalogo de categorias en vez de fila por fila</w:t>
             </w:r>
           </w:p>
         </w:tc>
@@ -9346,7 +9432,88 @@
                 <w:sz w:val="16"/>
                 <w:szCs w:val="16"/>
               </w:rPr>
-              <w:t xml:space="preserve">* 5b3cb36 docs(f1): notebook de definicion del proyecto y entorno reproducible</w:t>
+              <w:t xml:space="preserve">| * d41cc30 fix(viz,transformacion): compatibilidad con los tipos anulables de pandas</w:t>
+            </w:r>
+          </w:p>
+        </w:tc>
+      </w:tr>
+      <w:tr>
+        <w:tc>
+          <w:tcPr>
+            <w:tcW w:type="dxa" w:w="9360"/>
+            <w:shd w:fill="F4F6F8" w:val="clear"/>
+            <w:tcMar>
+              <w:top w:type="dxa" w:w="20"/>
+              <w:left w:type="dxa" w:w="120"/>
+              <w:bottom w:type="dxa" w:w="20"/>
+              <w:right w:type="dxa" w:w="120"/>
+            </w:tcMar>
+          </w:tcPr>
+          <w:p>
+            <w:pPr>
+              <w:spacing w:after="0" w:line="240"/>
+            </w:pPr>
+            <w:r>
+              <w:rPr>
+                <w:rFonts w:ascii="Consolas" w:cs="Consolas" w:eastAsia="Consolas" w:hAnsi="Consolas"/>
+                <w:sz w:val="16"/>
+                <w:szCs w:val="16"/>
+              </w:rPr>
+              <w:t xml:space="preserve">| * 1e0a197 docs(f2): notebooks de obtencion, limpieza, transformacion y validacion</w:t>
+            </w:r>
+          </w:p>
+        </w:tc>
+      </w:tr>
+      <w:tr>
+        <w:tc>
+          <w:tcPr>
+            <w:tcW w:type="dxa" w:w="9360"/>
+            <w:shd w:fill="F4F6F8" w:val="clear"/>
+            <w:tcMar>
+              <w:top w:type="dxa" w:w="20"/>
+              <w:left w:type="dxa" w:w="120"/>
+              <w:bottom w:type="dxa" w:w="20"/>
+              <w:right w:type="dxa" w:w="120"/>
+            </w:tcMar>
+          </w:tcPr>
+          <w:p>
+            <w:pPr>
+              <w:spacing w:after="0" w:line="240"/>
+            </w:pPr>
+            <w:r>
+              <w:rPr>
+                <w:rFonts w:ascii="Consolas" w:cs="Consolas" w:eastAsia="Consolas" w:hAnsi="Consolas"/>
+                <w:sz w:val="16"/>
+                <w:szCs w:val="16"/>
+              </w:rPr>
+              <w:t xml:space="preserve">|/  </w:t>
+            </w:r>
+          </w:p>
+        </w:tc>
+      </w:tr>
+      <w:tr>
+        <w:tc>
+          <w:tcPr>
+            <w:tcW w:type="dxa" w:w="9360"/>
+            <w:shd w:fill="F4F6F8" w:val="clear"/>
+            <w:tcMar>
+              <w:top w:type="dxa" w:w="20"/>
+              <w:left w:type="dxa" w:w="120"/>
+              <w:bottom w:type="dxa" w:w="20"/>
+              <w:right w:type="dxa" w:w="120"/>
+            </w:tcMar>
+          </w:tcPr>
+          <w:p>
+            <w:pPr>
+              <w:spacing w:after="0" w:line="240"/>
+            </w:pPr>
+            <w:r>
+              <w:rPr>
+                <w:rFonts w:ascii="Consolas" w:cs="Consolas" w:eastAsia="Consolas" w:hAnsi="Consolas"/>
+                <w:sz w:val="16"/>
+                <w:szCs w:val="16"/>
+              </w:rPr>
+              <w:t xml:space="preserve"> </w:t>
             </w:r>
           </w:p>
         </w:tc>
@@ -20252,7 +20419,7 @@
                 <w:sz w:val="16"/>
                 <w:szCs w:val="16"/>
               </w:rPr>
-              <w:t xml:space="preserve">============================= 22 passed in 1.68s ==============================</w:t>
+              <w:t xml:space="preserve">============================= 22 passed in 1.69s ==============================</w:t>
             </w:r>
           </w:p>
         </w:tc>
@@ -33102,7 +33269,7 @@
                 <w:sz w:val="19"/>
                 <w:szCs w:val="19"/>
               </w:rPr>
-              <w:t xml:space="preserve">Repositorio Git con 16 commits descriptivos, una rama de trabajo y una fusión explícita.</w:t>
+              <w:t xml:space="preserve">Repositorio Git con 17 commits descriptivos, una rama de trabajo y una fusión explícita.</w:t>
             </w:r>
           </w:p>
         </w:tc>
@@ -38717,7 +38884,7 @@
                 <w:sz w:val="16"/>
                 <w:szCs w:val="16"/>
               </w:rPr>
-              <w:t xml:space="preserve">============================= 22 passed in 1.68s ==============================</w:t>
+              <w:t xml:space="preserve">============================= 22 passed in 1.69s ==============================</w:t>
             </w:r>
           </w:p>
         </w:tc>
@@ -38823,7 +38990,7 @@
                 <w:sz w:val="16"/>
                 <w:szCs w:val="16"/>
               </w:rPr>
-              <w:t xml:space="preserve">    16	Sebastian Antunez</w:t>
+              <w:t xml:space="preserve">    17	Sebastian Antunez</w:t>
             </w:r>
           </w:p>
         </w:tc>

</xml_diff>